<commit_message>
Verlauf an Rückgängig und Wiederholen: letzte 20 Schritte mit Häkchen (1.5.0)
Co-Authored-By: Claude Opus 5.5 (1M context) <noreply@anthropic.com>
Claude-Session: https://claude.ai/code/session_01VzpXYToyij24844Bh66rff
</commit_message>
<xml_diff>
--- a/docs/Bedienungsanleitung.docx
+++ b/docs/Bedienungsanleitung.docx
@@ -436,6 +436,56 @@
         <w:rPr>
           <w:b/>
         </w:rPr>
+        <w:t>Verlauf:</w:t>
+      </w:r>
+      <w:r>
+        <w:t xml:space="preserve"> Der kleine Pfeil neben </w:t>
+      </w:r>
+      <w:r>
+        <w:rPr>
+          <w:b/>
+        </w:rPr>
+        <w:t>Rückgängig</w:t>
+      </w:r>
+      <w:r>
+        <w:t xml:space="preserve"> zeigt die letzten 20 Schritte. Ausgewählte Schritte werden mit </w:t>
+      </w:r>
+      <w:r>
+        <w:rPr>
+          <w:b/>
+        </w:rPr>
+        <w:t>Rückgängig machen</w:t>
+      </w:r>
+      <w:r>
+        <w:t xml:space="preserve"> einzeln zurückgenommen, auch wenn danach noch weitergearbeitet wurde. Der Pfeil neben </w:t>
+      </w:r>
+      <w:r>
+        <w:rPr>
+          <w:b/>
+        </w:rPr>
+        <w:t>Wiederholen</w:t>
+      </w:r>
+      <w:r>
+        <w:t xml:space="preserve"> zeigt dieselben Schritte. Mit </w:t>
+      </w:r>
+      <w:r>
+        <w:rPr>
+          <w:b/>
+        </w:rPr>
+        <w:t>Anwenden</w:t>
+      </w:r>
+      <w:r>
+        <w:t xml:space="preserve"> kommen ausgewählte Schritte zurück, oder sie werden auf eine andere Formel übertragen, zum Beispiel „v fett“ auf die nächste angeklickte Formel. Passt ein Schritt nicht zur Formel, wird er ausgelassen und der Editor sagt das.</w:t>
+      </w:r>
+    </w:p>
+    <w:p>
+      <w:pPr>
+        <w:pStyle w:val="ListBullet"/>
+      </w:pPr>
+      <w:r>
+        <w:rPr>
+          <w:b/>
+        </w:rPr>
         <w:t>Neu anfangen:</w:t>
       </w:r>
       <w:r>

</xml_diff>

<commit_message>
Wünsche aus Papas Test: Integrale, mehrzeilige Formeln, Farbe, Abstände, Knopf ohne Änderung (1.6.0)
Co-Authored-By: Claude Opus 5.5 (1M context) <noreply@anthropic.com>
Claude-Session: https://claude.ai/code/session_01VzpXYToyij24844Bh66rff
</commit_message>
<xml_diff>
--- a/docs/Bedienungsanleitung.docx
+++ b/docs/Bedienungsanleitung.docx
@@ -349,7 +349,7 @@
         <w:rPr>
           <w:b/>
         </w:rPr>
-        <w:t>Fett und kursiv:</w:t>
+        <w:t>Fett, kursiv und Farbe:</w:t>
       </w:r>
       <w:r>
         <w:t xml:space="preserve"> Zeichen in der Eingabe markieren und auf </w:t>
@@ -361,7 +361,7 @@
         <w:t>F</w:t>
       </w:r>
       <w:r>
-        <w:t xml:space="preserve"> (fett) oder </w:t>
+        <w:t xml:space="preserve"> (fett), </w:t>
       </w:r>
       <w:r>
         <w:rPr>
@@ -370,7 +370,30 @@
         <w:t>K</w:t>
       </w:r>
       <w:r>
-        <w:t xml:space="preserve"> (kursiv bzw. aufrecht) klicken.</w:t>
+        <w:t xml:space="preserve"> (kursiv bzw. aufrecht) oder </w:t>
+      </w:r>
+      <w:r>
+        <w:rPr>
+          <w:b/>
+        </w:rPr>
+        <w:t>A</w:t>
+      </w:r>
+      <w:r>
+        <w:t xml:space="preserve"> (Farbe) klicken. Ohne Markierung gilt die Wahl für die nächsten Zeichen.</w:t>
+      </w:r>
+    </w:p>
+    <w:p>
+      <w:pPr>
+        <w:pStyle w:val="ListBullet"/>
+      </w:pPr>
+      <w:r>
+        <w:rPr>
+          <w:b/>
+        </w:rPr>
+        <w:t>Zahlen mit Abständen:</w:t>
+      </w:r>
+      <w:r>
+        <w:t xml:space="preserve"> Die Leertaste setzt einen schmalen Abstand, etwa in 1.159 652 180 46.</w:t>
       </w:r>
     </w:p>
     <w:p>
@@ -416,7 +439,16 @@
         <w:t>Formel ändern:</w:t>
       </w:r>
       <w:r>
-        <w:t xml:space="preserve"> Die Formel im Dokument einmal anklicken. Sie erscheint in der Eingabe, und der große Knopf heißt </w:t>
+        <w:t xml:space="preserve"> Die Formel im Dokument einmal anklicken. Sie erscheint in der Eingabe. Solange nichts geändert ist, heißt der große Knopf </w:t>
+      </w:r>
+      <w:r>
+        <w:rPr>
+          <w:b/>
+        </w:rPr>
+        <w:t>Ohne Änderung übernehmen</w:t>
+      </w:r>
+      <w:r>
+        <w:t xml:space="preserve">; er wandelt eine alte Formel unverändert ins neue Format um. Nach einer Änderung heißt er </w:t>
       </w:r>
       <w:r>
         <w:rPr>
@@ -557,7 +589,7 @@
         <w:t>Schriftgröße übernehmen</w:t>
       </w:r>
       <w:r>
-        <w:t xml:space="preserve"> bekommen alle Formeln den Standard. Die Darstellung (wissenschaftlich oder einzeilig) bleibt bei jeder Formel erhalten. Das Ergebnis öffnet sich als neues Dokument, das man mit „Speichern unter …“ sichert; das Original bleibt unverändert. Eine Übersicht zeigt danach Ausgangsformate, konvertierte Formeln und Probleme. Problemfälle sind gelb markiert und müssen neu eingegeben werden.</w:t>
+        <w:t xml:space="preserve"> bekommen alle Formeln den Standard. Alte Formeln werden wie im alten Formel-Editor wissenschaftlich gesetzt, auch im Fließtext. Bei neuen Formeln bleibt die Darstellung (wissenschaftlich oder einzeilig) erhalten. Das Ergebnis öffnet sich als neues Dokument, das man mit „Speichern unter …“ sichert; das Original bleibt unverändert. Eine Übersicht zeigt danach Ausgangsformate, konvertierte Formeln und Probleme. Problemfälle sind gelb markiert und müssen neu eingegeben werden.</w:t>
       </w:r>
     </w:p>
     <w:p>

</xml_diff>

<commit_message>
Abbrechen, kein Abstand nach Komma, Leertaste zwischen Ziffern, Vorschau linksbündig (1.6.1)
Co-Authored-By: Claude Opus 5.5 (1M context) <noreply@anthropic.com>
Claude-Session: https://claude.ai/code/session_01VzpXYToyij24844Bh66rff
</commit_message>
<xml_diff>
--- a/docs/Bedienungsanleitung.docx
+++ b/docs/Bedienungsanleitung.docx
@@ -393,7 +393,7 @@
         <w:t>Zahlen mit Abständen:</w:t>
       </w:r>
       <w:r>
-        <w:t xml:space="preserve"> Die Leertaste setzt einen schmalen Abstand, etwa in 1.159 652 180 46.</w:t>
+        <w:t xml:space="preserve"> Die Leertaste setzt einen kleinen Abstand, etwa in 1.159 652 180 46. Nach einem Komma entsteht kein Abstand, also 1,5 und nicht 1, 5.</w:t>
       </w:r>
     </w:p>
     <w:p>
@@ -457,7 +457,16 @@
         <w:t>Formel in Word ersetzen</w:t>
       </w:r>
       <w:r>
-        <w:t>. Ein grüner Rahmen um die Eingabe zeigt: Die Formel ist so wie im Dokument. Nach einer Änderung wird der Rahmen orange, die Änderung ist also noch nicht in Word. Nach dem Klick auf den Knopf ist er wieder grün.</w:t>
+        <w:t xml:space="preserve">. Ein grüner Rahmen um die Eingabe zeigt: Die Formel ist so wie im Dokument. Nach einer Änderung wird der Rahmen orange, die Änderung ist also noch nicht in Word. Nach dem Klick auf den Knopf ist er wieder grün. </w:t>
+      </w:r>
+      <w:r>
+        <w:rPr>
+          <w:b/>
+        </w:rPr>
+        <w:t>Abbrechen</w:t>
+      </w:r>
+      <w:r>
+        <w:t xml:space="preserve"> verwirft alle Änderungen und stellt die Formel wieder her, wie sie im Dokument steht.</w:t>
       </w:r>
     </w:p>
     <w:p>

</xml_diff>

<commit_message>
1.6.2: Editor startet leer, Knöpfe immer ganz sichtbar, bebilderte Anleitung
Co-Authored-By: Claude Opus 5.5 (1M context) <noreply@anthropic.com>
Claude-Session: https://claude.ai/code/session_01VzpXYToyij24844Bh66rff
</commit_message>
<xml_diff>
--- a/docs/Bedienungsanleitung.docx
+++ b/docs/Bedienungsanleitung.docx
@@ -1,241 +1,145 @@
 
 <file path=word/document.xml><?xml version="1.0" encoding="utf-8"?>
 <w:document xmlns:wpc="http://schemas.microsoft.com/office/word/2010/wordprocessingCanvas" xmlns:mo="http://schemas.microsoft.com/office/mac/office/2008/main" xmlns:mc="http://schemas.openxmlformats.org/markup-compatibility/2006" xmlns:mv="urn:schemas-microsoft-com:mac:vml" xmlns:o="urn:schemas-microsoft-com:office:office" xmlns:r="http://schemas.openxmlformats.org/officeDocument/2006/relationships" xmlns:m="http://schemas.openxmlformats.org/officeDocument/2006/math" xmlns:v="urn:schemas-microsoft-com:vml" xmlns:wp14="http://schemas.microsoft.com/office/word/2010/wordprocessingDrawing" xmlns:wp="http://schemas.openxmlformats.org/drawingml/2006/wordprocessingDrawing" xmlns:w10="urn:schemas-microsoft-com:office:word" xmlns:w="http://schemas.openxmlformats.org/wordprocessingml/2006/main" xmlns:w14="http://schemas.microsoft.com/office/word/2010/wordml" xmlns:wpg="http://schemas.microsoft.com/office/word/2010/wordprocessingGroup" xmlns:wpi="http://schemas.microsoft.com/office/word/2010/wordprocessingInk" xmlns:wne="http://schemas.microsoft.com/office/word/2006/wordml" xmlns:wps="http://schemas.microsoft.com/office/word/2010/wordprocessingShape" mc:Ignorable="w14 wp14">
+  <w:background w:color="FAF9F5"/>
   <w:body>
     <w:p>
       <w:pPr>
-        <w:pStyle w:val="Heading1"/>
+        <w:pStyle w:val="Title"/>
       </w:pPr>
       <w:r>
-        <w:t>Papas Formeleditor: Einrichtung und Bedienung (Mac)</w:t>
-      </w:r>
-    </w:p>
-    <w:p>
-      <w:r>
-        <w:t>Diese Anleitung richtet den Formeleditor als Add-in in Word auf dem Mac ein. Sie ist so geschrieben, dass Jens sie über TeamViewer auf Papas Rechner durchgehen kann. Die Einrichtung dauert ein paar Minuten und muss nur einmal gemacht werden. Danach steht der Editor in Word im Reiter „Start“ als Knopf „Papas Formeleditor“ bereit.</w:t>
-      </w:r>
-    </w:p>
-    <w:p>
-      <w:r>
-        <w:t>Der Editor selbst liegt im Internet auf GitHub Pages. Word lädt ihn bei jedem Öffnen von dort. Verbesserungen kommen deshalb ohne neue Installation an; manchmal reicht es, Word einmal zu beenden und neu zu starten.</w:t>
+        <w:t>Papas Formeleditor</w:t>
       </w:r>
     </w:p>
     <w:p>
       <w:pPr>
-        <w:pStyle w:val="Heading2"/>
+        <w:pStyle w:val="Subtitle"/>
       </w:pPr>
       <w:r>
-        <w:t>Voraussetzungen</w:t>
+        <w:t>Bedienungsanleitung für Word auf dem Mac, Version 1.6.2</w:t>
       </w:r>
     </w:p>
     <w:p>
       <w:pPr>
-        <w:pStyle w:val="ListBullet"/>
+        <w:pStyle w:val="Lead"/>
       </w:pPr>
       <w:r>
-        <w:t>Ein Mac mit Microsoft Word aus Microsoft 365 (aktuelle Version).</w:t>
+        <w:t>Mit dem Formeleditor entstehen mathematische und physikalische Formeln in Buchqualität direkt in Word. Man setzt die Formel aus Bausteinen zusammen oder tippt sie, sieht sofort, wie sie gedruckt aussieht, und fügt sie mit einem Klick ein. Jede Formel lässt sich später wieder öffnen und ändern.</w:t>
       </w:r>
     </w:p>
     <w:p>
       <w:pPr>
-        <w:pStyle w:val="ListBullet"/>
+        <w:pStyle w:val="TOCHeading"/>
+        <w:pageBreakBefore/>
+        <w:pBdr>
+          <w:bottom w:val="single" w:sz="8" w:space="6" w:color="CC785C"/>
+        </w:pBdr>
       </w:pPr>
       <w:r>
-        <w:t>Eine Internetverbindung, solange der Editor benutzt wird.</w:t>
+        <w:t>Inhaltsverzeichnis</w:t>
+      </w:r>
+    </w:p>
+    <w:p>
+      <w:pPr/>
+      <w:r>
+        <w:rPr>
+          <w:b w:val="0"/>
+          <w:color w:val="8C887E"/>
+        </w:rPr>
+        <w:fldChar w:fldCharType="begin"/>
+        <w:instrText xml:space="preserve"> TOC \o "1-3" \h \z \u </w:instrText>
+        <w:fldChar w:fldCharType="separate"/>
+      </w:r>
+      <w:r>
+        <w:rPr>
+          <w:b w:val="0"/>
+          <w:color w:val="8C887E"/>
+        </w:rPr>
+        <w:t>Wird in Word beim Öffnen gefüllt (sonst F9).</w:t>
+      </w:r>
+      <w:r>
+        <w:fldChar w:fldCharType="end"/>
       </w:r>
     </w:p>
     <w:p>
       <w:pPr>
-        <w:pStyle w:val="ListBullet"/>
+        <w:pStyle w:val="TOCHeading"/>
+        <w:pBdr>
+          <w:bottom w:val="single" w:sz="8" w:space="6" w:color="CC785C"/>
+        </w:pBdr>
       </w:pPr>
       <w:r>
-        <w:t xml:space="preserve">Word sollte während der Einrichtung </w:t>
+        <w:t>Abbildungsverzeichnis</w:t>
+      </w:r>
+    </w:p>
+    <w:p>
+      <w:pPr/>
+      <w:r>
+        <w:rPr>
+          <w:b w:val="0"/>
+          <w:color w:val="8C887E"/>
+        </w:rPr>
+        <w:fldChar w:fldCharType="begin"/>
+        <w:instrText xml:space="preserve"> TOC \h \z \c "Abbildung" </w:instrText>
+        <w:fldChar w:fldCharType="separate"/>
       </w:r>
       <w:r>
         <w:rPr>
-          <w:b/>
+          <w:b w:val="0"/>
+          <w:color w:val="8C887E"/>
         </w:rPr>
-        <w:t>beendet</w:t>
+        <w:t>Wird in Word beim Öffnen gefüllt (sonst F9).</w:t>
       </w:r>
       <w:r>
-        <w:t xml:space="preserve"> sein (⌘Q).</w:t>
+        <w:fldChar w:fldCharType="end"/>
       </w:r>
     </w:p>
     <w:p>
       <w:pPr>
-        <w:pStyle w:val="Heading2"/>
+        <w:pStyle w:val="TOCHeading"/>
+        <w:pBdr>
+          <w:bottom w:val="single" w:sz="8" w:space="6" w:color="CC785C"/>
+        </w:pBdr>
       </w:pPr>
       <w:r>
-        <w:t>Schritt 1: Die Add-in-Datei an die richtige Stelle legen</w:t>
+        <w:t>Tabellenverzeichnis</w:t>
       </w:r>
     </w:p>
     <w:p>
+      <w:pPr/>
       <w:r>
-        <w:t>Word sucht Add-ins zum Ausprobieren in einem bestimmten Ordner. Am einfachsten legt man die Datei mit dem Terminal dorthin, weil der Ordner im Finder versteckt ist.</w:t>
+        <w:rPr>
+          <w:b w:val="0"/>
+          <w:color w:val="8C887E"/>
+        </w:rPr>
+        <w:fldChar w:fldCharType="begin"/>
+        <w:instrText xml:space="preserve"> TOC \h \z \c "Tabelle" </w:instrText>
+        <w:fldChar w:fldCharType="separate"/>
+      </w:r>
+      <w:r>
+        <w:rPr>
+          <w:b w:val="0"/>
+          <w:color w:val="8C887E"/>
+        </w:rPr>
+        <w:t>Wird in Word beim Öffnen gefüllt (sonst F9).</w:t>
+      </w:r>
+      <w:r>
+        <w:fldChar w:fldCharType="end"/>
       </w:r>
     </w:p>
     <w:p>
       <w:pPr>
-        <w:pStyle w:val="ListNumber"/>
+        <w:pStyle w:val="Heading1"/>
+        <w:pageBreakBefore/>
       </w:pPr>
       <w:r>
-        <w:t xml:space="preserve">Das Programm </w:t>
-      </w:r>
-      <w:r>
-        <w:rPr>
-          <w:b/>
-        </w:rPr>
-        <w:t>Terminal</w:t>
-      </w:r>
-      <w:r>
-        <w:t xml:space="preserve"> öffnen: ⌘ und Leertaste drücken, „Terminal“ tippen, Eingabetaste.</w:t>
+        <w:t>Auf einen Blick</w:t>
       </w:r>
     </w:p>
     <w:p>
-      <w:pPr>
-        <w:pStyle w:val="ListNumber"/>
-      </w:pPr>
+      <w:pPr/>
       <w:r>
-        <w:t>Die folgende Zeile vollständig kopieren, im Terminal mit ⌘V einfügen und die Eingabetaste drücken:</w:t>
-      </w:r>
-    </w:p>
-    <w:p>
-      <w:r>
-        <w:rPr>
-          <w:rFonts w:ascii="Menlo" w:hAnsi="Menlo"/>
-          <w:sz w:val="19"/>
-        </w:rPr>
-        <w:t>mkdir -p ~/Library/Containers/com.microsoft.Word/Data/Documents/wef &amp;&amp; curl -fsSL https://bandstandapp.github.io/formeleditor/manifest.xml -o ~/Library/Containers/com.microsoft.Word/Data/Documents/wef/formeleditor.xml &amp;&amp; echo "Fertig"</w:t>
-      </w:r>
-    </w:p>
-    <w:p>
-      <w:pPr>
-        <w:pStyle w:val="ListNumber"/>
-      </w:pPr>
-      <w:r>
-        <w:t>Wenn im Terminal „Fertig“ erscheint, hat es geklappt. Das Terminal kann man danach schließen.</w:t>
-      </w:r>
-    </w:p>
-    <w:p>
-      <w:r>
-        <w:t>Die Zeile legt den Ordner an, falls er fehlt, und lädt die kleine Beschreibungsdatei des Add-ins hinein. Sie verändert sonst nichts am Rechner.</w:t>
-      </w:r>
-    </w:p>
-    <w:p>
-      <w:r>
-        <w:rPr>
-          <w:b/>
-        </w:rPr>
-        <w:t>Ohne Terminal</w:t>
-      </w:r>
-      <w:r>
-        <w:t xml:space="preserve"> geht es auch über den Finder: die Datei manifest.xml (https://bandstandapp.github.io/formeleditor/manifest.xml) herunterladen, im Finder „Gehe zu“ → „Gehe zum Ordner …“ (⇧⌘G) wählen, </w:t>
-      </w:r>
-      <w:r>
-        <w:rPr>
-          <w:rFonts w:ascii="Menlo" w:hAnsi="Menlo"/>
-          <w:sz w:val="21"/>
-        </w:rPr>
-        <w:t>~/Library/Containers/com.microsoft.Word/Data/Documents/</w:t>
-      </w:r>
-      <w:r>
-        <w:t xml:space="preserve"> eingeben, dort einen Ordner </w:t>
-      </w:r>
-      <w:r>
-        <w:rPr>
-          <w:rFonts w:ascii="Menlo" w:hAnsi="Menlo"/>
-          <w:sz w:val="21"/>
-        </w:rPr>
-        <w:t>wef</w:t>
-      </w:r>
-      <w:r>
-        <w:t xml:space="preserve"> anlegen, falls es ihn noch nicht gibt, und die Datei hineinziehen.</w:t>
-      </w:r>
-    </w:p>
-    <w:p>
-      <w:pPr>
-        <w:pStyle w:val="Heading2"/>
-      </w:pPr>
-      <w:r>
-        <w:t>Schritt 2: Das Add-in in Word einschalten</w:t>
-      </w:r>
-    </w:p>
-    <w:p>
-      <w:pPr>
-        <w:pStyle w:val="ListNumber"/>
-      </w:pPr>
-      <w:r>
-        <w:t>Word starten und ein Dokument öffnen (ein neues, leeres reicht).</w:t>
-      </w:r>
-    </w:p>
-    <w:p>
-      <w:pPr>
-        <w:pStyle w:val="ListNumber"/>
-      </w:pPr>
-      <w:r>
-        <w:t xml:space="preserve">Im Reiter </w:t>
-      </w:r>
-      <w:r>
-        <w:rPr>
-          <w:b/>
-        </w:rPr>
-        <w:t>Start</w:t>
-      </w:r>
-      <w:r>
-        <w:t xml:space="preserve"> ganz rechts auf </w:t>
-      </w:r>
-      <w:r>
-        <w:rPr>
-          <w:b/>
-        </w:rPr>
-        <w:t>Add-ins</w:t>
-      </w:r>
-      <w:r>
-        <w:t xml:space="preserve"> klicken. In manchen Word-Versionen heißt der Weg </w:t>
-      </w:r>
-      <w:r>
-        <w:rPr>
-          <w:b/>
-        </w:rPr>
-        <w:t>Einfügen</w:t>
-      </w:r>
-      <w:r>
-        <w:t xml:space="preserve"> → </w:t>
-      </w:r>
-      <w:r>
-        <w:rPr>
-          <w:b/>
-        </w:rPr>
-        <w:t>Add-ins</w:t>
-      </w:r>
-      <w:r>
-        <w:t xml:space="preserve"> → </w:t>
-      </w:r>
-      <w:r>
-        <w:rPr>
-          <w:b/>
-        </w:rPr>
-        <w:t>Meine Add-ins</w:t>
-      </w:r>
-      <w:r>
-        <w:t>.</w:t>
-      </w:r>
-    </w:p>
-    <w:p>
-      <w:pPr>
-        <w:pStyle w:val="ListNumber"/>
-      </w:pPr>
-      <w:r>
-        <w:t xml:space="preserve">Im Fenster, das sich öffnet, erscheint unter </w:t>
-      </w:r>
-      <w:r>
-        <w:rPr>
-          <w:b/>
-        </w:rPr>
-        <w:t>Entwickler-Add-ins</w:t>
-      </w:r>
-      <w:r>
-        <w:t xml:space="preserve"> (englisch „Developer Add-ins“) der Eintrag </w:t>
+        <w:t xml:space="preserve">Der Formeleditor öffnet sich in Word über den Knopf </w:t>
       </w:r>
       <w:r>
         <w:rPr>
@@ -244,78 +148,13 @@
         <w:t>Papas Formeleditor</w:t>
       </w:r>
       <w:r>
-        <w:t>. Ihn einmal anklicken.</w:t>
+        <w:t xml:space="preserve"> im Reiter „Start“, ganz rechts in der Leiste. Er erscheint als Spalte am rechten Rand neben dem Dokument. Beim Öffnen ist die Eingabe leer und wartet auf eine neue Formel.</w:t>
       </w:r>
     </w:p>
     <w:p>
-      <w:pPr>
-        <w:pStyle w:val="ListNumber"/>
-      </w:pPr>
+      <w:pPr/>
       <w:r>
-        <w:t xml:space="preserve">Rechts öffnet sich der Formeleditor als Seitenleiste. Im Reiter </w:t>
-      </w:r>
-      <w:r>
-        <w:rPr>
-          <w:b/>
-        </w:rPr>
-        <w:t>Start</w:t>
-      </w:r>
-      <w:r>
-        <w:t xml:space="preserve"> gibt es von nun an außerdem den Knopf </w:t>
-      </w:r>
-      <w:r>
-        <w:rPr>
-          <w:b/>
-        </w:rPr>
-        <w:t>Papas Formeleditor</w:t>
-      </w:r>
-      <w:r>
-        <w:t>.</w:t>
-      </w:r>
-    </w:p>
-    <w:p>
-      <w:r>
-        <w:t>Falls der Eintrag nicht erscheint, Word mit ⌘Q ganz beenden und neu starten. Hilft das nicht, ist die Datei aus Schritt 1 nicht im richtigen Ordner gelandet.</w:t>
-      </w:r>
-    </w:p>
-    <w:p>
-      <w:pPr>
-        <w:pStyle w:val="Heading2"/>
-      </w:pPr>
-      <w:r>
-        <w:t>So wird der Editor benutzt</w:t>
-      </w:r>
-    </w:p>
-    <w:p>
-      <w:r>
-        <w:t xml:space="preserve">Der Editor hat oben zwei Reiter. </w:t>
-      </w:r>
-      <w:r>
-        <w:rPr>
-          <w:b/>
-        </w:rPr>
-        <w:t>Formel bearbeiten</w:t>
-      </w:r>
-      <w:r>
-        <w:t xml:space="preserve"> ist beim Öffnen gewählt und enthält die Kacheln Bausteine, Eingabe und Vorschau. </w:t>
-      </w:r>
-      <w:r>
-        <w:rPr>
-          <w:b/>
-        </w:rPr>
-        <w:t>Alles bearbeiten</w:t>
-      </w:r>
-      <w:r>
-        <w:t xml:space="preserve"> enthält die Werkzeuge für das ganze Dokument. Hinter jeder Überschrift erklärt ein kleines </w:t>
-      </w:r>
-      <w:r>
-        <w:rPr>
-          <w:b/>
-        </w:rPr>
-        <w:t>i</w:t>
-      </w:r>
-      <w:r>
-        <w:t xml:space="preserve"> die Kachel, sobald man mit der Maus darauf zeigt.</w:t>
+        <w:t>Oben gibt es zwei Reiter:</w:t>
       </w:r>
     </w:p>
     <w:p>
@@ -326,19 +165,10 @@
         <w:rPr>
           <w:b/>
         </w:rPr>
-        <w:t>Neue Formel:</w:t>
+        <w:t>Formel bearbeiten:</w:t>
       </w:r>
       <w:r>
-        <w:t xml:space="preserve"> Den Cursor im Text an die gewünschte Stelle setzen. Die Formel aus den Bausteinen zusammensetzen oder tippen und auf </w:t>
-      </w:r>
-      <w:r>
-        <w:rPr>
-          <w:b/>
-        </w:rPr>
-        <w:t>In Word einfügen</w:t>
-      </w:r>
-      <w:r>
-        <w:t xml:space="preserve"> klicken. Den Knopf gibt es unter der Eingabe und unter der Vorschau.</w:t>
+        <w:t xml:space="preserve"> eine einzelne Formel schreiben, einfügen oder ändern. Dieser Reiter ist beim Öffnen gewählt.</w:t>
       </w:r>
     </w:p>
     <w:p>
@@ -349,10 +179,844 @@
         <w:rPr>
           <w:b/>
         </w:rPr>
-        <w:t>Fett, kursiv und Farbe:</w:t>
+        <w:t>Alles bearbeiten:</w:t>
       </w:r>
       <w:r>
-        <w:t xml:space="preserve"> Zeichen in der Eingabe markieren und auf </w:t>
+        <w:t xml:space="preserve"> Werkzeuge für alle Formeln im Dokument.</w:t>
+      </w:r>
+    </w:p>
+    <w:p>
+      <w:pPr/>
+      <w:r>
+        <w:t xml:space="preserve">Darunter liegen drei Kacheln: </w:t>
+      </w:r>
+      <w:r>
+        <w:rPr>
+          <w:b/>
+        </w:rPr>
+        <w:t>Bausteine</w:t>
+      </w:r>
+      <w:r>
+        <w:t xml:space="preserve">, </w:t>
+      </w:r>
+      <w:r>
+        <w:rPr>
+          <w:b/>
+        </w:rPr>
+        <w:t>Eingabe</w:t>
+      </w:r>
+      <w:r>
+        <w:t xml:space="preserve"> und </w:t>
+      </w:r>
+      <w:r>
+        <w:rPr>
+          <w:b/>
+        </w:rPr>
+        <w:t>Ergebnis</w:t>
+      </w:r>
+      <w:r>
+        <w:t xml:space="preserve">. Ein kleines </w:t>
+      </w:r>
+      <w:r>
+        <w:rPr>
+          <w:b/>
+        </w:rPr>
+        <w:t>i</w:t>
+      </w:r>
+      <w:r>
+        <w:t xml:space="preserve"> hinter jeder Überschrift erklärt die Kachel, sobald man mit der Maus darauf zeigt.</w:t>
+      </w:r>
+    </w:p>
+    <w:p/>
+    <w:p>
+      <w:pPr>
+        <w:jc w:val="center"/>
+      </w:pPr>
+      <w:r>
+        <w:drawing>
+          <wp:inline xmlns:a="http://schemas.openxmlformats.org/drawingml/2006/main" xmlns:pic="http://schemas.openxmlformats.org/drawingml/2006/picture">
+            <wp:extent cx="3383280" cy="5852160"/>
+            <wp:docPr id="1" name="Picture 1"/>
+            <wp:cNvGraphicFramePr>
+              <a:graphicFrameLocks noChangeAspect="1"/>
+            </wp:cNvGraphicFramePr>
+            <a:graphic>
+              <a:graphicData uri="http://schemas.openxmlformats.org/drawingml/2006/picture">
+                <pic:pic>
+                  <pic:nvPicPr>
+                    <pic:cNvPr id="0" name="01-start.png"/>
+                    <pic:cNvPicPr/>
+                  </pic:nvPicPr>
+                  <pic:blipFill>
+                    <a:blip r:embed="rId11"/>
+                    <a:stretch>
+                      <a:fillRect/>
+                    </a:stretch>
+                  </pic:blipFill>
+                  <pic:spPr>
+                    <a:xfrm>
+                      <a:off x="0" y="0"/>
+                      <a:ext cx="3383280" cy="5852160"/>
+                    </a:xfrm>
+                    <a:prstGeom prst="rect"/>
+                  </pic:spPr>
+                </pic:pic>
+              </a:graphicData>
+            </a:graphic>
+          </wp:inline>
+        </w:drawing>
+      </w:r>
+    </w:p>
+    <w:p>
+      <w:pPr>
+        <w:pStyle w:val="Caption"/>
+      </w:pPr>
+      <w:r>
+        <w:rPr>
+          <w:b/>
+          <w:color w:val="141413"/>
+        </w:rPr>
+        <w:t xml:space="preserve">Abbildung </w:t>
+      </w:r>
+      <w:r>
+        <w:rPr>
+          <w:b/>
+          <w:color w:val="141413"/>
+        </w:rPr>
+        <w:fldChar w:fldCharType="begin"/>
+        <w:instrText xml:space="preserve"> SEQ Abbildung \* ARABIC </w:instrText>
+        <w:fldChar w:fldCharType="separate"/>
+      </w:r>
+      <w:r>
+        <w:rPr>
+          <w:b/>
+          <w:color w:val="141413"/>
+        </w:rPr>
+        <w:t>1</w:t>
+      </w:r>
+      <w:r>
+        <w:fldChar w:fldCharType="end"/>
+      </w:r>
+      <w:r>
+        <w:t>: Der Editor nach dem Öffnen, die Eingabe ist leer</w:t>
+      </w:r>
+    </w:p>
+    <w:p/>
+    <w:p>
+      <w:pPr>
+        <w:pStyle w:val="Quote"/>
+      </w:pPr>
+      <w:r>
+        <w:rPr>
+          <w:b/>
+        </w:rPr>
+        <w:t>Tipp zur Breite.</w:t>
+      </w:r>
+      <w:r>
+        <w:t xml:space="preserve"> Die Spalte des Editors lässt sich mit der Maus an ihrem linken Rand breiter ziehen. Ist sie sehr schmal, rutschen die Knöpfe unter der Eingabe in eine zweite Reihe. Sie bleiben aber immer vollständig lesbar.</w:t>
+      </w:r>
+    </w:p>
+    <w:p>
+      <w:pPr>
+        <w:pStyle w:val="Heading1"/>
+        <w:pageBreakBefore/>
+      </w:pPr>
+      <w:r>
+        <w:t>Eine Formel schreiben</w:t>
+      </w:r>
+    </w:p>
+    <w:p>
+      <w:pPr>
+        <w:pStyle w:val="Heading2"/>
+      </w:pPr>
+      <w:r>
+        <w:t>Mit den Bausteinen</w:t>
+      </w:r>
+    </w:p>
+    <w:p>
+      <w:pPr/>
+      <w:r>
+        <w:t xml:space="preserve">Unter </w:t>
+      </w:r>
+      <w:r>
+        <w:rPr>
+          <w:b/>
+        </w:rPr>
+        <w:t>Aufbau</w:t>
+      </w:r>
+      <w:r>
+        <w:t xml:space="preserve"> liegen Brüche, Wurzeln, Klammern, Hochzahlen, Summen und Integrale. Ein Klick setzt den Baustein an der Stelle des blinkenden Strichs ein. Leere Felder, etwa Zähler und Nenner, erscheinen als kleine Kästchen und werden der Reihe nach ausgefüllt.</w:t>
+      </w:r>
+    </w:p>
+    <w:p>
+      <w:pPr/>
+      <w:r>
+        <w:t xml:space="preserve">Unter </w:t>
+      </w:r>
+      <w:r>
+        <w:rPr>
+          <w:b/>
+        </w:rPr>
+        <w:t>Griechisch</w:t>
+      </w:r>
+      <w:r>
+        <w:t xml:space="preserve"> stehen alle griechischen Buchstaben, klein und groß.</w:t>
+      </w:r>
+    </w:p>
+    <w:p/>
+    <w:p>
+      <w:pPr>
+        <w:jc w:val="center"/>
+      </w:pPr>
+      <w:r>
+        <w:drawing>
+          <wp:inline xmlns:a="http://schemas.openxmlformats.org/drawingml/2006/main" xmlns:pic="http://schemas.openxmlformats.org/drawingml/2006/picture">
+            <wp:extent cx="3090672" cy="4242816"/>
+            <wp:docPr id="2" name="Picture 2"/>
+            <wp:cNvGraphicFramePr>
+              <a:graphicFrameLocks noChangeAspect="1"/>
+            </wp:cNvGraphicFramePr>
+            <a:graphic>
+              <a:graphicData uri="http://schemas.openxmlformats.org/drawingml/2006/picture">
+                <pic:pic>
+                  <pic:nvPicPr>
+                    <pic:cNvPr id="0" name="02-griechisch.png"/>
+                    <pic:cNvPicPr/>
+                  </pic:nvPicPr>
+                  <pic:blipFill>
+                    <a:blip r:embed="rId12"/>
+                    <a:stretch>
+                      <a:fillRect/>
+                    </a:stretch>
+                  </pic:blipFill>
+                  <pic:spPr>
+                    <a:xfrm>
+                      <a:off x="0" y="0"/>
+                      <a:ext cx="3090672" cy="4242816"/>
+                    </a:xfrm>
+                    <a:prstGeom prst="rect"/>
+                  </pic:spPr>
+                </pic:pic>
+              </a:graphicData>
+            </a:graphic>
+          </wp:inline>
+        </w:drawing>
+      </w:r>
+    </w:p>
+    <w:p>
+      <w:pPr>
+        <w:pStyle w:val="Caption"/>
+      </w:pPr>
+      <w:r>
+        <w:rPr>
+          <w:b/>
+          <w:color w:val="141413"/>
+        </w:rPr>
+        <w:t xml:space="preserve">Abbildung </w:t>
+      </w:r>
+      <w:r>
+        <w:rPr>
+          <w:b/>
+          <w:color w:val="141413"/>
+        </w:rPr>
+        <w:fldChar w:fldCharType="begin"/>
+        <w:instrText xml:space="preserve"> SEQ Abbildung \* ARABIC </w:instrText>
+        <w:fldChar w:fldCharType="separate"/>
+      </w:r>
+      <w:r>
+        <w:rPr>
+          <w:b/>
+          <w:color w:val="141413"/>
+        </w:rPr>
+        <w:t>1</w:t>
+      </w:r>
+      <w:r>
+        <w:fldChar w:fldCharType="end"/>
+      </w:r>
+      <w:r>
+        <w:t>: Griechische Buchstaben zum Anklicken</w:t>
+      </w:r>
+    </w:p>
+    <w:p/>
+    <w:p>
+      <w:pPr/>
+      <w:r>
+        <w:t xml:space="preserve">Unter </w:t>
+      </w:r>
+      <w:r>
+        <w:rPr>
+          <w:b/>
+        </w:rPr>
+        <w:t>Zeichen</w:t>
+      </w:r>
+      <w:r>
+        <w:t xml:space="preserve"> finden sich Relationszeichen, Pfeile und Sonderzeichen. Ganz vorn stehen das h und das λ jeweils mit waagerechtem und mit schrägem Querstrich.</w:t>
+      </w:r>
+    </w:p>
+    <w:p/>
+    <w:p>
+      <w:pPr>
+        <w:jc w:val="center"/>
+      </w:pPr>
+      <w:r>
+        <w:drawing>
+          <wp:inline xmlns:a="http://schemas.openxmlformats.org/drawingml/2006/main" xmlns:pic="http://schemas.openxmlformats.org/drawingml/2006/picture">
+            <wp:extent cx="3090672" cy="4919472"/>
+            <wp:docPr id="3" name="Picture 3"/>
+            <wp:cNvGraphicFramePr>
+              <a:graphicFrameLocks noChangeAspect="1"/>
+            </wp:cNvGraphicFramePr>
+            <a:graphic>
+              <a:graphicData uri="http://schemas.openxmlformats.org/drawingml/2006/picture">
+                <pic:pic>
+                  <pic:nvPicPr>
+                    <pic:cNvPr id="0" name="03-zeichen.png"/>
+                    <pic:cNvPicPr/>
+                  </pic:nvPicPr>
+                  <pic:blipFill>
+                    <a:blip r:embed="rId13"/>
+                    <a:stretch>
+                      <a:fillRect/>
+                    </a:stretch>
+                  </pic:blipFill>
+                  <pic:spPr>
+                    <a:xfrm>
+                      <a:off x="0" y="0"/>
+                      <a:ext cx="3090672" cy="4919472"/>
+                    </a:xfrm>
+                    <a:prstGeom prst="rect"/>
+                  </pic:spPr>
+                </pic:pic>
+              </a:graphicData>
+            </a:graphic>
+          </wp:inline>
+        </w:drawing>
+      </w:r>
+    </w:p>
+    <w:p>
+      <w:pPr>
+        <w:pStyle w:val="Caption"/>
+      </w:pPr>
+      <w:r>
+        <w:rPr>
+          <w:b/>
+          <w:color w:val="141413"/>
+        </w:rPr>
+        <w:t xml:space="preserve">Abbildung </w:t>
+      </w:r>
+      <w:r>
+        <w:rPr>
+          <w:b/>
+          <w:color w:val="141413"/>
+        </w:rPr>
+        <w:fldChar w:fldCharType="begin"/>
+        <w:instrText xml:space="preserve"> SEQ Abbildung \* ARABIC </w:instrText>
+        <w:fldChar w:fldCharType="separate"/>
+      </w:r>
+      <w:r>
+        <w:rPr>
+          <w:b/>
+          <w:color w:val="141413"/>
+        </w:rPr>
+        <w:t>1</w:t>
+      </w:r>
+      <w:r>
+        <w:fldChar w:fldCharType="end"/>
+      </w:r>
+      <w:r>
+        <w:t>: Sonderzeichen, vorn die Varianten von h und λ</w:t>
+      </w:r>
+    </w:p>
+    <w:p/>
+    <w:p>
+      <w:pPr>
+        <w:pStyle w:val="Heading2"/>
+      </w:pPr>
+      <w:r>
+        <w:t>Mit der Tastatur</w:t>
+      </w:r>
+    </w:p>
+    <w:p>
+      <w:pPr/>
+      <w:r>
+        <w:t>Buchstaben und Zahlen tippt man einfach in die Eingabe. Einige Tasten haben eine besondere Wirkung:</w:t>
+      </w:r>
+    </w:p>
+    <w:p/>
+    <w:tbl>
+      <w:tblGrid>
+        <w:gridCol w:w="1505"/>
+        <w:gridCol w:w="7567"/>
+      </w:tblGrid>
+      <w:tblPr>
+        <w:tblLook w:firstColumn="1" w:firstRow="1" w:lastColumn="0" w:lastRow="0" w:noHBand="0" w:noVBand="1" w:val="04A0"/>
+        <w:tblW w:w="9072" w:type="dxa"/>
+        <w:tblLayout w:type="fixed"/>
+      </w:tblPr>
+      <w:tr>
+        <w:tc>
+          <w:tcPr>
+            <w:tcBorders>
+              <w:top w:val="single" w:sz="4" w:space="0" w:color="DAD6C9"/>
+              <w:left w:val="single" w:sz="4" w:space="0" w:color="DAD6C9"/>
+              <w:bottom w:val="single" w:sz="12" w:space="0" w:color="CC785C"/>
+              <w:right w:val="single" w:sz="4" w:space="0" w:color="DAD6C9"/>
+            </w:tcBorders>
+            <w:tcMar>
+              <w:top w:w="60" w:type="dxa"/>
+              <w:bottom w:w="60" w:type="dxa"/>
+              <w:left w:w="110" w:type="dxa"/>
+              <w:right w:w="110" w:type="dxa"/>
+            </w:tcMar>
+            <w:shd w:val="clear" w:color="auto" w:fill="F0EDE4"/>
+            <w:tcW w:w="1505" w:type="dxa"/>
+          </w:tcPr>
+          <w:p>
+            <w:pPr>
+              <w:spacing w:after="40" w:before="40" w:line="240" w:lineRule="auto"/>
+            </w:pPr>
+            <w:r>
+              <w:rPr>
+                <w:b/>
+                <w:color w:val="141413"/>
+              </w:rPr>
+              <w:t>Taste</w:t>
+            </w:r>
+          </w:p>
+        </w:tc>
+        <w:tc>
+          <w:tcPr>
+            <w:tcBorders>
+              <w:top w:val="single" w:sz="4" w:space="0" w:color="DAD6C9"/>
+              <w:left w:val="single" w:sz="4" w:space="0" w:color="DAD6C9"/>
+              <w:bottom w:val="single" w:sz="12" w:space="0" w:color="CC785C"/>
+              <w:right w:val="single" w:sz="4" w:space="0" w:color="DAD6C9"/>
+            </w:tcBorders>
+            <w:tcMar>
+              <w:top w:w="60" w:type="dxa"/>
+              <w:bottom w:w="60" w:type="dxa"/>
+              <w:left w:w="110" w:type="dxa"/>
+              <w:right w:w="110" w:type="dxa"/>
+            </w:tcMar>
+            <w:shd w:val="clear" w:color="auto" w:fill="F0EDE4"/>
+            <w:tcW w:w="7567" w:type="dxa"/>
+          </w:tcPr>
+          <w:p>
+            <w:pPr>
+              <w:spacing w:after="40" w:before="40" w:line="240" w:lineRule="auto"/>
+            </w:pPr>
+            <w:r>
+              <w:rPr>
+                <w:b/>
+                <w:color w:val="141413"/>
+              </w:rPr>
+              <w:t>Wirkung</w:t>
+            </w:r>
+          </w:p>
+        </w:tc>
+      </w:tr>
+      <w:tr>
+        <w:tc>
+          <w:tcPr>
+            <w:tcBorders>
+              <w:top w:val="single" w:sz="4" w:space="0" w:color="DAD6C9"/>
+              <w:left w:val="single" w:sz="4" w:space="0" w:color="DAD6C9"/>
+              <w:bottom w:val="single" w:sz="4" w:space="0" w:color="DAD6C9"/>
+              <w:right w:val="single" w:sz="4" w:space="0" w:color="DAD6C9"/>
+            </w:tcBorders>
+            <w:tcMar>
+              <w:top w:w="60" w:type="dxa"/>
+              <w:bottom w:w="60" w:type="dxa"/>
+              <w:left w:w="110" w:type="dxa"/>
+              <w:right w:w="110" w:type="dxa"/>
+            </w:tcMar>
+            <w:tcW w:w="1505" w:type="dxa"/>
+          </w:tcPr>
+          <w:p>
+            <w:pPr>
+              <w:spacing w:after="40" w:before="40" w:line="240" w:lineRule="auto"/>
+            </w:pPr>
+            <w:r>
+              <w:rPr>
+                <w:rFonts w:ascii="Consolas" w:hAnsi="Consolas"/>
+              </w:rPr>
+              <w:t>/</w:t>
+            </w:r>
+          </w:p>
+        </w:tc>
+        <w:tc>
+          <w:tcPr>
+            <w:tcBorders>
+              <w:top w:val="single" w:sz="4" w:space="0" w:color="DAD6C9"/>
+              <w:left w:val="single" w:sz="4" w:space="0" w:color="DAD6C9"/>
+              <w:bottom w:val="single" w:sz="4" w:space="0" w:color="DAD6C9"/>
+              <w:right w:val="single" w:sz="4" w:space="0" w:color="DAD6C9"/>
+            </w:tcBorders>
+            <w:tcMar>
+              <w:top w:w="60" w:type="dxa"/>
+              <w:bottom w:w="60" w:type="dxa"/>
+              <w:left w:w="110" w:type="dxa"/>
+              <w:right w:w="110" w:type="dxa"/>
+            </w:tcMar>
+            <w:tcW w:w="7567" w:type="dxa"/>
+          </w:tcPr>
+          <w:p>
+            <w:pPr>
+              <w:spacing w:after="40" w:before="40" w:line="240" w:lineRule="auto"/>
+            </w:pPr>
+            <w:r>
+              <w:t>macht einen Bruch, das Getippte wird zum Zähler</w:t>
+            </w:r>
+          </w:p>
+        </w:tc>
+      </w:tr>
+      <w:tr>
+        <w:tc>
+          <w:tcPr>
+            <w:tcBorders>
+              <w:top w:val="single" w:sz="4" w:space="0" w:color="DAD6C9"/>
+              <w:left w:val="single" w:sz="4" w:space="0" w:color="DAD6C9"/>
+              <w:bottom w:val="single" w:sz="4" w:space="0" w:color="DAD6C9"/>
+              <w:right w:val="single" w:sz="4" w:space="0" w:color="DAD6C9"/>
+            </w:tcBorders>
+            <w:tcMar>
+              <w:top w:w="60" w:type="dxa"/>
+              <w:bottom w:w="60" w:type="dxa"/>
+              <w:left w:w="110" w:type="dxa"/>
+              <w:right w:w="110" w:type="dxa"/>
+            </w:tcMar>
+            <w:tcW w:w="1505" w:type="dxa"/>
+          </w:tcPr>
+          <w:p>
+            <w:pPr>
+              <w:spacing w:after="40" w:before="40" w:line="240" w:lineRule="auto"/>
+            </w:pPr>
+            <w:r>
+              <w:rPr>
+                <w:rFonts w:ascii="Consolas" w:hAnsi="Consolas"/>
+              </w:rPr>
+              <w:t>^</w:t>
+            </w:r>
+          </w:p>
+        </w:tc>
+        <w:tc>
+          <w:tcPr>
+            <w:tcBorders>
+              <w:top w:val="single" w:sz="4" w:space="0" w:color="DAD6C9"/>
+              <w:left w:val="single" w:sz="4" w:space="0" w:color="DAD6C9"/>
+              <w:bottom w:val="single" w:sz="4" w:space="0" w:color="DAD6C9"/>
+              <w:right w:val="single" w:sz="4" w:space="0" w:color="DAD6C9"/>
+            </w:tcBorders>
+            <w:tcMar>
+              <w:top w:w="60" w:type="dxa"/>
+              <w:bottom w:w="60" w:type="dxa"/>
+              <w:left w:w="110" w:type="dxa"/>
+              <w:right w:w="110" w:type="dxa"/>
+            </w:tcMar>
+            <w:tcW w:w="7567" w:type="dxa"/>
+          </w:tcPr>
+          <w:p>
+            <w:pPr>
+              <w:spacing w:after="40" w:before="40" w:line="240" w:lineRule="auto"/>
+            </w:pPr>
+            <w:r>
+              <w:t>beginnt eine Hochzahl</w:t>
+            </w:r>
+          </w:p>
+        </w:tc>
+      </w:tr>
+      <w:tr>
+        <w:tc>
+          <w:tcPr>
+            <w:tcBorders>
+              <w:top w:val="single" w:sz="4" w:space="0" w:color="DAD6C9"/>
+              <w:left w:val="single" w:sz="4" w:space="0" w:color="DAD6C9"/>
+              <w:bottom w:val="single" w:sz="4" w:space="0" w:color="DAD6C9"/>
+              <w:right w:val="single" w:sz="4" w:space="0" w:color="DAD6C9"/>
+            </w:tcBorders>
+            <w:tcMar>
+              <w:top w:w="60" w:type="dxa"/>
+              <w:bottom w:w="60" w:type="dxa"/>
+              <w:left w:w="110" w:type="dxa"/>
+              <w:right w:w="110" w:type="dxa"/>
+            </w:tcMar>
+            <w:tcW w:w="1505" w:type="dxa"/>
+          </w:tcPr>
+          <w:p>
+            <w:pPr>
+              <w:spacing w:after="40" w:before="40" w:line="240" w:lineRule="auto"/>
+            </w:pPr>
+            <w:r>
+              <w:rPr>
+                <w:rFonts w:ascii="Consolas" w:hAnsi="Consolas"/>
+              </w:rPr>
+              <w:t>_</w:t>
+            </w:r>
+          </w:p>
+        </w:tc>
+        <w:tc>
+          <w:tcPr>
+            <w:tcBorders>
+              <w:top w:val="single" w:sz="4" w:space="0" w:color="DAD6C9"/>
+              <w:left w:val="single" w:sz="4" w:space="0" w:color="DAD6C9"/>
+              <w:bottom w:val="single" w:sz="4" w:space="0" w:color="DAD6C9"/>
+              <w:right w:val="single" w:sz="4" w:space="0" w:color="DAD6C9"/>
+            </w:tcBorders>
+            <w:tcMar>
+              <w:top w:w="60" w:type="dxa"/>
+              <w:bottom w:w="60" w:type="dxa"/>
+              <w:left w:w="110" w:type="dxa"/>
+              <w:right w:w="110" w:type="dxa"/>
+            </w:tcMar>
+            <w:tcW w:w="7567" w:type="dxa"/>
+          </w:tcPr>
+          <w:p>
+            <w:pPr>
+              <w:spacing w:after="40" w:before="40" w:line="240" w:lineRule="auto"/>
+            </w:pPr>
+            <w:r>
+              <w:t>beginnt einen Index (tiefgestellt)</w:t>
+            </w:r>
+          </w:p>
+        </w:tc>
+      </w:tr>
+      <w:tr>
+        <w:tc>
+          <w:tcPr>
+            <w:tcBorders>
+              <w:top w:val="single" w:sz="4" w:space="0" w:color="DAD6C9"/>
+              <w:left w:val="single" w:sz="4" w:space="0" w:color="DAD6C9"/>
+              <w:bottom w:val="single" w:sz="4" w:space="0" w:color="DAD6C9"/>
+              <w:right w:val="single" w:sz="4" w:space="0" w:color="DAD6C9"/>
+            </w:tcBorders>
+            <w:tcMar>
+              <w:top w:w="60" w:type="dxa"/>
+              <w:bottom w:w="60" w:type="dxa"/>
+              <w:left w:w="110" w:type="dxa"/>
+              <w:right w:w="110" w:type="dxa"/>
+            </w:tcMar>
+            <w:tcW w:w="1505" w:type="dxa"/>
+          </w:tcPr>
+          <w:p>
+            <w:pPr>
+              <w:spacing w:after="40" w:before="40" w:line="240" w:lineRule="auto"/>
+            </w:pPr>
+            <w:r>
+              <w:t>Pfeiltasten</w:t>
+            </w:r>
+          </w:p>
+        </w:tc>
+        <w:tc>
+          <w:tcPr>
+            <w:tcBorders>
+              <w:top w:val="single" w:sz="4" w:space="0" w:color="DAD6C9"/>
+              <w:left w:val="single" w:sz="4" w:space="0" w:color="DAD6C9"/>
+              <w:bottom w:val="single" w:sz="4" w:space="0" w:color="DAD6C9"/>
+              <w:right w:val="single" w:sz="4" w:space="0" w:color="DAD6C9"/>
+            </w:tcBorders>
+            <w:tcMar>
+              <w:top w:w="60" w:type="dxa"/>
+              <w:bottom w:w="60" w:type="dxa"/>
+              <w:left w:w="110" w:type="dxa"/>
+              <w:right w:w="110" w:type="dxa"/>
+            </w:tcMar>
+            <w:tcW w:w="7567" w:type="dxa"/>
+          </w:tcPr>
+          <w:p>
+            <w:pPr>
+              <w:spacing w:after="40" w:before="40" w:line="240" w:lineRule="auto"/>
+            </w:pPr>
+            <w:r>
+              <w:t>wechseln zwischen Zähler, Nenner und den übrigen Feldern</w:t>
+            </w:r>
+          </w:p>
+        </w:tc>
+      </w:tr>
+      <w:tr>
+        <w:tc>
+          <w:tcPr>
+            <w:tcBorders>
+              <w:top w:val="single" w:sz="4" w:space="0" w:color="DAD6C9"/>
+              <w:left w:val="single" w:sz="4" w:space="0" w:color="DAD6C9"/>
+              <w:bottom w:val="single" w:sz="4" w:space="0" w:color="DAD6C9"/>
+              <w:right w:val="single" w:sz="4" w:space="0" w:color="DAD6C9"/>
+            </w:tcBorders>
+            <w:tcMar>
+              <w:top w:w="60" w:type="dxa"/>
+              <w:bottom w:w="60" w:type="dxa"/>
+              <w:left w:w="110" w:type="dxa"/>
+              <w:right w:w="110" w:type="dxa"/>
+            </w:tcMar>
+            <w:tcW w:w="1505" w:type="dxa"/>
+          </w:tcPr>
+          <w:p>
+            <w:pPr>
+              <w:spacing w:after="40" w:before="40" w:line="240" w:lineRule="auto"/>
+            </w:pPr>
+            <w:r>
+              <w:t>Leertaste</w:t>
+            </w:r>
+          </w:p>
+        </w:tc>
+        <w:tc>
+          <w:tcPr>
+            <w:tcBorders>
+              <w:top w:val="single" w:sz="4" w:space="0" w:color="DAD6C9"/>
+              <w:left w:val="single" w:sz="4" w:space="0" w:color="DAD6C9"/>
+              <w:bottom w:val="single" w:sz="4" w:space="0" w:color="DAD6C9"/>
+              <w:right w:val="single" w:sz="4" w:space="0" w:color="DAD6C9"/>
+            </w:tcBorders>
+            <w:tcMar>
+              <w:top w:w="60" w:type="dxa"/>
+              <w:bottom w:w="60" w:type="dxa"/>
+              <w:left w:w="110" w:type="dxa"/>
+              <w:right w:w="110" w:type="dxa"/>
+            </w:tcMar>
+            <w:tcW w:w="7567" w:type="dxa"/>
+          </w:tcPr>
+          <w:p>
+            <w:pPr>
+              <w:spacing w:after="40" w:before="40" w:line="240" w:lineRule="auto"/>
+            </w:pPr>
+            <w:r>
+              <w:t>kleiner Abstand zwischen Ziffern, etwa 1.159 652 180 46</w:t>
+            </w:r>
+          </w:p>
+        </w:tc>
+      </w:tr>
+      <w:tr>
+        <w:tc>
+          <w:tcPr>
+            <w:tcBorders>
+              <w:top w:val="single" w:sz="4" w:space="0" w:color="DAD6C9"/>
+              <w:left w:val="single" w:sz="4" w:space="0" w:color="DAD6C9"/>
+              <w:bottom w:val="single" w:sz="4" w:space="0" w:color="DAD6C9"/>
+              <w:right w:val="single" w:sz="4" w:space="0" w:color="DAD6C9"/>
+            </w:tcBorders>
+            <w:tcMar>
+              <w:top w:w="60" w:type="dxa"/>
+              <w:bottom w:w="60" w:type="dxa"/>
+              <w:left w:w="110" w:type="dxa"/>
+              <w:right w:w="110" w:type="dxa"/>
+            </w:tcMar>
+            <w:tcW w:w="1505" w:type="dxa"/>
+          </w:tcPr>
+          <w:p>
+            <w:pPr>
+              <w:spacing w:after="40" w:before="40" w:line="240" w:lineRule="auto"/>
+            </w:pPr>
+            <w:r>
+              <w:t>Rückschritt</w:t>
+            </w:r>
+          </w:p>
+        </w:tc>
+        <w:tc>
+          <w:tcPr>
+            <w:tcBorders>
+              <w:top w:val="single" w:sz="4" w:space="0" w:color="DAD6C9"/>
+              <w:left w:val="single" w:sz="4" w:space="0" w:color="DAD6C9"/>
+              <w:bottom w:val="single" w:sz="4" w:space="0" w:color="DAD6C9"/>
+              <w:right w:val="single" w:sz="4" w:space="0" w:color="DAD6C9"/>
+            </w:tcBorders>
+            <w:tcMar>
+              <w:top w:w="60" w:type="dxa"/>
+              <w:bottom w:w="60" w:type="dxa"/>
+              <w:left w:w="110" w:type="dxa"/>
+              <w:right w:w="110" w:type="dxa"/>
+            </w:tcMar>
+            <w:tcW w:w="7567" w:type="dxa"/>
+          </w:tcPr>
+          <w:p>
+            <w:pPr>
+              <w:spacing w:after="40" w:before="40" w:line="240" w:lineRule="auto"/>
+            </w:pPr>
+            <w:r>
+              <w:t>löscht das Zeichen links vom Cursor</w:t>
+            </w:r>
+          </w:p>
+        </w:tc>
+      </w:tr>
+    </w:tbl>
+    <w:p>
+      <w:pPr>
+        <w:pStyle w:val="Caption"/>
+      </w:pPr>
+      <w:r>
+        <w:rPr>
+          <w:b/>
+          <w:color w:val="141413"/>
+        </w:rPr>
+        <w:t xml:space="preserve">Tabelle </w:t>
+      </w:r>
+      <w:r>
+        <w:rPr>
+          <w:b/>
+          <w:color w:val="141413"/>
+        </w:rPr>
+        <w:fldChar w:fldCharType="begin"/>
+        <w:instrText xml:space="preserve"> SEQ Tabelle \* ARABIC </w:instrText>
+        <w:fldChar w:fldCharType="separate"/>
+      </w:r>
+      <w:r>
+        <w:rPr>
+          <w:b/>
+          <w:color w:val="141413"/>
+        </w:rPr>
+        <w:t>1</w:t>
+      </w:r>
+      <w:r>
+        <w:fldChar w:fldCharType="end"/>
+      </w:r>
+      <w:r>
+        <w:t>: Tasten mit besonderer Wirkung in der Eingabe</w:t>
+      </w:r>
+    </w:p>
+    <w:p/>
+    <w:p>
+      <w:pPr/>
+      <w:r>
+        <w:t>Nach einem Komma entsteht kein Abstand. Man schreibt also 1,5 und erhält 1,5 und nicht 1, 5.</w:t>
+      </w:r>
+    </w:p>
+    <w:p>
+      <w:pPr>
+        <w:pStyle w:val="Heading2"/>
+      </w:pPr>
+      <w:r>
+        <w:t>Die Knöpfe unter der Eingabe</w:t>
+      </w:r>
+    </w:p>
+    <w:p>
+      <w:pPr/>
+      <w:r>
+        <w:t xml:space="preserve">Unter der Eingabe liegen </w:t>
+      </w:r>
+      <w:r>
+        <w:rPr>
+          <w:b/>
+        </w:rPr>
+        <w:t>Rückgängig</w:t>
+      </w:r>
+      <w:r>
+        <w:t xml:space="preserve">, </w:t>
+      </w:r>
+      <w:r>
+        <w:rPr>
+          <w:b/>
+        </w:rPr>
+        <w:t>Wiederholen</w:t>
+      </w:r>
+      <w:r>
+        <w:t xml:space="preserve"> und </w:t>
+      </w:r>
+      <w:r>
+        <w:rPr>
+          <w:b/>
+        </w:rPr>
+        <w:t>Neue Formel</w:t>
+      </w:r>
+      <w:r>
+        <w:t xml:space="preserve">. Neue Formel leert die Eingabe. Darüber liegen die Knöpfe </w:t>
       </w:r>
       <w:r>
         <w:rPr>
@@ -370,7 +1034,7 @@
         <w:t>K</w:t>
       </w:r>
       <w:r>
-        <w:t xml:space="preserve"> (kursiv bzw. aufrecht) oder </w:t>
+        <w:t xml:space="preserve"> (kursiv oder aufrecht) und </w:t>
       </w:r>
       <w:r>
         <w:rPr>
@@ -379,7 +1043,231 @@
         <w:t>A</w:t>
       </w:r>
       <w:r>
-        <w:t xml:space="preserve"> (Farbe) klicken. Ohne Markierung gilt die Wahl für die nächsten Zeichen.</w:t>
+        <w:t xml:space="preserve"> (Farbe).</w:t>
+      </w:r>
+    </w:p>
+    <w:p/>
+    <w:p>
+      <w:pPr>
+        <w:jc w:val="center"/>
+      </w:pPr>
+      <w:r>
+        <w:drawing>
+          <wp:inline xmlns:a="http://schemas.openxmlformats.org/drawingml/2006/main" xmlns:pic="http://schemas.openxmlformats.org/drawingml/2006/picture">
+            <wp:extent cx="3090672" cy="3639312"/>
+            <wp:docPr id="4" name="Picture 4"/>
+            <wp:cNvGraphicFramePr>
+              <a:graphicFrameLocks noChangeAspect="1"/>
+            </wp:cNvGraphicFramePr>
+            <a:graphic>
+              <a:graphicData uri="http://schemas.openxmlformats.org/drawingml/2006/picture">
+                <pic:pic>
+                  <pic:nvPicPr>
+                    <pic:cNvPr id="0" name="04-eingabe.png"/>
+                    <pic:cNvPicPr/>
+                  </pic:nvPicPr>
+                  <pic:blipFill>
+                    <a:blip r:embed="rId14"/>
+                    <a:stretch>
+                      <a:fillRect/>
+                    </a:stretch>
+                  </pic:blipFill>
+                  <pic:spPr>
+                    <a:xfrm>
+                      <a:off x="0" y="0"/>
+                      <a:ext cx="3090672" cy="3639312"/>
+                    </a:xfrm>
+                    <a:prstGeom prst="rect"/>
+                  </pic:spPr>
+                </pic:pic>
+              </a:graphicData>
+            </a:graphic>
+          </wp:inline>
+        </w:drawing>
+      </w:r>
+    </w:p>
+    <w:p>
+      <w:pPr>
+        <w:pStyle w:val="Caption"/>
+      </w:pPr>
+      <w:r>
+        <w:rPr>
+          <w:b/>
+          <w:color w:val="141413"/>
+        </w:rPr>
+        <w:t xml:space="preserve">Abbildung </w:t>
+      </w:r>
+      <w:r>
+        <w:rPr>
+          <w:b/>
+          <w:color w:val="141413"/>
+        </w:rPr>
+        <w:fldChar w:fldCharType="begin"/>
+        <w:instrText xml:space="preserve"> SEQ Abbildung \* ARABIC </w:instrText>
+        <w:fldChar w:fldCharType="separate"/>
+      </w:r>
+      <w:r>
+        <w:rPr>
+          <w:b/>
+          <w:color w:val="141413"/>
+        </w:rPr>
+        <w:t>1</w:t>
+      </w:r>
+      <w:r>
+        <w:fldChar w:fldCharType="end"/>
+      </w:r>
+      <w:r>
+        <w:t>: Eingabe mit Formel, darüber F, K und A, darunter die Knöpfe</w:t>
+      </w:r>
+    </w:p>
+    <w:p/>
+    <w:p>
+      <w:pPr>
+        <w:pStyle w:val="Heading2"/>
+      </w:pPr>
+      <w:r>
+        <w:t>Fett, kursiv und Farbe</w:t>
+      </w:r>
+    </w:p>
+    <w:p>
+      <w:pPr/>
+      <w:r>
+        <w:t xml:space="preserve">Zeichen in der Eingabe mit der Maus markieren und dann auf </w:t>
+      </w:r>
+      <w:r>
+        <w:rPr>
+          <w:b/>
+        </w:rPr>
+        <w:t>F</w:t>
+      </w:r>
+      <w:r>
+        <w:t xml:space="preserve">, </w:t>
+      </w:r>
+      <w:r>
+        <w:rPr>
+          <w:b/>
+        </w:rPr>
+        <w:t>K</w:t>
+      </w:r>
+      <w:r>
+        <w:t xml:space="preserve"> oder </w:t>
+      </w:r>
+      <w:r>
+        <w:rPr>
+          <w:b/>
+        </w:rPr>
+        <w:t>A</w:t>
+      </w:r>
+      <w:r>
+        <w:t xml:space="preserve"> klicken. Ohne Markierung gilt die Wahl für die nächsten getippten Zeichen. </w:t>
+      </w:r>
+      <w:r>
+        <w:rPr>
+          <w:b/>
+        </w:rPr>
+        <w:t>A</w:t>
+      </w:r>
+      <w:r>
+        <w:t xml:space="preserve"> öffnet fünf Farben: Schwarz, Rot, Grün, Hellblau und Blau.</w:t>
+      </w:r>
+    </w:p>
+    <w:p/>
+    <w:p>
+      <w:pPr>
+        <w:jc w:val="center"/>
+      </w:pPr>
+      <w:r>
+        <w:drawing>
+          <wp:inline xmlns:a="http://schemas.openxmlformats.org/drawingml/2006/main" xmlns:pic="http://schemas.openxmlformats.org/drawingml/2006/picture">
+            <wp:extent cx="2889504" cy="411480"/>
+            <wp:docPr id="5" name="Picture 5"/>
+            <wp:cNvGraphicFramePr>
+              <a:graphicFrameLocks noChangeAspect="1"/>
+            </wp:cNvGraphicFramePr>
+            <a:graphic>
+              <a:graphicData uri="http://schemas.openxmlformats.org/drawingml/2006/picture">
+                <pic:pic>
+                  <pic:nvPicPr>
+                    <pic:cNvPr id="0" name="05-farbe.png"/>
+                    <pic:cNvPicPr/>
+                  </pic:nvPicPr>
+                  <pic:blipFill>
+                    <a:blip r:embed="rId15"/>
+                    <a:stretch>
+                      <a:fillRect/>
+                    </a:stretch>
+                  </pic:blipFill>
+                  <pic:spPr>
+                    <a:xfrm>
+                      <a:off x="0" y="0"/>
+                      <a:ext cx="2889504" cy="411480"/>
+                    </a:xfrm>
+                    <a:prstGeom prst="rect"/>
+                  </pic:spPr>
+                </pic:pic>
+              </a:graphicData>
+            </a:graphic>
+          </wp:inline>
+        </w:drawing>
+      </w:r>
+    </w:p>
+    <w:p>
+      <w:pPr>
+        <w:pStyle w:val="Caption"/>
+      </w:pPr>
+      <w:r>
+        <w:rPr>
+          <w:b/>
+          <w:color w:val="141413"/>
+        </w:rPr>
+        <w:t xml:space="preserve">Abbildung </w:t>
+      </w:r>
+      <w:r>
+        <w:rPr>
+          <w:b/>
+          <w:color w:val="141413"/>
+        </w:rPr>
+        <w:fldChar w:fldCharType="begin"/>
+        <w:instrText xml:space="preserve"> SEQ Abbildung \* ARABIC </w:instrText>
+        <w:fldChar w:fldCharType="separate"/>
+      </w:r>
+      <w:r>
+        <w:rPr>
+          <w:b/>
+          <w:color w:val="141413"/>
+        </w:rPr>
+        <w:t>1</w:t>
+      </w:r>
+      <w:r>
+        <w:fldChar w:fldCharType="end"/>
+      </w:r>
+      <w:r>
+        <w:t>: Die Farbauswahl hinter dem Knopf A</w:t>
+      </w:r>
+    </w:p>
+    <w:p/>
+    <w:p>
+      <w:pPr>
+        <w:pStyle w:val="Heading1"/>
+        <w:pageBreakBefore/>
+      </w:pPr>
+      <w:r>
+        <w:t>Einfügen in Word</w:t>
+      </w:r>
+    </w:p>
+    <w:p>
+      <w:pPr/>
+      <w:r>
+        <w:t xml:space="preserve">Die Kachel </w:t>
+      </w:r>
+      <w:r>
+        <w:rPr>
+          <w:b/>
+        </w:rPr>
+        <w:t>Ergebnis</w:t>
+      </w:r>
+      <w:r>
+        <w:t xml:space="preserve"> zeigt die Formel so, wie sie gedruckt aussieht. Darunter wählt man das Aussehen:</w:t>
       </w:r>
     </w:p>
     <w:p>
@@ -390,10 +1278,10 @@
         <w:rPr>
           <w:b/>
         </w:rPr>
-        <w:t>Zahlen mit Abständen:</w:t>
+        <w:t>Wissenschaftlich</w:t>
       </w:r>
       <w:r>
-        <w:t xml:space="preserve"> Die Leertaste setzt einen kleinen Abstand, etwa in 1.159 652 180 46. Nach einem Komma entsteht kein Abstand, also 1,5 und nicht 1, 5.</w:t>
+        <w:t xml:space="preserve"> setzt Brüche übereinander, wie in Fachzeitschriften. Richtig für abgesetzte Gleichungen.</w:t>
       </w:r>
     </w:p>
     <w:p>
@@ -404,28 +1292,10 @@
         <w:rPr>
           <w:b/>
         </w:rPr>
-        <w:t>Aussehen:</w:t>
-      </w:r>
-      <w:r>
-        <w:t xml:space="preserve"> In der Vorschau zwischen </w:t>
-      </w:r>
-      <w:r>
-        <w:rPr>
-          <w:b/>
-        </w:rPr>
-        <w:t>Wissenschaftlich</w:t>
-      </w:r>
-      <w:r>
-        <w:t xml:space="preserve"> (Brüche übereinander) und </w:t>
-      </w:r>
-      <w:r>
-        <w:rPr>
-          <w:b/>
-        </w:rPr>
         <w:t>Einzeilig</w:t>
       </w:r>
       <w:r>
-        <w:t xml:space="preserve"> (Brüche mit Schrägstrich, für den Fließtext) umschalten und Schrift und Schriftgröße wählen. Der Zoom vergrößert nur die Vorschau.</w:t>
+        <w:t xml:space="preserve"> schreibt Brüche mit Schrägstrich, also hc/λ. So passt die Formel in eine Textzeile.</w:t>
       </w:r>
     </w:p>
     <w:p>
@@ -436,37 +1306,10 @@
         <w:rPr>
           <w:b/>
         </w:rPr>
-        <w:t>Formel ändern:</w:t>
+        <w:t>Vorschau vergrößern</w:t>
       </w:r>
       <w:r>
-        <w:t xml:space="preserve"> Die Formel im Dokument einmal anklicken. Sie erscheint in der Eingabe. Solange nichts geändert ist, heißt der große Knopf </w:t>
-      </w:r>
-      <w:r>
-        <w:rPr>
-          <w:b/>
-        </w:rPr>
-        <w:t>Ohne Änderung übernehmen</w:t>
-      </w:r>
-      <w:r>
-        <w:t xml:space="preserve">; er wandelt eine alte Formel unverändert ins neue Format um. Nach einer Änderung heißt er </w:t>
-      </w:r>
-      <w:r>
-        <w:rPr>
-          <w:b/>
-        </w:rPr>
-        <w:t>Formel in Word ersetzen</w:t>
-      </w:r>
-      <w:r>
-        <w:t xml:space="preserve">. Ein grüner Rahmen um die Eingabe zeigt: Die Formel ist so wie im Dokument. Nach einer Änderung wird der Rahmen orange, die Änderung ist also noch nicht in Word. Nach dem Klick auf den Knopf ist er wieder grün. </w:t>
-      </w:r>
-      <w:r>
-        <w:rPr>
-          <w:b/>
-        </w:rPr>
-        <w:t>Abbrechen</w:t>
-      </w:r>
-      <w:r>
-        <w:t xml:space="preserve"> verwirft alle Änderungen und stellt die Formel wieder her, wie sie im Dokument steht.</w:t>
+        <w:t xml:space="preserve"> ändert nur die Ansicht, nicht die Formel im Dokument.</w:t>
       </w:r>
     </w:p>
     <w:p>
@@ -477,10 +1320,488 @@
         <w:rPr>
           <w:b/>
         </w:rPr>
-        <w:t>Verlauf:</w:t>
+        <w:t>Schrift</w:t>
       </w:r>
       <w:r>
-        <w:t xml:space="preserve"> Der kleine Pfeil neben </w:t>
+        <w:t xml:space="preserve"> und </w:t>
+      </w:r>
+      <w:r>
+        <w:rPr>
+          <w:b/>
+        </w:rPr>
+        <w:t>Schriftgröße</w:t>
+      </w:r>
+      <w:r>
+        <w:t xml:space="preserve"> gelten für die Formel im Dokument. Am besten dieselbe Größe wie der Text, meist 12 pt.</w:t>
+      </w:r>
+    </w:p>
+    <w:p/>
+    <w:p>
+      <w:pPr>
+        <w:jc w:val="center"/>
+      </w:pPr>
+      <w:r>
+        <w:drawing>
+          <wp:inline xmlns:a="http://schemas.openxmlformats.org/drawingml/2006/main" xmlns:pic="http://schemas.openxmlformats.org/drawingml/2006/picture">
+            <wp:extent cx="3090672" cy="4233672"/>
+            <wp:docPr id="6" name="Picture 6"/>
+            <wp:cNvGraphicFramePr>
+              <a:graphicFrameLocks noChangeAspect="1"/>
+            </wp:cNvGraphicFramePr>
+            <a:graphic>
+              <a:graphicData uri="http://schemas.openxmlformats.org/drawingml/2006/picture">
+                <pic:pic>
+                  <pic:nvPicPr>
+                    <pic:cNvPr id="0" name="06-vorschau.png"/>
+                    <pic:cNvPicPr/>
+                  </pic:nvPicPr>
+                  <pic:blipFill>
+                    <a:blip r:embed="rId16"/>
+                    <a:stretch>
+                      <a:fillRect/>
+                    </a:stretch>
+                  </pic:blipFill>
+                  <pic:spPr>
+                    <a:xfrm>
+                      <a:off x="0" y="0"/>
+                      <a:ext cx="3090672" cy="4233672"/>
+                    </a:xfrm>
+                    <a:prstGeom prst="rect"/>
+                  </pic:spPr>
+                </pic:pic>
+              </a:graphicData>
+            </a:graphic>
+          </wp:inline>
+        </w:drawing>
+      </w:r>
+    </w:p>
+    <w:p>
+      <w:pPr>
+        <w:pStyle w:val="Caption"/>
+      </w:pPr>
+      <w:r>
+        <w:rPr>
+          <w:b/>
+          <w:color w:val="141413"/>
+        </w:rPr>
+        <w:t xml:space="preserve">Abbildung </w:t>
+      </w:r>
+      <w:r>
+        <w:rPr>
+          <w:b/>
+          <w:color w:val="141413"/>
+        </w:rPr>
+        <w:fldChar w:fldCharType="begin"/>
+        <w:instrText xml:space="preserve"> SEQ Abbildung \* ARABIC </w:instrText>
+        <w:fldChar w:fldCharType="separate"/>
+      </w:r>
+      <w:r>
+        <w:rPr>
+          <w:b/>
+          <w:color w:val="141413"/>
+        </w:rPr>
+        <w:t>1</w:t>
+      </w:r>
+      <w:r>
+        <w:fldChar w:fldCharType="end"/>
+      </w:r>
+      <w:r>
+        <w:t>: Die Kachel Ergebnis mit Darstellung, Zoom, Schrift und Größe</w:t>
+      </w:r>
+    </w:p>
+    <w:p/>
+    <w:p/>
+    <w:p>
+      <w:pPr>
+        <w:jc w:val="center"/>
+      </w:pPr>
+      <w:r>
+        <w:drawing>
+          <wp:inline xmlns:a="http://schemas.openxmlformats.org/drawingml/2006/main" xmlns:pic="http://schemas.openxmlformats.org/drawingml/2006/picture">
+            <wp:extent cx="2889504" cy="2167128"/>
+            <wp:docPr id="7" name="Picture 7"/>
+            <wp:cNvGraphicFramePr>
+              <a:graphicFrameLocks noChangeAspect="1"/>
+            </wp:cNvGraphicFramePr>
+            <a:graphic>
+              <a:graphicData uri="http://schemas.openxmlformats.org/drawingml/2006/picture">
+                <pic:pic>
+                  <pic:nvPicPr>
+                    <pic:cNvPr id="0" name="07-einzeilig.png"/>
+                    <pic:cNvPicPr/>
+                  </pic:nvPicPr>
+                  <pic:blipFill>
+                    <a:blip r:embed="rId17"/>
+                    <a:stretch>
+                      <a:fillRect/>
+                    </a:stretch>
+                  </pic:blipFill>
+                  <pic:spPr>
+                    <a:xfrm>
+                      <a:off x="0" y="0"/>
+                      <a:ext cx="2889504" cy="2167128"/>
+                    </a:xfrm>
+                    <a:prstGeom prst="rect"/>
+                  </pic:spPr>
+                </pic:pic>
+              </a:graphicData>
+            </a:graphic>
+          </wp:inline>
+        </w:drawing>
+      </w:r>
+    </w:p>
+    <w:p>
+      <w:pPr>
+        <w:pStyle w:val="Caption"/>
+      </w:pPr>
+      <w:r>
+        <w:rPr>
+          <w:b/>
+          <w:color w:val="141413"/>
+        </w:rPr>
+        <w:t xml:space="preserve">Abbildung </w:t>
+      </w:r>
+      <w:r>
+        <w:rPr>
+          <w:b/>
+          <w:color w:val="141413"/>
+        </w:rPr>
+        <w:fldChar w:fldCharType="begin"/>
+        <w:instrText xml:space="preserve"> SEQ Abbildung \* ARABIC </w:instrText>
+        <w:fldChar w:fldCharType="separate"/>
+      </w:r>
+      <w:r>
+        <w:rPr>
+          <w:b/>
+          <w:color w:val="141413"/>
+        </w:rPr>
+        <w:t>1</w:t>
+      </w:r>
+      <w:r>
+        <w:fldChar w:fldCharType="end"/>
+      </w:r>
+      <w:r>
+        <w:t>: Dieselbe Formel in einzeiliger Darstellung</w:t>
+      </w:r>
+    </w:p>
+    <w:p/>
+    <w:p>
+      <w:pPr/>
+      <w:r>
+        <w:t>So kommt die Formel ins Dokument:</w:t>
+      </w:r>
+    </w:p>
+    <w:p>
+      <w:pPr>
+        <w:pStyle w:val="ListBullet"/>
+      </w:pPr>
+      <w:r>
+        <w:t>Im Dokument an die Stelle klicken, an der die Formel stehen soll.</w:t>
+      </w:r>
+    </w:p>
+    <w:p>
+      <w:pPr>
+        <w:pStyle w:val="ListBullet"/>
+      </w:pPr>
+      <w:r>
+        <w:t xml:space="preserve">Auf </w:t>
+      </w:r>
+      <w:r>
+        <w:rPr>
+          <w:b/>
+        </w:rPr>
+        <w:t>In Word einfügen</w:t>
+      </w:r>
+      <w:r>
+        <w:t xml:space="preserve"> klicken.</w:t>
+      </w:r>
+    </w:p>
+    <w:p>
+      <w:pPr/>
+      <w:r>
+        <w:t>Für eine abgesetzte Gleichung schreibt man sie in einen eigenen Absatz. Die Gleichungsnummer, zum Beispiel (3.8), tippt man als normalen Text dahinter.</w:t>
+      </w:r>
+    </w:p>
+    <w:p>
+      <w:pPr/>
+      <w:r>
+        <w:t>Es gibt acht Schriften. STIX Two passt am besten zu Times New Roman. Termes ist ebenfalls Times-ähnlich, nur zarter. Computer Modern ist der klassische Look mathematischer Bücher. Pagella, Schola und Bonum sind Buchschriften. Fira und DejaVu sind Schriften ohne Serifen.</w:t>
+      </w:r>
+    </w:p>
+    <w:p>
+      <w:pPr>
+        <w:pStyle w:val="Heading1"/>
+        <w:pageBreakBefore/>
+      </w:pPr>
+      <w:r>
+        <w:t>Eine Formel ändern</w:t>
+      </w:r>
+    </w:p>
+    <w:p>
+      <w:pPr>
+        <w:pStyle w:val="Heading2"/>
+      </w:pPr>
+      <w:r>
+        <w:t>Grüner und oranger Rahmen</w:t>
+      </w:r>
+    </w:p>
+    <w:p>
+      <w:pPr>
+        <w:pStyle w:val="ListNumber"/>
+      </w:pPr>
+      <w:r>
+        <w:t>Die Formel im Dokument einmal anklicken.</w:t>
+      </w:r>
+    </w:p>
+    <w:p>
+      <w:pPr>
+        <w:pStyle w:val="ListNumber"/>
+      </w:pPr>
+      <w:r>
+        <w:t xml:space="preserve">Sie erscheint in der Eingabe mit einem </w:t>
+      </w:r>
+      <w:r>
+        <w:rPr>
+          <w:b/>
+        </w:rPr>
+        <w:t>grünen Rahmen</w:t>
+      </w:r>
+      <w:r>
+        <w:t>. Grün heißt: Die Formel ist genau so wie im Dokument.</w:t>
+      </w:r>
+    </w:p>
+    <w:p>
+      <w:pPr>
+        <w:pStyle w:val="ListNumber"/>
+      </w:pPr>
+      <w:r>
+        <w:t xml:space="preserve">Solange nichts geändert ist, heißt der große Knopf </w:t>
+      </w:r>
+      <w:r>
+        <w:rPr>
+          <w:b/>
+        </w:rPr>
+        <w:t>Ohne Änderung übernehmen</w:t>
+      </w:r>
+      <w:r>
+        <w:t>. Er wandelt eine alte Formel unverändert ins neue Format um.</w:t>
+      </w:r>
+    </w:p>
+    <w:p/>
+    <w:p>
+      <w:pPr>
+        <w:jc w:val="center"/>
+      </w:pPr>
+      <w:r>
+        <w:drawing>
+          <wp:inline xmlns:a="http://schemas.openxmlformats.org/drawingml/2006/main" xmlns:pic="http://schemas.openxmlformats.org/drawingml/2006/picture">
+            <wp:extent cx="3090672" cy="4379976"/>
+            <wp:docPr id="8" name="Picture 8"/>
+            <wp:cNvGraphicFramePr>
+              <a:graphicFrameLocks noChangeAspect="1"/>
+            </wp:cNvGraphicFramePr>
+            <a:graphic>
+              <a:graphicData uri="http://schemas.openxmlformats.org/drawingml/2006/picture">
+                <pic:pic>
+                  <pic:nvPicPr>
+                    <pic:cNvPr id="0" name="08-geladen.png"/>
+                    <pic:cNvPicPr/>
+                  </pic:nvPicPr>
+                  <pic:blipFill>
+                    <a:blip r:embed="rId18"/>
+                    <a:stretch>
+                      <a:fillRect/>
+                    </a:stretch>
+                  </pic:blipFill>
+                  <pic:spPr>
+                    <a:xfrm>
+                      <a:off x="0" y="0"/>
+                      <a:ext cx="3090672" cy="4379976"/>
+                    </a:xfrm>
+                    <a:prstGeom prst="rect"/>
+                  </pic:spPr>
+                </pic:pic>
+              </a:graphicData>
+            </a:graphic>
+          </wp:inline>
+        </w:drawing>
+      </w:r>
+    </w:p>
+    <w:p>
+      <w:pPr>
+        <w:pStyle w:val="Caption"/>
+      </w:pPr>
+      <w:r>
+        <w:rPr>
+          <w:b/>
+          <w:color w:val="141413"/>
+        </w:rPr>
+        <w:t xml:space="preserve">Abbildung </w:t>
+      </w:r>
+      <w:r>
+        <w:rPr>
+          <w:b/>
+          <w:color w:val="141413"/>
+        </w:rPr>
+        <w:fldChar w:fldCharType="begin"/>
+        <w:instrText xml:space="preserve"> SEQ Abbildung \* ARABIC </w:instrText>
+        <w:fldChar w:fldCharType="separate"/>
+      </w:r>
+      <w:r>
+        <w:rPr>
+          <w:b/>
+          <w:color w:val="141413"/>
+        </w:rPr>
+        <w:t>1</w:t>
+      </w:r>
+      <w:r>
+        <w:fldChar w:fldCharType="end"/>
+      </w:r>
+      <w:r>
+        <w:t>: Geladene Formel mit grünem Rahmen</w:t>
+      </w:r>
+    </w:p>
+    <w:p/>
+    <w:p>
+      <w:pPr/>
+      <w:r>
+        <w:t xml:space="preserve">Sobald man etwas ändert, wird der Rahmen </w:t>
+      </w:r>
+      <w:r>
+        <w:rPr>
+          <w:b/>
+        </w:rPr>
+        <w:t>orange</w:t>
+      </w:r>
+      <w:r>
+        <w:t xml:space="preserve">. Die Änderung ist dann noch nicht in Word. Der Knopf heißt jetzt </w:t>
+      </w:r>
+      <w:r>
+        <w:rPr>
+          <w:b/>
+        </w:rPr>
+        <w:t>Formel in Word ersetzen</w:t>
+      </w:r>
+      <w:r>
+        <w:t>. Nach dem Klick steht die neue Formel an derselben Stelle, und der Rahmen ist wieder grün.</w:t>
+      </w:r>
+    </w:p>
+    <w:p>
+      <w:pPr/>
+      <w:r>
+        <w:t xml:space="preserve">Der Knopf </w:t>
+      </w:r>
+      <w:r>
+        <w:rPr>
+          <w:b/>
+        </w:rPr>
+        <w:t>Abbrechen</w:t>
+      </w:r>
+      <w:r>
+        <w:t xml:space="preserve"> darunter wird jetzt aktiv. Er verwirft alle Änderungen, und die Formel steht wieder so in der Eingabe wie im Dokument.</w:t>
+      </w:r>
+    </w:p>
+    <w:p/>
+    <w:p>
+      <w:pPr>
+        <w:jc w:val="center"/>
+      </w:pPr>
+      <w:r>
+        <w:drawing>
+          <wp:inline xmlns:a="http://schemas.openxmlformats.org/drawingml/2006/main" xmlns:pic="http://schemas.openxmlformats.org/drawingml/2006/picture">
+            <wp:extent cx="3090672" cy="4379976"/>
+            <wp:docPr id="9" name="Picture 9"/>
+            <wp:cNvGraphicFramePr>
+              <a:graphicFrameLocks noChangeAspect="1"/>
+            </wp:cNvGraphicFramePr>
+            <a:graphic>
+              <a:graphicData uri="http://schemas.openxmlformats.org/drawingml/2006/picture">
+                <pic:pic>
+                  <pic:nvPicPr>
+                    <pic:cNvPr id="0" name="09-geaendert.png"/>
+                    <pic:cNvPicPr/>
+                  </pic:nvPicPr>
+                  <pic:blipFill>
+                    <a:blip r:embed="rId19"/>
+                    <a:stretch>
+                      <a:fillRect/>
+                    </a:stretch>
+                  </pic:blipFill>
+                  <pic:spPr>
+                    <a:xfrm>
+                      <a:off x="0" y="0"/>
+                      <a:ext cx="3090672" cy="4379976"/>
+                    </a:xfrm>
+                    <a:prstGeom prst="rect"/>
+                  </pic:spPr>
+                </pic:pic>
+              </a:graphicData>
+            </a:graphic>
+          </wp:inline>
+        </w:drawing>
+      </w:r>
+    </w:p>
+    <w:p>
+      <w:pPr>
+        <w:pStyle w:val="Caption"/>
+      </w:pPr>
+      <w:r>
+        <w:rPr>
+          <w:b/>
+          <w:color w:val="141413"/>
+        </w:rPr>
+        <w:t xml:space="preserve">Abbildung </w:t>
+      </w:r>
+      <w:r>
+        <w:rPr>
+          <w:b/>
+          <w:color w:val="141413"/>
+        </w:rPr>
+        <w:fldChar w:fldCharType="begin"/>
+        <w:instrText xml:space="preserve"> SEQ Abbildung \* ARABIC </w:instrText>
+        <w:fldChar w:fldCharType="separate"/>
+      </w:r>
+      <w:r>
+        <w:rPr>
+          <w:b/>
+          <w:color w:val="141413"/>
+        </w:rPr>
+        <w:t>1</w:t>
+      </w:r>
+      <w:r>
+        <w:fldChar w:fldCharType="end"/>
+      </w:r>
+      <w:r>
+        <w:t>: Geänderte Formel mit orangem Rahmen, Ersetzen und Abbrechen</w:t>
+      </w:r>
+    </w:p>
+    <w:p/>
+    <w:p>
+      <w:pPr>
+        <w:pStyle w:val="Quote"/>
+      </w:pPr>
+      <w:r>
+        <w:rPr>
+          <w:b/>
+        </w:rPr>
+        <w:t>Gut zu wissen.</w:t>
+      </w:r>
+      <w:r>
+        <w:t xml:space="preserve"> Soll statt des Ersetzens eine zusätzliche Formel entstehen, vorher auf „Neue Formel“ klicken. Dann heißt der große Knopf wieder „In Word einfügen“.</w:t>
+      </w:r>
+    </w:p>
+    <w:p>
+      <w:pPr>
+        <w:pStyle w:val="Heading2"/>
+      </w:pPr>
+      <w:r>
+        <w:t>Der Verlauf</w:t>
+      </w:r>
+    </w:p>
+    <w:p>
+      <w:pPr/>
+      <w:r>
+        <w:t xml:space="preserve">Der kleine Pfeil neben </w:t>
       </w:r>
       <w:r>
         <w:rPr>
@@ -489,34 +1810,7 @@
         <w:t>Rückgängig</w:t>
       </w:r>
       <w:r>
-        <w:t xml:space="preserve"> zeigt die letzten 20 Schritte. Ausgewählte Schritte werden mit </w:t>
-      </w:r>
-      <w:r>
-        <w:rPr>
-          <w:b/>
-        </w:rPr>
-        <w:t>Rückgängig machen</w:t>
-      </w:r>
-      <w:r>
-        <w:t xml:space="preserve"> einzeln zurückgenommen, auch wenn danach noch weitergearbeitet wurde. Der Pfeil neben </w:t>
-      </w:r>
-      <w:r>
-        <w:rPr>
-          <w:b/>
-        </w:rPr>
-        <w:t>Wiederholen</w:t>
-      </w:r>
-      <w:r>
-        <w:t xml:space="preserve"> zeigt dieselben Schritte. Mit </w:t>
-      </w:r>
-      <w:r>
-        <w:rPr>
-          <w:b/>
-        </w:rPr>
-        <w:t>Anwenden</w:t>
-      </w:r>
-      <w:r>
-        <w:t xml:space="preserve"> kommen ausgewählte Schritte zurück, oder sie werden auf eine andere Formel übertragen, zum Beispiel „v fett“ auf die nächste angeklickte Formel. Passt ein Schritt nicht zur Formel, wird er ausgelassen und der Editor sagt das.</w:t>
+        <w:t xml:space="preserve"> zeigt die letzten 20 Schritte, jeweils mit einem Kästchen zum Ankreuzen.</w:t>
       </w:r>
     </w:p>
     <w:p>
@@ -527,34 +1821,211 @@
         <w:rPr>
           <w:b/>
         </w:rPr>
-        <w:t>Neu anfangen:</w:t>
+        <w:t>Rückgängig machen</w:t>
       </w:r>
       <w:r>
-        <w:t xml:space="preserve"> </w:t>
+        <w:t xml:space="preserve"> nimmt die angekreuzten Schritte zurück, auch wenn danach weitergearbeitet wurde.</w:t>
+      </w:r>
+    </w:p>
+    <w:p>
+      <w:pPr>
+        <w:pStyle w:val="ListBullet"/>
+      </w:pPr>
+      <w:r>
+        <w:t xml:space="preserve">Der Pfeil neben </w:t>
       </w:r>
       <w:r>
         <w:rPr>
           <w:b/>
         </w:rPr>
-        <w:t>Neue Formel</w:t>
+        <w:t>Wiederholen</w:t>
       </w:r>
       <w:r>
-        <w:t xml:space="preserve"> leert die Eingabe. Danach fügt der große Knopf wieder neu ein, statt zu ersetzen.</w:t>
+        <w:t xml:space="preserve"> zeigt dieselben Schritte. </w:t>
       </w:r>
-    </w:p>
-    <w:p>
       <w:r>
-        <w:t>Die Formel steckt unsichtbar im Alternativtext des Bildes. Deshalb lässt sie sich auch nach Wochen noch bearbeiten, solange niemand diesen Alternativtext von Hand ändert.</w:t>
+        <w:rPr>
+          <w:b/>
+        </w:rPr>
+        <w:t>Anwenden</w:t>
+      </w:r>
+      <w:r>
+        <w:t xml:space="preserve"> bringt angekreuzte Schritte zurück oder überträgt sie auf eine andere Formel, zum Beispiel „v fett“ auf die nächste angeklickte Formel.</w:t>
       </w:r>
     </w:p>
     <w:p>
       <w:pPr>
-        <w:pStyle w:val="Heading2"/>
+        <w:pStyle w:val="ListBullet"/>
+      </w:pPr>
+      <w:r>
+        <w:t>Passt ein Schritt nicht zur Formel, wird er ausgelassen, und der Editor sagt das.</w:t>
+      </w:r>
+    </w:p>
+    <w:p/>
+    <w:p>
+      <w:pPr>
+        <w:jc w:val="center"/>
+      </w:pPr>
+      <w:r>
+        <w:drawing>
+          <wp:inline xmlns:a="http://schemas.openxmlformats.org/drawingml/2006/main" xmlns:pic="http://schemas.openxmlformats.org/drawingml/2006/picture">
+            <wp:extent cx="3090672" cy="6483096"/>
+            <wp:docPr id="10" name="Picture 10"/>
+            <wp:cNvGraphicFramePr>
+              <a:graphicFrameLocks noChangeAspect="1"/>
+            </wp:cNvGraphicFramePr>
+            <a:graphic>
+              <a:graphicData uri="http://schemas.openxmlformats.org/drawingml/2006/picture">
+                <pic:pic>
+                  <pic:nvPicPr>
+                    <pic:cNvPr id="0" name="10-verlauf.png"/>
+                    <pic:cNvPicPr/>
+                  </pic:nvPicPr>
+                  <pic:blipFill>
+                    <a:blip r:embed="rId20"/>
+                    <a:stretch>
+                      <a:fillRect/>
+                    </a:stretch>
+                  </pic:blipFill>
+                  <pic:spPr>
+                    <a:xfrm>
+                      <a:off x="0" y="0"/>
+                      <a:ext cx="3090672" cy="6483096"/>
+                    </a:xfrm>
+                    <a:prstGeom prst="rect"/>
+                  </pic:spPr>
+                </pic:pic>
+              </a:graphicData>
+            </a:graphic>
+          </wp:inline>
+        </w:drawing>
+      </w:r>
+    </w:p>
+    <w:p>
+      <w:pPr>
+        <w:pStyle w:val="Caption"/>
+      </w:pPr>
+      <w:r>
+        <w:rPr>
+          <w:b/>
+          <w:color w:val="141413"/>
+        </w:rPr>
+        <w:t xml:space="preserve">Abbildung </w:t>
+      </w:r>
+      <w:r>
+        <w:rPr>
+          <w:b/>
+          <w:color w:val="141413"/>
+        </w:rPr>
+        <w:fldChar w:fldCharType="begin"/>
+        <w:instrText xml:space="preserve"> SEQ Abbildung \* ARABIC </w:instrText>
+        <w:fldChar w:fldCharType="separate"/>
+      </w:r>
+      <w:r>
+        <w:rPr>
+          <w:b/>
+          <w:color w:val="141413"/>
+        </w:rPr>
+        <w:t>1</w:t>
+      </w:r>
+      <w:r>
+        <w:fldChar w:fldCharType="end"/>
+      </w:r>
+      <w:r>
+        <w:t>: Der Verlauf mit den letzten Schritten</w:t>
+      </w:r>
+    </w:p>
+    <w:p/>
+    <w:p>
+      <w:pPr>
+        <w:pStyle w:val="Heading1"/>
+        <w:pageBreakBefore/>
       </w:pPr>
       <w:r>
         <w:t>Alles bearbeiten</w:t>
       </w:r>
     </w:p>
+    <w:p>
+      <w:pPr/>
+      <w:r>
+        <w:t>Der zweite Reiter arbeitet mit allen Formeln im Dokument.</w:t>
+      </w:r>
+    </w:p>
+    <w:p/>
+    <w:p>
+      <w:pPr>
+        <w:jc w:val="center"/>
+      </w:pPr>
+      <w:r>
+        <w:drawing>
+          <wp:inline xmlns:a="http://schemas.openxmlformats.org/drawingml/2006/main" xmlns:pic="http://schemas.openxmlformats.org/drawingml/2006/picture">
+            <wp:extent cx="3383280" cy="6949440"/>
+            <wp:docPr id="11" name="Picture 11"/>
+            <wp:cNvGraphicFramePr>
+              <a:graphicFrameLocks noChangeAspect="1"/>
+            </wp:cNvGraphicFramePr>
+            <a:graphic>
+              <a:graphicData uri="http://schemas.openxmlformats.org/drawingml/2006/picture">
+                <pic:pic>
+                  <pic:nvPicPr>
+                    <pic:cNvPr id="0" name="13-alles.png"/>
+                    <pic:cNvPicPr/>
+                  </pic:nvPicPr>
+                  <pic:blipFill>
+                    <a:blip r:embed="rId21"/>
+                    <a:stretch>
+                      <a:fillRect/>
+                    </a:stretch>
+                  </pic:blipFill>
+                  <pic:spPr>
+                    <a:xfrm>
+                      <a:off x="0" y="0"/>
+                      <a:ext cx="3383280" cy="6949440"/>
+                    </a:xfrm>
+                    <a:prstGeom prst="rect"/>
+                  </pic:spPr>
+                </pic:pic>
+              </a:graphicData>
+            </a:graphic>
+          </wp:inline>
+        </w:drawing>
+      </w:r>
+    </w:p>
+    <w:p>
+      <w:pPr>
+        <w:pStyle w:val="Caption"/>
+      </w:pPr>
+      <w:r>
+        <w:rPr>
+          <w:b/>
+          <w:color w:val="141413"/>
+        </w:rPr>
+        <w:t xml:space="preserve">Abbildung </w:t>
+      </w:r>
+      <w:r>
+        <w:rPr>
+          <w:b/>
+          <w:color w:val="141413"/>
+        </w:rPr>
+        <w:fldChar w:fldCharType="begin"/>
+        <w:instrText xml:space="preserve"> SEQ Abbildung \* ARABIC </w:instrText>
+        <w:fldChar w:fldCharType="separate"/>
+      </w:r>
+      <w:r>
+        <w:rPr>
+          <w:b/>
+          <w:color w:val="141413"/>
+        </w:rPr>
+        <w:t>1</w:t>
+      </w:r>
+      <w:r>
+        <w:fldChar w:fldCharType="end"/>
+      </w:r>
+      <w:r>
+        <w:t>: Der Reiter Alles bearbeiten</w:t>
+      </w:r>
+    </w:p>
+    <w:p/>
     <w:p>
       <w:pPr>
         <w:pStyle w:val="ListBullet"/>
@@ -566,7 +2037,7 @@
         <w:t>Standard für dieses Dokument:</w:t>
       </w:r>
       <w:r>
-        <w:t xml:space="preserve"> Schrift und Schriftgröße, die beim Konvertieren und Formatieren verwendet werden.</w:t>
+        <w:t xml:space="preserve"> Schrift und Schriftgröße für das Konvertieren und Formatieren.</w:t>
       </w:r>
     </w:p>
     <w:p>
@@ -580,27 +2051,84 @@
         <w:t>Alle Formeln konvertieren:</w:t>
       </w:r>
       <w:r>
-        <w:t xml:space="preserve"> wandelt alte Formeln aus dem Formel-Editor 3.0 ins neue Format um. Mit </w:t>
+        <w:t xml:space="preserve"> wandelt alte Formeln aus dem Formel-Editor 3.0 ins neue Format um. Das Ergebnis öffnet sich als neues Dokument, das man mit „Speichern unter …“ sichert. Das Original bleibt unverändert. Problemfälle sind gelb markiert und müssen neu eingegeben werden.</w:t>
+      </w:r>
+    </w:p>
+    <w:p/>
+    <w:p>
+      <w:pPr>
+        <w:jc w:val="center"/>
+      </w:pPr>
+      <w:r>
+        <w:drawing>
+          <wp:inline xmlns:a="http://schemas.openxmlformats.org/drawingml/2006/main" xmlns:pic="http://schemas.openxmlformats.org/drawingml/2006/picture">
+            <wp:extent cx="2889504" cy="2697480"/>
+            <wp:docPr id="12" name="Picture 12"/>
+            <wp:cNvGraphicFramePr>
+              <a:graphicFrameLocks noChangeAspect="1"/>
+            </wp:cNvGraphicFramePr>
+            <a:graphic>
+              <a:graphicData uri="http://schemas.openxmlformats.org/drawingml/2006/picture">
+                <pic:pic>
+                  <pic:nvPicPr>
+                    <pic:cNvPr id="0" name="16-bericht.png"/>
+                    <pic:cNvPicPr/>
+                  </pic:nvPicPr>
+                  <pic:blipFill>
+                    <a:blip r:embed="rId22"/>
+                    <a:stretch>
+                      <a:fillRect/>
+                    </a:stretch>
+                  </pic:blipFill>
+                  <pic:spPr>
+                    <a:xfrm>
+                      <a:off x="0" y="0"/>
+                      <a:ext cx="2889504" cy="2697480"/>
+                    </a:xfrm>
+                    <a:prstGeom prst="rect"/>
+                  </pic:spPr>
+                </pic:pic>
+              </a:graphicData>
+            </a:graphic>
+          </wp:inline>
+        </w:drawing>
+      </w:r>
+    </w:p>
+    <w:p>
+      <w:pPr>
+        <w:pStyle w:val="Caption"/>
+      </w:pPr>
+      <w:r>
+        <w:rPr>
+          <w:b/>
+          <w:color w:val="141413"/>
+        </w:rPr>
+        <w:t xml:space="preserve">Abbildung </w:t>
       </w:r>
       <w:r>
         <w:rPr>
           <w:b/>
+          <w:color w:val="141413"/>
         </w:rPr>
-        <w:t>Schriftart übernehmen</w:t>
-      </w:r>
-      <w:r>
-        <w:t xml:space="preserve"> und </w:t>
+        <w:fldChar w:fldCharType="begin"/>
+        <w:instrText xml:space="preserve"> SEQ Abbildung \* ARABIC </w:instrText>
+        <w:fldChar w:fldCharType="separate"/>
       </w:r>
       <w:r>
         <w:rPr>
           <w:b/>
+          <w:color w:val="141413"/>
         </w:rPr>
-        <w:t>Schriftgröße übernehmen</w:t>
+        <w:t>1</w:t>
       </w:r>
       <w:r>
-        <w:t xml:space="preserve"> bekommen alle Formeln den Standard. Alte Formeln werden wie im alten Formel-Editor wissenschaftlich gesetzt, auch im Fließtext. Bei neuen Formeln bleibt die Darstellung (wissenschaftlich oder einzeilig) erhalten. Das Ergebnis öffnet sich als neues Dokument, das man mit „Speichern unter …“ sichert; das Original bleibt unverändert. Eine Übersicht zeigt danach Ausgangsformate, konvertierte Formeln und Probleme. Problemfälle sind gelb markiert und müssen neu eingegeben werden.</w:t>
+        <w:fldChar w:fldCharType="end"/>
+      </w:r>
+      <w:r>
+        <w:t>: Die Übersicht nach dem Konvertieren</w:t>
       </w:r>
     </w:p>
+    <w:p/>
     <w:p>
       <w:pPr>
         <w:pStyle w:val="ListBullet"/>
@@ -615,6 +2143,81 @@
         <w:t xml:space="preserve"> zählt die Formeln nach Format, Schrift und Schriftgröße. Ein Klick auf eine Zeile sucht genau diese Formeln.</w:t>
       </w:r>
     </w:p>
+    <w:p/>
+    <w:p>
+      <w:pPr>
+        <w:jc w:val="center"/>
+      </w:pPr>
+      <w:r>
+        <w:drawing>
+          <wp:inline xmlns:a="http://schemas.openxmlformats.org/drawingml/2006/main" xmlns:pic="http://schemas.openxmlformats.org/drawingml/2006/picture">
+            <wp:extent cx="2889504" cy="4873752"/>
+            <wp:docPr id="13" name="Picture 13"/>
+            <wp:cNvGraphicFramePr>
+              <a:graphicFrameLocks noChangeAspect="1"/>
+            </wp:cNvGraphicFramePr>
+            <a:graphic>
+              <a:graphicData uri="http://schemas.openxmlformats.org/drawingml/2006/picture">
+                <pic:pic>
+                  <pic:nvPicPr>
+                    <pic:cNvPr id="0" name="14-analyse.png"/>
+                    <pic:cNvPicPr/>
+                  </pic:nvPicPr>
+                  <pic:blipFill>
+                    <a:blip r:embed="rId23"/>
+                    <a:stretch>
+                      <a:fillRect/>
+                    </a:stretch>
+                  </pic:blipFill>
+                  <pic:spPr>
+                    <a:xfrm>
+                      <a:off x="0" y="0"/>
+                      <a:ext cx="2889504" cy="4873752"/>
+                    </a:xfrm>
+                    <a:prstGeom prst="rect"/>
+                  </pic:spPr>
+                </pic:pic>
+              </a:graphicData>
+            </a:graphic>
+          </wp:inline>
+        </w:drawing>
+      </w:r>
+    </w:p>
+    <w:p>
+      <w:pPr>
+        <w:pStyle w:val="Caption"/>
+      </w:pPr>
+      <w:r>
+        <w:rPr>
+          <w:b/>
+          <w:color w:val="141413"/>
+        </w:rPr>
+        <w:t xml:space="preserve">Abbildung </w:t>
+      </w:r>
+      <w:r>
+        <w:rPr>
+          <w:b/>
+          <w:color w:val="141413"/>
+        </w:rPr>
+        <w:fldChar w:fldCharType="begin"/>
+        <w:instrText xml:space="preserve"> SEQ Abbildung \* ARABIC </w:instrText>
+        <w:fldChar w:fldCharType="separate"/>
+      </w:r>
+      <w:r>
+        <w:rPr>
+          <w:b/>
+          <w:color w:val="141413"/>
+        </w:rPr>
+        <w:t>1</w:t>
+      </w:r>
+      <w:r>
+        <w:fldChar w:fldCharType="end"/>
+      </w:r>
+      <w:r>
+        <w:t>: Analyse der Formeln im Dokument</w:t>
+      </w:r>
+    </w:p>
+    <w:p/>
     <w:p>
       <w:pPr>
         <w:pStyle w:val="ListBullet"/>
@@ -626,7 +2229,7 @@
         <w:t>Formeln suchen:</w:t>
       </w:r>
       <w:r>
-        <w:t xml:space="preserve"> markiert passende Formeln im Dokument türkis. Mit </w:t>
+        <w:t xml:space="preserve"> markiert passende Formeln türkis. Mit </w:t>
       </w:r>
       <w:r>
         <w:rPr>
@@ -644,31 +2247,91 @@
         <w:t>Weiter</w:t>
       </w:r>
       <w:r>
-        <w:t xml:space="preserve"> springt man von Formel zu Formel, formatiert sie einzeln oder alle auf einmal im Standard und entfernt am Ende die Markierungen.</w:t>
+        <w:t xml:space="preserve"> springt man von Formel zu Formel, formatiert sie einzeln oder alle im Standard und entfernt am Ende die Markierungen.</w:t>
+      </w:r>
+    </w:p>
+    <w:p/>
+    <w:p>
+      <w:pPr>
+        <w:jc w:val="center"/>
+      </w:pPr>
+      <w:r>
+        <w:drawing>
+          <wp:inline xmlns:a="http://schemas.openxmlformats.org/drawingml/2006/main" xmlns:pic="http://schemas.openxmlformats.org/drawingml/2006/picture">
+            <wp:extent cx="3383280" cy="4800600"/>
+            <wp:docPr id="14" name="Picture 14"/>
+            <wp:cNvGraphicFramePr>
+              <a:graphicFrameLocks noChangeAspect="1"/>
+            </wp:cNvGraphicFramePr>
+            <a:graphic>
+              <a:graphicData uri="http://schemas.openxmlformats.org/drawingml/2006/picture">
+                <pic:pic>
+                  <pic:nvPicPr>
+                    <pic:cNvPr id="0" name="15-suche.png"/>
+                    <pic:cNvPicPr/>
+                  </pic:nvPicPr>
+                  <pic:blipFill>
+                    <a:blip r:embed="rId24"/>
+                    <a:stretch>
+                      <a:fillRect/>
+                    </a:stretch>
+                  </pic:blipFill>
+                  <pic:spPr>
+                    <a:xfrm>
+                      <a:off x="0" y="0"/>
+                      <a:ext cx="3383280" cy="4800600"/>
+                    </a:xfrm>
+                    <a:prstGeom prst="rect"/>
+                  </pic:spPr>
+                </pic:pic>
+              </a:graphicData>
+            </a:graphic>
+          </wp:inline>
+        </w:drawing>
       </w:r>
     </w:p>
     <w:p>
       <w:pPr>
-        <w:pStyle w:val="Heading2"/>
+        <w:pStyle w:val="Caption"/>
       </w:pPr>
       <w:r>
-        <w:t>Gut zu wissen</w:t>
+        <w:rPr>
+          <w:b/>
+          <w:color w:val="141413"/>
+        </w:rPr>
+        <w:t xml:space="preserve">Abbildung </w:t>
+      </w:r>
+      <w:r>
+        <w:rPr>
+          <w:b/>
+          <w:color w:val="141413"/>
+        </w:rPr>
+        <w:fldChar w:fldCharType="begin"/>
+        <w:instrText xml:space="preserve"> SEQ Abbildung \* ARABIC </w:instrText>
+        <w:fldChar w:fldCharType="separate"/>
+      </w:r>
+      <w:r>
+        <w:rPr>
+          <w:b/>
+          <w:color w:val="141413"/>
+        </w:rPr>
+        <w:t>1</w:t>
+      </w:r>
+      <w:r>
+        <w:fldChar w:fldCharType="end"/>
+      </w:r>
+      <w:r>
+        <w:t>: Suchen, blättern und formatieren</w:t>
       </w:r>
     </w:p>
+    <w:p/>
     <w:p>
       <w:pPr>
-        <w:pStyle w:val="ListBullet"/>
+        <w:pStyle w:val="Heading1"/>
+        <w:pageBreakBefore/>
       </w:pPr>
       <w:r>
-        <w:t>Die Formeln sind Vektorgrafiken. Sie bleiben beim Vergrößern und im Druck scharf.</w:t>
-      </w:r>
-    </w:p>
-    <w:p>
-      <w:pPr>
-        <w:pStyle w:val="ListBullet"/>
-      </w:pPr>
-      <w:r>
-        <w:t>Für das Einfügen braucht der Editor Internet, weil er die Schriften für den Formelsatz aus dem Netz lädt. Bereits eingefügte Formeln funktionieren im Dokument auch ohne Internet.</w:t>
+        <w:t>Version und Hilfe</w:t>
       </w:r>
     </w:p>
     <w:p>
@@ -680,8 +2343,9 @@
       </w:r>
     </w:p>
     <w:p>
+      <w:pPr/>
       <w:r>
-        <w:t xml:space="preserve">Unten im Editor stehen Name und Version, zum Beispiel „Papas Formeleditor · Version 1.4.0“. Das </w:t>
+        <w:t xml:space="preserve">Unten im Editor stehen Name und Version. Das </w:t>
       </w:r>
       <w:r>
         <w:rPr>
@@ -690,15 +2354,88 @@
         <w:t>Zahnrad</w:t>
       </w:r>
       <w:r>
-        <w:t xml:space="preserve"> daneben öffnet die Einrichtung. Sie vergleicht diese Version mit der aktuellen Version auf GitHub und bietet die Dokumentation zum Herunterladen an.</w:t>
+        <w:t xml:space="preserve"> daneben öffnet die Einrichtung.</w:t>
+      </w:r>
+    </w:p>
+    <w:p/>
+    <w:p>
+      <w:pPr>
+        <w:jc w:val="center"/>
+      </w:pPr>
+      <w:r>
+        <w:drawing>
+          <wp:inline xmlns:a="http://schemas.openxmlformats.org/drawingml/2006/main" xmlns:pic="http://schemas.openxmlformats.org/drawingml/2006/picture">
+            <wp:extent cx="3090672" cy="356616"/>
+            <wp:docPr id="15" name="Picture 15"/>
+            <wp:cNvGraphicFramePr>
+              <a:graphicFrameLocks noChangeAspect="1"/>
+            </wp:cNvGraphicFramePr>
+            <a:graphic>
+              <a:graphicData uri="http://schemas.openxmlformats.org/drawingml/2006/picture">
+                <pic:pic>
+                  <pic:nvPicPr>
+                    <pic:cNvPr id="0" name="11-fusszeile.png"/>
+                    <pic:cNvPicPr/>
+                  </pic:nvPicPr>
+                  <pic:blipFill>
+                    <a:blip r:embed="rId25"/>
+                    <a:stretch>
+                      <a:fillRect/>
+                    </a:stretch>
+                  </pic:blipFill>
+                  <pic:spPr>
+                    <a:xfrm>
+                      <a:off x="0" y="0"/>
+                      <a:ext cx="3090672" cy="356616"/>
+                    </a:xfrm>
+                    <a:prstGeom prst="rect"/>
+                  </pic:spPr>
+                </pic:pic>
+              </a:graphicData>
+            </a:graphic>
+          </wp:inline>
+        </w:drawing>
       </w:r>
     </w:p>
     <w:p>
       <w:pPr>
-        <w:pStyle w:val="ListBullet"/>
+        <w:pStyle w:val="Caption"/>
       </w:pPr>
       <w:r>
-        <w:t xml:space="preserve">Gibt es eine neuere Version, erscheint beim Start oben ein blauer Hinweis. In der Einrichtung fragt der Editor dann „Jetzt aktualisieren?“. Mit </w:t>
+        <w:rPr>
+          <w:b/>
+          <w:color w:val="141413"/>
+        </w:rPr>
+        <w:t xml:space="preserve">Abbildung </w:t>
+      </w:r>
+      <w:r>
+        <w:rPr>
+          <w:b/>
+          <w:color w:val="141413"/>
+        </w:rPr>
+        <w:fldChar w:fldCharType="begin"/>
+        <w:instrText xml:space="preserve"> SEQ Abbildung \* ARABIC </w:instrText>
+        <w:fldChar w:fldCharType="separate"/>
+      </w:r>
+      <w:r>
+        <w:rPr>
+          <w:b/>
+          <w:color w:val="141413"/>
+        </w:rPr>
+        <w:t>1</w:t>
+      </w:r>
+      <w:r>
+        <w:fldChar w:fldCharType="end"/>
+      </w:r>
+      <w:r>
+        <w:t>: Die Fußzeile mit Version und Zahnrad</w:t>
+      </w:r>
+    </w:p>
+    <w:p/>
+    <w:p>
+      <w:pPr/>
+      <w:r>
+        <w:t xml:space="preserve">Die Einrichtung vergleicht die Version mit der neuesten. Gibt es eine neuere, erscheint beim Start oben ein blauer Hinweis. Mit </w:t>
       </w:r>
       <w:r>
         <w:rPr>
@@ -707,27 +2444,8 @@
         <w:t>Ja, jetzt aktualisieren</w:t>
       </w:r>
       <w:r>
-        <w:t xml:space="preserve"> lädt er sich neu und holt dabei die neuen Dateien von GitHub. Eine gerade eingegebene, noch nicht eingefügte Formel geht dabei verloren.</w:t>
+        <w:t xml:space="preserve"> holt sich der Editor die neue Version. Eine noch nicht eingefügte Formel geht dabei verloren. </w:t>
       </w:r>
-    </w:p>
-    <w:p>
-      <w:pPr>
-        <w:pStyle w:val="ListBullet"/>
-      </w:pPr>
-      <w:r>
-        <w:rPr>
-          <w:b/>
-        </w:rPr>
-        <w:t>Editor neu laden</w:t>
-      </w:r>
-      <w:r>
-        <w:t xml:space="preserve"> lädt den Editor auch ohne neue Version frisch von GitHub.</w:t>
-      </w:r>
-    </w:p>
-    <w:p>
-      <w:pPr>
-        <w:pStyle w:val="ListBullet"/>
-      </w:pPr>
       <w:r>
         <w:rPr>
           <w:b/>
@@ -735,77 +2453,546 @@
         <w:t>Dokumentation herunterladen</w:t>
       </w:r>
       <w:r>
-        <w:t xml:space="preserve"> öffnet diese Anleitung als Word-Datei im Browser.</w:t>
+        <w:t xml:space="preserve"> öffnet diese Anleitung.</w:t>
+      </w:r>
+    </w:p>
+    <w:p/>
+    <w:p>
+      <w:pPr>
+        <w:jc w:val="center"/>
+      </w:pPr>
+      <w:r>
+        <w:drawing>
+          <wp:inline xmlns:a="http://schemas.openxmlformats.org/drawingml/2006/main" xmlns:pic="http://schemas.openxmlformats.org/drawingml/2006/picture">
+            <wp:extent cx="3163824" cy="4215384"/>
+            <wp:docPr id="16" name="Picture 16"/>
+            <wp:cNvGraphicFramePr>
+              <a:graphicFrameLocks noChangeAspect="1"/>
+            </wp:cNvGraphicFramePr>
+            <a:graphic>
+              <a:graphicData uri="http://schemas.openxmlformats.org/drawingml/2006/picture">
+                <pic:pic>
+                  <pic:nvPicPr>
+                    <pic:cNvPr id="0" name="12-einrichtung.png"/>
+                    <pic:cNvPicPr/>
+                  </pic:nvPicPr>
+                  <pic:blipFill>
+                    <a:blip r:embed="rId26"/>
+                    <a:stretch>
+                      <a:fillRect/>
+                    </a:stretch>
+                  </pic:blipFill>
+                  <pic:spPr>
+                    <a:xfrm>
+                      <a:off x="0" y="0"/>
+                      <a:ext cx="3163824" cy="4215384"/>
+                    </a:xfrm>
+                    <a:prstGeom prst="rect"/>
+                  </pic:spPr>
+                </pic:pic>
+              </a:graphicData>
+            </a:graphic>
+          </wp:inline>
+        </w:drawing>
       </w:r>
     </w:p>
     <w:p>
       <w:pPr>
-        <w:pStyle w:val="ListBullet"/>
+        <w:pStyle w:val="Caption"/>
       </w:pPr>
       <w:r>
-        <w:t>Die Einrichtungsdatei aus Schritt 1 muss für ein Update nicht neu geladen werden. Nur wenn sich der Name des Knopfs im Reiter Start ändern soll, Schritt 1 einmal wiederholen.</w:t>
+        <w:rPr>
+          <w:b/>
+          <w:color w:val="141413"/>
+        </w:rPr>
+        <w:t xml:space="preserve">Abbildung </w:t>
+      </w:r>
+      <w:r>
+        <w:rPr>
+          <w:b/>
+          <w:color w:val="141413"/>
+        </w:rPr>
+        <w:fldChar w:fldCharType="begin"/>
+        <w:instrText xml:space="preserve"> SEQ Abbildung \* ARABIC </w:instrText>
+        <w:fldChar w:fldCharType="separate"/>
+      </w:r>
+      <w:r>
+        <w:rPr>
+          <w:b/>
+          <w:color w:val="141413"/>
+        </w:rPr>
+        <w:t>1</w:t>
+      </w:r>
+      <w:r>
+        <w:fldChar w:fldCharType="end"/>
+      </w:r>
+      <w:r>
+        <w:t>: Die Einrichtung mit Versionsprüfung</w:t>
       </w:r>
     </w:p>
-    <w:p>
-      <w:r>
-        <w:t>Zeigt der Editor gar keine Versionsnummer an, läuft noch eine ältere Fassung aus dem Zwischenspeicher von Word. Dann Word mit ⌘Q beenden und neu starten. Hilft das nicht, bei beendetem Word diese Zeile im Terminal ausführen und Word wieder starten:</w:t>
-      </w:r>
-    </w:p>
-    <w:p>
-      <w:r>
-        <w:rPr>
-          <w:rFonts w:ascii="Menlo" w:hAnsi="Menlo"/>
-          <w:sz w:val="19"/>
-        </w:rPr>
-        <w:t>rm -rf ~/Library/Containers/com.microsoft.Word/Data/Library/Caches/* ~/Library/Containers/com.microsoft.Word/Data/Library/Application\ Support/Microsoft/Office/16.0/Wef/*</w:t>
-      </w:r>
-    </w:p>
-    <w:p>
-      <w:r>
-        <w:t>Sie löscht nur den Zwischenspeicher der Word-Add-ins, nicht die Einrichtungsdatei und keine Dokumente.</w:t>
-      </w:r>
-    </w:p>
+    <w:p/>
     <w:p>
       <w:pPr>
         <w:pStyle w:val="Heading2"/>
       </w:pPr>
       <w:r>
-        <w:t>Wieder entfernen</w:t>
+        <w:t>Wenn etwas nicht klappt</w:t>
       </w:r>
     </w:p>
+    <w:p/>
+    <w:tbl>
+      <w:tblGrid>
+        <w:gridCol w:w="4008"/>
+        <w:gridCol w:w="5064"/>
+      </w:tblGrid>
+      <w:tblPr>
+        <w:tblLook w:firstColumn="1" w:firstRow="1" w:lastColumn="0" w:lastRow="0" w:noHBand="0" w:noVBand="1" w:val="04A0"/>
+        <w:tblW w:w="9072" w:type="dxa"/>
+        <w:tblLayout w:type="fixed"/>
+      </w:tblPr>
+      <w:tr>
+        <w:tc>
+          <w:tcPr>
+            <w:tcBorders>
+              <w:top w:val="single" w:sz="4" w:space="0" w:color="DAD6C9"/>
+              <w:left w:val="single" w:sz="4" w:space="0" w:color="DAD6C9"/>
+              <w:bottom w:val="single" w:sz="12" w:space="0" w:color="CC785C"/>
+              <w:right w:val="single" w:sz="4" w:space="0" w:color="DAD6C9"/>
+            </w:tcBorders>
+            <w:tcMar>
+              <w:top w:w="60" w:type="dxa"/>
+              <w:bottom w:w="60" w:type="dxa"/>
+              <w:left w:w="110" w:type="dxa"/>
+              <w:right w:w="110" w:type="dxa"/>
+            </w:tcMar>
+            <w:shd w:val="clear" w:color="auto" w:fill="F0EDE4"/>
+            <w:tcW w:w="4008" w:type="dxa"/>
+          </w:tcPr>
+          <w:p>
+            <w:pPr>
+              <w:spacing w:after="40" w:before="40" w:line="240" w:lineRule="auto"/>
+            </w:pPr>
+            <w:r>
+              <w:rPr>
+                <w:b/>
+                <w:color w:val="141413"/>
+              </w:rPr>
+              <w:t>Was passiert</w:t>
+            </w:r>
+          </w:p>
+        </w:tc>
+        <w:tc>
+          <w:tcPr>
+            <w:tcBorders>
+              <w:top w:val="single" w:sz="4" w:space="0" w:color="DAD6C9"/>
+              <w:left w:val="single" w:sz="4" w:space="0" w:color="DAD6C9"/>
+              <w:bottom w:val="single" w:sz="12" w:space="0" w:color="CC785C"/>
+              <w:right w:val="single" w:sz="4" w:space="0" w:color="DAD6C9"/>
+            </w:tcBorders>
+            <w:tcMar>
+              <w:top w:w="60" w:type="dxa"/>
+              <w:bottom w:w="60" w:type="dxa"/>
+              <w:left w:w="110" w:type="dxa"/>
+              <w:right w:w="110" w:type="dxa"/>
+            </w:tcMar>
+            <w:shd w:val="clear" w:color="auto" w:fill="F0EDE4"/>
+            <w:tcW w:w="5064" w:type="dxa"/>
+          </w:tcPr>
+          <w:p>
+            <w:pPr>
+              <w:spacing w:after="40" w:before="40" w:line="240" w:lineRule="auto"/>
+            </w:pPr>
+            <w:r>
+              <w:rPr>
+                <w:b/>
+                <w:color w:val="141413"/>
+              </w:rPr>
+              <w:t>Was hilft</w:t>
+            </w:r>
+          </w:p>
+        </w:tc>
+      </w:tr>
+      <w:tr>
+        <w:tc>
+          <w:tcPr>
+            <w:tcBorders>
+              <w:top w:val="single" w:sz="4" w:space="0" w:color="DAD6C9"/>
+              <w:left w:val="single" w:sz="4" w:space="0" w:color="DAD6C9"/>
+              <w:bottom w:val="single" w:sz="4" w:space="0" w:color="DAD6C9"/>
+              <w:right w:val="single" w:sz="4" w:space="0" w:color="DAD6C9"/>
+            </w:tcBorders>
+            <w:tcMar>
+              <w:top w:w="60" w:type="dxa"/>
+              <w:bottom w:w="60" w:type="dxa"/>
+              <w:left w:w="110" w:type="dxa"/>
+              <w:right w:w="110" w:type="dxa"/>
+            </w:tcMar>
+            <w:tcW w:w="4008" w:type="dxa"/>
+          </w:tcPr>
+          <w:p>
+            <w:pPr>
+              <w:spacing w:after="40" w:before="40" w:line="240" w:lineRule="auto"/>
+            </w:pPr>
+            <w:r>
+              <w:t>Der Knopf Formeleditor fehlt</w:t>
+            </w:r>
+          </w:p>
+        </w:tc>
+        <w:tc>
+          <w:tcPr>
+            <w:tcBorders>
+              <w:top w:val="single" w:sz="4" w:space="0" w:color="DAD6C9"/>
+              <w:left w:val="single" w:sz="4" w:space="0" w:color="DAD6C9"/>
+              <w:bottom w:val="single" w:sz="4" w:space="0" w:color="DAD6C9"/>
+              <w:right w:val="single" w:sz="4" w:space="0" w:color="DAD6C9"/>
+            </w:tcBorders>
+            <w:tcMar>
+              <w:top w:w="60" w:type="dxa"/>
+              <w:bottom w:w="60" w:type="dxa"/>
+              <w:left w:w="110" w:type="dxa"/>
+              <w:right w:w="110" w:type="dxa"/>
+            </w:tcMar>
+            <w:tcW w:w="5064" w:type="dxa"/>
+          </w:tcPr>
+          <w:p>
+            <w:pPr>
+              <w:spacing w:after="40" w:before="40" w:line="240" w:lineRule="auto"/>
+            </w:pPr>
+            <w:r>
+              <w:t>Word ganz beenden (⌘Q) und neu starten</w:t>
+            </w:r>
+          </w:p>
+        </w:tc>
+      </w:tr>
+      <w:tr>
+        <w:tc>
+          <w:tcPr>
+            <w:tcBorders>
+              <w:top w:val="single" w:sz="4" w:space="0" w:color="DAD6C9"/>
+              <w:left w:val="single" w:sz="4" w:space="0" w:color="DAD6C9"/>
+              <w:bottom w:val="single" w:sz="4" w:space="0" w:color="DAD6C9"/>
+              <w:right w:val="single" w:sz="4" w:space="0" w:color="DAD6C9"/>
+            </w:tcBorders>
+            <w:tcMar>
+              <w:top w:w="60" w:type="dxa"/>
+              <w:bottom w:w="60" w:type="dxa"/>
+              <w:left w:w="110" w:type="dxa"/>
+              <w:right w:w="110" w:type="dxa"/>
+            </w:tcMar>
+            <w:tcW w:w="4008" w:type="dxa"/>
+          </w:tcPr>
+          <w:p>
+            <w:pPr>
+              <w:spacing w:after="40" w:before="40" w:line="240" w:lineRule="auto"/>
+            </w:pPr>
+            <w:r>
+              <w:t>Der Editor bleibt leer oder lädt nicht</w:t>
+            </w:r>
+          </w:p>
+        </w:tc>
+        <w:tc>
+          <w:tcPr>
+            <w:tcBorders>
+              <w:top w:val="single" w:sz="4" w:space="0" w:color="DAD6C9"/>
+              <w:left w:val="single" w:sz="4" w:space="0" w:color="DAD6C9"/>
+              <w:bottom w:val="single" w:sz="4" w:space="0" w:color="DAD6C9"/>
+              <w:right w:val="single" w:sz="4" w:space="0" w:color="DAD6C9"/>
+            </w:tcBorders>
+            <w:tcMar>
+              <w:top w:w="60" w:type="dxa"/>
+              <w:bottom w:w="60" w:type="dxa"/>
+              <w:left w:w="110" w:type="dxa"/>
+              <w:right w:w="110" w:type="dxa"/>
+            </w:tcMar>
+            <w:tcW w:w="5064" w:type="dxa"/>
+          </w:tcPr>
+          <w:p>
+            <w:pPr>
+              <w:spacing w:after="40" w:before="40" w:line="240" w:lineRule="auto"/>
+            </w:pPr>
+            <w:r>
+              <w:t>Internet prüfen, Editor schließen und neu öffnen</w:t>
+            </w:r>
+          </w:p>
+        </w:tc>
+      </w:tr>
+      <w:tr>
+        <w:tc>
+          <w:tcPr>
+            <w:tcBorders>
+              <w:top w:val="single" w:sz="4" w:space="0" w:color="DAD6C9"/>
+              <w:left w:val="single" w:sz="4" w:space="0" w:color="DAD6C9"/>
+              <w:bottom w:val="single" w:sz="4" w:space="0" w:color="DAD6C9"/>
+              <w:right w:val="single" w:sz="4" w:space="0" w:color="DAD6C9"/>
+            </w:tcBorders>
+            <w:tcMar>
+              <w:top w:w="60" w:type="dxa"/>
+              <w:bottom w:w="60" w:type="dxa"/>
+              <w:left w:w="110" w:type="dxa"/>
+              <w:right w:w="110" w:type="dxa"/>
+            </w:tcMar>
+            <w:tcW w:w="4008" w:type="dxa"/>
+          </w:tcPr>
+          <w:p>
+            <w:pPr>
+              <w:spacing w:after="40" w:before="40" w:line="240" w:lineRule="auto"/>
+            </w:pPr>
+            <w:r>
+              <w:t>Die angeklickte Formel erscheint nicht</w:t>
+            </w:r>
+          </w:p>
+        </w:tc>
+        <w:tc>
+          <w:tcPr>
+            <w:tcBorders>
+              <w:top w:val="single" w:sz="4" w:space="0" w:color="DAD6C9"/>
+              <w:left w:val="single" w:sz="4" w:space="0" w:color="DAD6C9"/>
+              <w:bottom w:val="single" w:sz="4" w:space="0" w:color="DAD6C9"/>
+              <w:right w:val="single" w:sz="4" w:space="0" w:color="DAD6C9"/>
+            </w:tcBorders>
+            <w:tcMar>
+              <w:top w:w="60" w:type="dxa"/>
+              <w:bottom w:w="60" w:type="dxa"/>
+              <w:left w:w="110" w:type="dxa"/>
+              <w:right w:w="110" w:type="dxa"/>
+            </w:tcMar>
+            <w:tcW w:w="5064" w:type="dxa"/>
+          </w:tcPr>
+          <w:p>
+            <w:pPr>
+              <w:spacing w:after="40" w:before="40" w:line="240" w:lineRule="auto"/>
+            </w:pPr>
+            <w:r>
+              <w:t>Formel noch einmal anklicken</w:t>
+            </w:r>
+          </w:p>
+        </w:tc>
+      </w:tr>
+      <w:tr>
+        <w:tc>
+          <w:tcPr>
+            <w:tcBorders>
+              <w:top w:val="single" w:sz="4" w:space="0" w:color="DAD6C9"/>
+              <w:left w:val="single" w:sz="4" w:space="0" w:color="DAD6C9"/>
+              <w:bottom w:val="single" w:sz="4" w:space="0" w:color="DAD6C9"/>
+              <w:right w:val="single" w:sz="4" w:space="0" w:color="DAD6C9"/>
+            </w:tcBorders>
+            <w:tcMar>
+              <w:top w:w="60" w:type="dxa"/>
+              <w:bottom w:w="60" w:type="dxa"/>
+              <w:left w:w="110" w:type="dxa"/>
+              <w:right w:w="110" w:type="dxa"/>
+            </w:tcMar>
+            <w:tcW w:w="4008" w:type="dxa"/>
+          </w:tcPr>
+          <w:p>
+            <w:pPr>
+              <w:spacing w:after="40" w:before="40" w:line="240" w:lineRule="auto"/>
+            </w:pPr>
+            <w:r>
+              <w:t>Eine Formel ist zu klein</w:t>
+            </w:r>
+          </w:p>
+        </w:tc>
+        <w:tc>
+          <w:tcPr>
+            <w:tcBorders>
+              <w:top w:val="single" w:sz="4" w:space="0" w:color="DAD6C9"/>
+              <w:left w:val="single" w:sz="4" w:space="0" w:color="DAD6C9"/>
+              <w:bottom w:val="single" w:sz="4" w:space="0" w:color="DAD6C9"/>
+              <w:right w:val="single" w:sz="4" w:space="0" w:color="DAD6C9"/>
+            </w:tcBorders>
+            <w:tcMar>
+              <w:top w:w="60" w:type="dxa"/>
+              <w:bottom w:w="60" w:type="dxa"/>
+              <w:left w:w="110" w:type="dxa"/>
+              <w:right w:w="110" w:type="dxa"/>
+            </w:tcMar>
+            <w:tcW w:w="5064" w:type="dxa"/>
+          </w:tcPr>
+          <w:p>
+            <w:pPr>
+              <w:spacing w:after="40" w:before="40" w:line="240" w:lineRule="auto"/>
+            </w:pPr>
+            <w:r>
+              <w:t>Größere Schriftgröße wählen und ersetzen</w:t>
+            </w:r>
+          </w:p>
+        </w:tc>
+      </w:tr>
+      <w:tr>
+        <w:tc>
+          <w:tcPr>
+            <w:tcBorders>
+              <w:top w:val="single" w:sz="4" w:space="0" w:color="DAD6C9"/>
+              <w:left w:val="single" w:sz="4" w:space="0" w:color="DAD6C9"/>
+              <w:bottom w:val="single" w:sz="4" w:space="0" w:color="DAD6C9"/>
+              <w:right w:val="single" w:sz="4" w:space="0" w:color="DAD6C9"/>
+            </w:tcBorders>
+            <w:tcMar>
+              <w:top w:w="60" w:type="dxa"/>
+              <w:bottom w:w="60" w:type="dxa"/>
+              <w:left w:w="110" w:type="dxa"/>
+              <w:right w:w="110" w:type="dxa"/>
+            </w:tcMar>
+            <w:tcW w:w="4008" w:type="dxa"/>
+          </w:tcPr>
+          <w:p>
+            <w:pPr>
+              <w:spacing w:after="40" w:before="40" w:line="240" w:lineRule="auto"/>
+            </w:pPr>
+            <w:r>
+              <w:t>Die Knöpfe stehen in zwei Reihen</w:t>
+            </w:r>
+          </w:p>
+        </w:tc>
+        <w:tc>
+          <w:tcPr>
+            <w:tcBorders>
+              <w:top w:val="single" w:sz="4" w:space="0" w:color="DAD6C9"/>
+              <w:left w:val="single" w:sz="4" w:space="0" w:color="DAD6C9"/>
+              <w:bottom w:val="single" w:sz="4" w:space="0" w:color="DAD6C9"/>
+              <w:right w:val="single" w:sz="4" w:space="0" w:color="DAD6C9"/>
+            </w:tcBorders>
+            <w:tcMar>
+              <w:top w:w="60" w:type="dxa"/>
+              <w:bottom w:w="60" w:type="dxa"/>
+              <w:left w:w="110" w:type="dxa"/>
+              <w:right w:w="110" w:type="dxa"/>
+            </w:tcMar>
+            <w:tcW w:w="5064" w:type="dxa"/>
+          </w:tcPr>
+          <w:p>
+            <w:pPr>
+              <w:spacing w:after="40" w:before="40" w:line="240" w:lineRule="auto"/>
+            </w:pPr>
+            <w:r>
+              <w:t>Die Editorspalte breiter ziehen</w:t>
+            </w:r>
+          </w:p>
+        </w:tc>
+      </w:tr>
+    </w:tbl>
     <w:p>
+      <w:pPr>
+        <w:pStyle w:val="Caption"/>
+      </w:pPr>
       <w:r>
-        <w:t xml:space="preserve">Die Datei </w:t>
+        <w:rPr>
+          <w:b/>
+          <w:color w:val="141413"/>
+        </w:rPr>
+        <w:t xml:space="preserve">Tabelle </w:t>
       </w:r>
       <w:r>
         <w:rPr>
-          <w:rFonts w:ascii="Menlo" w:hAnsi="Menlo"/>
-          <w:sz w:val="21"/>
+          <w:b/>
+          <w:color w:val="141413"/>
         </w:rPr>
-        <w:t>formeleditor.xml</w:t>
-      </w:r>
-      <w:r>
-        <w:t xml:space="preserve"> aus dem Ordner </w:t>
+        <w:fldChar w:fldCharType="begin"/>
+        <w:instrText xml:space="preserve"> SEQ Tabelle \* ARABIC </w:instrText>
+        <w:fldChar w:fldCharType="separate"/>
       </w:r>
       <w:r>
         <w:rPr>
-          <w:rFonts w:ascii="Menlo" w:hAnsi="Menlo"/>
-          <w:sz w:val="21"/>
+          <w:b/>
+          <w:color w:val="141413"/>
         </w:rPr>
-        <w:t>~/Library/Containers/com.microsoft.Word/Data/Documents/wef</w:t>
+        <w:t>1</w:t>
       </w:r>
       <w:r>
-        <w:t xml:space="preserve"> löschen und Word neu starten.</w:t>
+        <w:fldChar w:fldCharType="end"/>
+      </w:r>
+      <w:r>
+        <w:t>: Kleine Hilfe bei Problemen</w:t>
+      </w:r>
+    </w:p>
+    <w:p/>
+    <w:p>
+      <w:pPr/>
+      <w:r>
+        <w:t>Für die Formeln im Dokument braucht Word kein Internet. Nur der Editor lädt seine Schriften aus dem Netz. Den Alternativtext einer Formel bitte nicht von Hand ändern, denn darin merkt sich der Editor die Formel für spätere Änderungen.</w:t>
       </w:r>
     </w:p>
     <w:sectPr>
-      <w:pgSz w:w="12240" w:h="15840"/>
-      <w:pgMar w:top="1440" w:right="1800" w:bottom="1440" w:left="1800" w:header="720" w:footer="720" w:gutter="0"/>
+      <w:headerReference w:type="default" r:id="rId9"/>
+      <w:footerReference w:type="default" r:id="rId10"/>
+      <w:pgSz w:w="11906" w:h="16838"/>
+      <w:pgMar w:top="1417" w:right="1417" w:bottom="1417" w:left="1417" w:header="794" w:footer="794" w:gutter="0"/>
       <w:cols w:space="720"/>
       <w:docGrid w:linePitch="360"/>
     </w:sectPr>
   </w:body>
 </w:document>
+</file>
+
+<file path=word/footer1.xml><?xml version="1.0" encoding="utf-8"?>
+<w:ftr xmlns:m="http://schemas.openxmlformats.org/officeDocument/2006/math" xmlns:mc="http://schemas.openxmlformats.org/markup-compatibility/2006" xmlns:mo="http://schemas.microsoft.com/office/mac/office/2008/main" xmlns:mv="urn:schemas-microsoft-com:mac:vml" xmlns:o="urn:schemas-microsoft-com:office:office" xmlns:r="http://schemas.openxmlformats.org/officeDocument/2006/relationships" xmlns:v="urn:schemas-microsoft-com:vml" xmlns:w10="urn:schemas-microsoft-com:office:word" xmlns:w14="http://schemas.microsoft.com/office/word/2010/wordml" xmlns:w="http://schemas.openxmlformats.org/wordprocessingml/2006/main" xmlns:wne="http://schemas.microsoft.com/office/word/2006/wordml" xmlns:wp14="http://schemas.microsoft.com/office/word/2010/wordprocessingDrawing" xmlns:wp="http://schemas.openxmlformats.org/drawingml/2006/wordprocessingDrawing" xmlns:wpc="http://schemas.microsoft.com/office/word/2010/wordprocessingCanvas" xmlns:wpg="http://schemas.microsoft.com/office/word/2010/wordprocessingGroup" xmlns:wpi="http://schemas.microsoft.com/office/word/2010/wordprocessingInk" xmlns:wps="http://schemas.microsoft.com/office/word/2010/wordprocessingShape" mc:Ignorable="w14 wp14">
+  <w:p>
+    <w:pPr>
+      <w:pStyle w:val="Footer"/>
+      <w:jc w:val="right"/>
+    </w:pPr>
+    <w:r/>
+    <w:r>
+      <w:rPr>
+        <w:rFonts w:ascii="Fira Sans" w:hAnsi="Fira Sans"/>
+        <w:color w:val="8C887E"/>
+        <w:sz w:val="17"/>
+      </w:rPr>
+      <w:t xml:space="preserve">Seite </w:t>
+    </w:r>
+    <w:r>
+      <w:rPr>
+        <w:rFonts w:ascii="Fira Sans" w:hAnsi="Fira Sans"/>
+        <w:color w:val="8C887E"/>
+        <w:sz w:val="17"/>
+      </w:rPr>
+      <w:fldChar w:fldCharType="begin"/>
+      <w:instrText xml:space="preserve">PAGE</w:instrText>
+      <w:fldChar w:fldCharType="end"/>
+    </w:r>
+    <w:r>
+      <w:rPr>
+        <w:rFonts w:ascii="Fira Sans" w:hAnsi="Fira Sans"/>
+        <w:color w:val="8C887E"/>
+        <w:sz w:val="17"/>
+      </w:rPr>
+      <w:t xml:space="preserve"> von </w:t>
+    </w:r>
+    <w:r>
+      <w:rPr>
+        <w:rFonts w:ascii="Fira Sans" w:hAnsi="Fira Sans"/>
+        <w:color w:val="8C887E"/>
+        <w:sz w:val="17"/>
+      </w:rPr>
+      <w:fldChar w:fldCharType="begin"/>
+      <w:instrText xml:space="preserve">NUMPAGES</w:instrText>
+      <w:fldChar w:fldCharType="end"/>
+    </w:r>
+  </w:p>
+</w:ftr>
+</file>
+
+<file path=word/header1.xml><?xml version="1.0" encoding="utf-8"?>
+<w:hdr xmlns:m="http://schemas.openxmlformats.org/officeDocument/2006/math" xmlns:mc="http://schemas.openxmlformats.org/markup-compatibility/2006" xmlns:mo="http://schemas.microsoft.com/office/mac/office/2008/main" xmlns:mv="urn:schemas-microsoft-com:mac:vml" xmlns:o="urn:schemas-microsoft-com:office:office" xmlns:r="http://schemas.openxmlformats.org/officeDocument/2006/relationships" xmlns:v="urn:schemas-microsoft-com:vml" xmlns:w10="urn:schemas-microsoft-com:office:word" xmlns:w14="http://schemas.microsoft.com/office/word/2010/wordml" xmlns:w="http://schemas.openxmlformats.org/wordprocessingml/2006/main" xmlns:wne="http://schemas.microsoft.com/office/word/2006/wordml" xmlns:wp14="http://schemas.microsoft.com/office/word/2010/wordprocessingDrawing" xmlns:wp="http://schemas.openxmlformats.org/drawingml/2006/wordprocessingDrawing" xmlns:wpc="http://schemas.microsoft.com/office/word/2010/wordprocessingCanvas" xmlns:wpg="http://schemas.microsoft.com/office/word/2010/wordprocessingGroup" xmlns:wpi="http://schemas.microsoft.com/office/word/2010/wordprocessingInk" xmlns:wps="http://schemas.microsoft.com/office/word/2010/wordprocessingShape" mc:Ignorable="w14 wp14">
+  <w:p>
+    <w:pPr>
+      <w:pStyle w:val="Header"/>
+      <w:pBdr>
+        <w:bottom w:val="single" w:sz="4" w:space="4" w:color="CC785C"/>
+      </w:pBdr>
+    </w:pPr>
+    <w:r>
+      <w:rPr>
+        <w:rFonts w:ascii="Fira Sans" w:hAnsi="Fira Sans"/>
+        <w:color w:val="8C887E"/>
+        <w:sz w:val="17"/>
+      </w:rPr>
+      <w:t>Papas Formeleditor</w:t>
+    </w:r>
+  </w:p>
+</w:hdr>
 </file>
 
 <file path=word/numbering.xml><?xml version="1.0" encoding="utf-8"?>
@@ -1171,9 +3358,13 @@
     <w:name w:val="Normal"/>
     <w:qFormat/>
     <w:rsid w:val="00FC693F"/>
+    <w:pPr>
+      <w:spacing w:after="180" w:line="348" w:lineRule="auto"/>
+    </w:pPr>
     <w:rPr>
-      <w:rFonts w:ascii="Helvetica Neue" w:hAnsi="Helvetica Neue"/>
-      <w:sz w:val="24"/>
+      <w:rFonts w:ascii="Fira Sans" w:hAnsi="Fira Sans" w:cs="Fira Sans"/>
+      <w:color w:val="201E1A"/>
+      <w:sz w:val="21"/>
     </w:rPr>
   </w:style>
   <w:style w:type="paragraph" w:styleId="Header">
@@ -1231,15 +3422,18 @@
     <w:pPr>
       <w:keepNext/>
       <w:keepLines/>
-      <w:spacing w:before="480" w:after="0"/>
+      <w:spacing w:before="360" w:after="120" w:line="269" w:lineRule="auto"/>
       <w:outlineLvl w:val="0"/>
+      <w:pBdr>
+        <w:bottom w:val="single" w:sz="8" w:space="6" w:color="CC785C"/>
+      </w:pBdr>
     </w:pPr>
     <w:rPr>
-      <w:rFonts w:asciiTheme="majorHAnsi" w:eastAsiaTheme="majorEastAsia" w:hAnsiTheme="majorHAnsi" w:cstheme="majorBidi" w:ascii="Helvetica Neue" w:hAnsi="Helvetica Neue"/>
+      <w:rFonts w:asciiTheme="majorHAnsi" w:eastAsiaTheme="majorEastAsia" w:hAnsiTheme="majorHAnsi" w:cstheme="majorBidi" w:ascii="Source Serif 4" w:hAnsi="Source Serif 4" w:cs="Source Serif 4"/>
       <w:b/>
       <w:bCs/>
-      <w:color w:val="23468F"/>
-      <w:sz w:val="40"/>
+      <w:color w:val="141413"/>
+      <w:sz w:val="34"/>
       <w:szCs w:val="28"/>
     </w:rPr>
   </w:style>
@@ -1255,15 +3449,15 @@
     <w:pPr>
       <w:keepNext/>
       <w:keepLines/>
-      <w:spacing w:before="200" w:after="0"/>
+      <w:spacing w:before="260" w:after="80" w:line="269" w:lineRule="auto"/>
       <w:outlineLvl w:val="1"/>
     </w:pPr>
     <w:rPr>
-      <w:rFonts w:asciiTheme="majorHAnsi" w:eastAsiaTheme="majorEastAsia" w:hAnsiTheme="majorHAnsi" w:cstheme="majorBidi" w:ascii="Helvetica Neue" w:hAnsi="Helvetica Neue"/>
+      <w:rFonts w:asciiTheme="majorHAnsi" w:eastAsiaTheme="majorEastAsia" w:hAnsiTheme="majorHAnsi" w:cstheme="majorBidi" w:ascii="Source Serif 4" w:hAnsi="Source Serif 4" w:cs="Source Serif 4"/>
       <w:b/>
       <w:bCs/>
-      <w:color w:val="23468F"/>
-      <w:sz w:val="30"/>
+      <w:color w:val="CC785C"/>
+      <w:sz w:val="27"/>
       <w:szCs w:val="26"/>
     </w:rPr>
   </w:style>
@@ -1279,14 +3473,15 @@
     <w:pPr>
       <w:keepNext/>
       <w:keepLines/>
-      <w:spacing w:before="200" w:after="0"/>
+      <w:spacing w:before="200" w:after="60" w:line="288" w:lineRule="auto"/>
       <w:outlineLvl w:val="2"/>
     </w:pPr>
     <w:rPr>
-      <w:rFonts w:asciiTheme="majorHAnsi" w:eastAsiaTheme="majorEastAsia" w:hAnsiTheme="majorHAnsi" w:cstheme="majorBidi"/>
-      <w:b/>
+      <w:rFonts w:asciiTheme="majorHAnsi" w:eastAsiaTheme="majorEastAsia" w:hAnsiTheme="majorHAnsi" w:cstheme="majorBidi" w:ascii="Fira Sans SemiBold" w:hAnsi="Fira Sans SemiBold" w:cs="Fira Sans SemiBold"/>
+      <w:b w:val="0"/>
       <w:bCs/>
-      <w:color w:val="4F81BD" w:themeColor="accent1"/>
+      <w:color w:val="201E1A"/>
+      <w:sz w:val="23"/>
     </w:rPr>
   </w:style>
   <w:style w:type="paragraph" w:styleId="Heading4">
@@ -1520,15 +3715,19 @@
       <w:pBdr>
         <w:bottom w:val="single" w:sz="8" w:space="4" w:color="4F81BD" w:themeColor="accent1"/>
       </w:pBdr>
-      <w:spacing w:after="300" w:line="240" w:lineRule="auto"/>
+      <w:spacing w:after="80" w:line="259" w:lineRule="auto" w:before="0"/>
       <w:contextualSpacing/>
+      <w:pBdr>
+        <w:bottom w:val="single" w:sz="18" w:space="8" w:color="CC785C"/>
+      </w:pBdr>
     </w:pPr>
     <w:rPr>
-      <w:rFonts w:asciiTheme="majorHAnsi" w:eastAsiaTheme="majorEastAsia" w:hAnsiTheme="majorHAnsi" w:cstheme="majorBidi"/>
-      <w:color w:val="17365D" w:themeColor="text2" w:themeShade="BF"/>
+      <w:rFonts w:asciiTheme="majorHAnsi" w:eastAsiaTheme="majorEastAsia" w:hAnsiTheme="majorHAnsi" w:cstheme="majorBidi" w:ascii="Source Serif 4" w:hAnsi="Source Serif 4" w:cs="Source Serif 4"/>
+      <w:b/>
+      <w:color w:val="141413"/>
       <w:spacing w:val="5"/>
       <w:kern w:val="28"/>
-      <w:sz w:val="52"/>
+      <w:sz w:val="56"/>
       <w:szCs w:val="52"/>
     </w:rPr>
   </w:style>
@@ -1559,14 +3758,15 @@
       <w:numPr>
         <w:ilvl w:val="1"/>
       </w:numPr>
+      <w:spacing w:after="360" w:before="40" w:line="288" w:lineRule="auto"/>
     </w:pPr>
     <w:rPr>
-      <w:rFonts w:asciiTheme="majorHAnsi" w:eastAsiaTheme="majorEastAsia" w:hAnsiTheme="majorHAnsi" w:cstheme="majorBidi"/>
-      <w:i/>
+      <w:rFonts w:asciiTheme="majorHAnsi" w:eastAsiaTheme="majorEastAsia" w:hAnsiTheme="majorHAnsi" w:cstheme="majorBidi" w:ascii="Fira Sans" w:hAnsi="Fira Sans" w:cs="Fira Sans"/>
+      <w:i w:val="0"/>
       <w:iCs/>
-      <w:color w:val="4F81BD" w:themeColor="accent1"/>
+      <w:color w:val="6B675E"/>
       <w:spacing w:val="15"/>
-      <w:sz w:val="24"/>
+      <w:sz w:val="25"/>
       <w:szCs w:val="24"/>
     </w:rPr>
   </w:style>
@@ -1702,11 +3902,13 @@
       <w:numPr>
         <w:numId w:val="1"/>
       </w:numPr>
+      <w:spacing w:after="80" w:line="300" w:lineRule="auto"/>
       <w:contextualSpacing/>
     </w:pPr>
     <w:rPr>
-      <w:rFonts w:ascii="Helvetica Neue" w:hAnsi="Helvetica Neue"/>
-      <w:sz w:val="24"/>
+      <w:rFonts w:ascii="Fira Sans" w:hAnsi="Fira Sans" w:cs="Fira Sans"/>
+      <w:color w:val="201E1A"/>
+      <w:sz w:val="21"/>
     </w:rPr>
   </w:style>
   <w:style w:type="paragraph" w:styleId="ListBullet2">
@@ -1745,11 +3947,13 @@
       <w:numPr>
         <w:numId w:val="5"/>
       </w:numPr>
+      <w:spacing w:after="80" w:line="300" w:lineRule="auto"/>
       <w:contextualSpacing/>
     </w:pPr>
     <w:rPr>
-      <w:rFonts w:ascii="Helvetica Neue" w:hAnsi="Helvetica Neue"/>
-      <w:sz w:val="24"/>
+      <w:rFonts w:ascii="Fira Sans" w:hAnsi="Fira Sans" w:cs="Fira Sans"/>
+      <w:color w:val="201E1A"/>
+      <w:sz w:val="21"/>
     </w:rPr>
   </w:style>
   <w:style w:type="paragraph" w:styleId="ListNumber2">
@@ -1857,10 +4061,20 @@
     <w:uiPriority w:val="29"/>
     <w:qFormat/>
     <w:rsid w:val="00FC693F"/>
+    <w:pPr>
+      <w:spacing w:after="400" w:before="240" w:line="317" w:lineRule="auto"/>
+      <w:pBdr>
+        <w:left w:val="single" w:sz="24" w:space="14" w:color="CC785C"/>
+      </w:pBdr>
+      <w:shd w:val="clear" w:color="auto" w:fill="F7F5EE"/>
+      <w:ind w:left="283" w:right="170"/>
+    </w:pPr>
     <w:rPr>
-      <w:i/>
+      <w:rFonts w:ascii="Fira Sans" w:hAnsi="Fira Sans" w:cs="Fira Sans"/>
+      <w:i w:val="0"/>
       <w:iCs/>
-      <w:color w:val="000000" w:themeColor="text1"/>
+      <w:color w:val="201E1A"/>
+      <w:sz w:val="21"/>
     </w:rPr>
   </w:style>
   <w:style w:type="character" w:customStyle="1" w:styleId="QuoteChar">
@@ -1971,12 +4185,14 @@
     <w:qFormat/>
     <w:rsid w:val="00FC693F"/>
     <w:pPr>
-      <w:spacing w:line="240" w:lineRule="auto"/>
+      <w:spacing w:line="288" w:lineRule="auto" w:after="200" w:before="40"/>
     </w:pPr>
     <w:rPr>
+      <w:rFonts w:ascii="Fira Sans" w:hAnsi="Fira Sans" w:cs="Fira Sans"/>
       <w:b/>
       <w:bCs/>
-      <w:color w:val="4F81BD" w:themeColor="accent1"/>
+      <w:i w:val="0"/>
+      <w:color w:val="8C887E"/>
       <w:sz w:val="18"/>
       <w:szCs w:val="18"/>
     </w:rPr>
@@ -2116,8 +4332,16 @@
     <w:qFormat/>
     <w:rsid w:val="00FC693F"/>
     <w:pPr>
+      <w:spacing w:after="120" w:line="264" w:lineRule="auto"/>
+      <w:ind w:left="0"/>
       <w:outlineLvl w:val="9"/>
     </w:pPr>
+    <w:rPr>
+      <w:rFonts w:ascii="Source Serif 4" w:hAnsi="Source Serif 4" w:cs="Source Serif 4"/>
+      <w:b/>
+      <w:color w:val="141413"/>
+      <w:sz w:val="34"/>
+    </w:rPr>
   </w:style>
   <w:style w:type="table" w:styleId="TableGrid">
     <w:name w:val="Table Grid"/>
@@ -12865,6 +15089,83 @@
         <w:shd w:val="clear" w:color="auto" w:fill="FBCAA2" w:themeFill="accent6" w:themeFillTint="7F"/>
       </w:tcPr>
     </w:tblStylePr>
+  </w:style>
+  <w:style w:type="paragraph" w:customStyle="1" w:styleId="Lead">
+    <w:name w:val="Lead"/>
+    <w:basedOn w:val="Normal"/>
+    <w:pPr>
+      <w:spacing w:after="240" w:line="336" w:lineRule="auto"/>
+    </w:pPr>
+    <w:rPr>
+      <w:rFonts w:ascii="Source Serif 4" w:hAnsi="Source Serif 4" w:cs="Source Serif 4"/>
+      <w:color w:val="6B675E"/>
+      <w:sz w:val="26"/>
+    </w:rPr>
+  </w:style>
+  <w:style w:type="paragraph" w:customStyle="1" w:styleId="TOC1">
+    <w:name w:val="TOC 1"/>
+    <w:basedOn w:val="Normal"/>
+    <w:pPr>
+      <w:spacing w:after="80" w:line="264" w:lineRule="auto"/>
+      <w:ind w:left="0"/>
+    </w:pPr>
+    <w:rPr>
+      <w:rFonts w:ascii="Fira Sans Medium" w:hAnsi="Fira Sans Medium" w:cs="Fira Sans Medium"/>
+      <w:color w:val="141413"/>
+      <w:sz w:val="22"/>
+    </w:rPr>
+  </w:style>
+  <w:style w:type="paragraph" w:customStyle="1" w:styleId="TOC2">
+    <w:name w:val="TOC 2"/>
+    <w:basedOn w:val="Normal"/>
+    <w:pPr>
+      <w:spacing w:after="40" w:line="264" w:lineRule="auto"/>
+      <w:ind w:left="283"/>
+    </w:pPr>
+    <w:rPr>
+      <w:rFonts w:ascii="Fira Sans" w:hAnsi="Fira Sans" w:cs="Fira Sans"/>
+      <w:color w:val="201E1A"/>
+      <w:sz w:val="21"/>
+    </w:rPr>
+  </w:style>
+  <w:style w:type="paragraph" w:customStyle="1" w:styleId="TOC3">
+    <w:name w:val="TOC 3"/>
+    <w:basedOn w:val="Normal"/>
+    <w:pPr>
+      <w:spacing w:after="40" w:line="264" w:lineRule="auto"/>
+      <w:ind w:left="567"/>
+    </w:pPr>
+    <w:rPr>
+      <w:rFonts w:ascii="Fira Sans" w:hAnsi="Fira Sans" w:cs="Fira Sans"/>
+      <w:color w:val="6B675E"/>
+      <w:sz w:val="20"/>
+    </w:rPr>
+  </w:style>
+  <w:style w:type="paragraph" w:customStyle="1" w:styleId="TableofFigures">
+    <w:name w:val="Table of Figures"/>
+    <w:basedOn w:val="Normal"/>
+    <w:pPr>
+      <w:spacing w:after="40" w:line="264" w:lineRule="auto"/>
+      <w:ind w:left="0"/>
+    </w:pPr>
+    <w:rPr>
+      <w:rFonts w:ascii="Fira Sans" w:hAnsi="Fira Sans" w:cs="Fira Sans"/>
+      <w:color w:val="201E1A"/>
+      <w:sz w:val="21"/>
+    </w:rPr>
+  </w:style>
+  <w:style w:type="paragraph" w:customStyle="1" w:styleId="Quelle">
+    <w:name w:val="Quelle"/>
+    <w:basedOn w:val="Normal"/>
+    <w:pPr>
+      <w:spacing w:after="40" w:before="0" w:line="240" w:lineRule="auto"/>
+      <w:ind w:left="397" w:hanging="397"/>
+    </w:pPr>
+    <w:rPr>
+      <w:rFonts w:ascii="Fira Sans" w:hAnsi="Fira Sans" w:cs="Fira Sans"/>
+      <w:color w:val="201E1A"/>
+      <w:sz w:val="18"/>
+    </w:rPr>
   </w:style>
 </w:styles>
 </file>

</xml_diff>

<commit_message>
Version 1.7.1: Abstand der Gleichungsnummer zum rechten Rand, Reiter im Safari-Stil
- Gleichungsnummer: Abstand zum rechten Rand in mm einstellbar (Standard,
  auf diesem Mac gemerkt); die Nummer steht rechtsbündig am rechten Einzug
  des Formelabsatzes
- „Alle Nummern im Dokument so ausrichten“ ersetzt den Leerraum vor jeder
  Nummer durch einen Tabulator am rechten Einzug und setzt den Einzug
- Reiter (Formel bearbeiten/Alles bearbeiten und Bausteine) als graue
  Leiste mit weiß abgehobenem gewähltem Reiter, wie in Safari
- Anleitung und Bilder aktualisiert

Co-Authored-By: Claude Opus 5.5 (1M context) <noreply@anthropic.com>
Claude-Session: https://claude.ai/code/session_01M6NpvuAmCAyPcPJQsQimJc
</commit_message>
<xml_diff>
--- a/docs/Bedienungsanleitung.docx
+++ b/docs/Bedienungsanleitung.docx
@@ -16,7 +16,7 @@
         <w:pStyle w:val="Subtitle"/>
       </w:pPr>
       <w:r>
-        <w:t>Bedienungsanleitung für Word auf dem Mac, Version 1.7.0</w:t>
+        <w:t>Bedienungsanleitung für Word auf dem Mac, Version 1.7.1</w:t>
       </w:r>
     </w:p>
     <w:p>
@@ -467,7 +467,7 @@
       <w:r>
         <w:drawing>
           <wp:inline xmlns:a="http://schemas.openxmlformats.org/drawingml/2006/main" xmlns:pic="http://schemas.openxmlformats.org/drawingml/2006/picture">
-            <wp:extent cx="3090672" cy="4242816"/>
+            <wp:extent cx="5760720" cy="9493257"/>
             <wp:docPr id="2" name="Picture 2"/>
             <wp:cNvGraphicFramePr>
               <a:graphicFrameLocks noChangeAspect="1"/>
@@ -488,7 +488,7 @@
                   <pic:spPr>
                     <a:xfrm>
                       <a:off x="0" y="0"/>
-                      <a:ext cx="3090672" cy="4242816"/>
+                      <a:ext cx="5760720" cy="9493257"/>
                     </a:xfrm>
                     <a:prstGeom prst="rect"/>
                   </pic:spPr>
@@ -557,7 +557,7 @@
       <w:r>
         <w:drawing>
           <wp:inline xmlns:a="http://schemas.openxmlformats.org/drawingml/2006/main" xmlns:pic="http://schemas.openxmlformats.org/drawingml/2006/picture">
-            <wp:extent cx="3090672" cy="4919472"/>
+            <wp:extent cx="5760720" cy="12799706"/>
             <wp:docPr id="3" name="Picture 3"/>
             <wp:cNvGraphicFramePr>
               <a:graphicFrameLocks noChangeAspect="1"/>
@@ -578,7 +578,7 @@
                   <pic:spPr>
                     <a:xfrm>
                       <a:off x="0" y="0"/>
-                      <a:ext cx="3090672" cy="4919472"/>
+                      <a:ext cx="5760720" cy="12799706"/>
                     </a:xfrm>
                     <a:prstGeom prst="rect"/>
                   </pic:spPr>
@@ -647,7 +647,7 @@
       <w:r>
         <w:drawing>
           <wp:inline xmlns:a="http://schemas.openxmlformats.org/drawingml/2006/main" xmlns:pic="http://schemas.openxmlformats.org/drawingml/2006/picture">
-            <wp:extent cx="5760720" cy="10601088"/>
+            <wp:extent cx="5760720" cy="10515870"/>
             <wp:docPr id="4" name="Picture 4"/>
             <wp:cNvGraphicFramePr>
               <a:graphicFrameLocks noChangeAspect="1"/>
@@ -668,7 +668,7 @@
                   <pic:spPr>
                     <a:xfrm>
                       <a:off x="0" y="0"/>
-                      <a:ext cx="5760720" cy="10601088"/>
+                      <a:ext cx="5760720" cy="10515870"/>
                     </a:xfrm>
                     <a:prstGeom prst="rect"/>
                   </pic:spPr>
@@ -736,7 +736,7 @@
       <w:r>
         <w:drawing>
           <wp:inline xmlns:a="http://schemas.openxmlformats.org/drawingml/2006/main" xmlns:pic="http://schemas.openxmlformats.org/drawingml/2006/picture">
-            <wp:extent cx="5760720" cy="4704019"/>
+            <wp:extent cx="5760720" cy="4618802"/>
             <wp:docPr id="5" name="Picture 5"/>
             <wp:cNvGraphicFramePr>
               <a:graphicFrameLocks noChangeAspect="1"/>
@@ -757,7 +757,7 @@
                   <pic:spPr>
                     <a:xfrm>
                       <a:off x="0" y="0"/>
-                      <a:ext cx="5760720" cy="4704019"/>
+                      <a:ext cx="5760720" cy="4618802"/>
                     </a:xfrm>
                     <a:prstGeom prst="rect"/>
                   </pic:spPr>
@@ -858,7 +858,7 @@
       <w:r>
         <w:drawing>
           <wp:inline xmlns:a="http://schemas.openxmlformats.org/drawingml/2006/main" xmlns:pic="http://schemas.openxmlformats.org/drawingml/2006/picture">
-            <wp:extent cx="5760720" cy="7158291"/>
+            <wp:extent cx="5760720" cy="7073073"/>
             <wp:docPr id="6" name="Picture 6"/>
             <wp:cNvGraphicFramePr>
               <a:graphicFrameLocks noChangeAspect="1"/>
@@ -879,7 +879,7 @@
                   <pic:spPr>
                     <a:xfrm>
                       <a:off x="0" y="0"/>
-                      <a:ext cx="5760720" cy="7158291"/>
+                      <a:ext cx="5760720" cy="7073073"/>
                     </a:xfrm>
                     <a:prstGeom prst="rect"/>
                   </pic:spPr>
@@ -1991,7 +1991,7 @@
       <w:r>
         <w:drawing>
           <wp:inline xmlns:a="http://schemas.openxmlformats.org/drawingml/2006/main" xmlns:pic="http://schemas.openxmlformats.org/drawingml/2006/picture">
-            <wp:extent cx="5760720" cy="10430652"/>
+            <wp:extent cx="5760720" cy="11538483"/>
             <wp:docPr id="11" name="Picture 11"/>
             <wp:cNvGraphicFramePr>
               <a:graphicFrameLocks noChangeAspect="1"/>
@@ -2012,7 +2012,7 @@
                   <pic:spPr>
                     <a:xfrm>
                       <a:off x="0" y="0"/>
-                      <a:ext cx="5760720" cy="10430652"/>
+                      <a:ext cx="5760720" cy="11538483"/>
                     </a:xfrm>
                     <a:prstGeom prst="rect"/>
                   </pic:spPr>
@@ -2054,10 +2054,34 @@
         <w:fldChar w:fldCharType="end"/>
       </w:r>
       <w:r>
-        <w:t>: Mehrzeilige Formel mit Gleichungsnummer</w:t>
+        <w:t>: Mehrzeilige Formel mit Gleichungsnummer, 5 mm vom rechten Rand</w:t>
       </w:r>
     </w:p>
     <w:p/>
+    <w:p>
+      <w:pPr/>
+      <w:r>
+        <w:t xml:space="preserve">Unter </w:t>
+      </w:r>
+      <w:r>
+        <w:rPr>
+          <w:b/>
+        </w:rPr>
+        <w:t>Abstand zum rechten Rand</w:t>
+      </w:r>
+      <w:r>
+        <w:t xml:space="preserve"> steht, wie viele Millimeter die Nummer vom rechten Rand nach links eingerückt wird. Bei 0 steht sie genau am Rand. Der Wert gilt für jede neue Nummer. </w:t>
+      </w:r>
+      <w:r>
+        <w:rPr>
+          <w:b/>
+        </w:rPr>
+        <w:t>Alle Nummern im Dokument so ausrichten</w:t>
+      </w:r>
+      <w:r>
+        <w:t xml:space="preserve"> setzt auch alle vorhandenen Nummern rechtsbündig mit diesem Abstand, sodass sie untereinanderstehen.</w:t>
+      </w:r>
+    </w:p>
     <w:p>
       <w:pPr>
         <w:pStyle w:val="Quote"/>
@@ -2509,7 +2533,7 @@
       <w:r>
         <w:drawing>
           <wp:inline xmlns:a="http://schemas.openxmlformats.org/drawingml/2006/main" xmlns:pic="http://schemas.openxmlformats.org/drawingml/2006/picture">
-            <wp:extent cx="3383280" cy="6949440"/>
+            <wp:extent cx="5760720" cy="11832830"/>
             <wp:docPr id="15" name="Picture 15"/>
             <wp:cNvGraphicFramePr>
               <a:graphicFrameLocks noChangeAspect="1"/>
@@ -2530,7 +2554,7 @@
                   <pic:spPr>
                     <a:xfrm>
                       <a:off x="0" y="0"/>
-                      <a:ext cx="3383280" cy="6949440"/>
+                      <a:ext cx="5760720" cy="11832830"/>
                     </a:xfrm>
                     <a:prstGeom prst="rect"/>
                   </pic:spPr>

</xml_diff>

<commit_message>
Version 1.7.2: Lineal in der Vorschau für Formel-Einzug und Gleichungsnummer
- Lineal über der Vorschau mit cm-Skala und Seitenrändern aus dem
  Word-Dokument (pgSz/pgMar des Abschnitts an der Cursorstelle)
- Blauer Reiter: Einzug der Formel von links; oranger Reiter: rechtes
  Ende der Gleichungsnummer; ziehen, Pfeiltasten oder Zahl eintippen
- Neue abgesetzte Formeln bekommen Einzug links/rechts aus dem Lineal;
  „Alle Formeln und Nummern im Dokument wie im Lineal ausrichten“ setzt
  vorhandene nummerierte Formeln ebenso und entfernt Leerraum davor
- Ersetzt das mm-Feld aus 1.7.1; Anleitung und Bild aktualisiert

Co-Authored-By: Claude Opus 5.5 (1M context) <noreply@anthropic.com>
Claude-Session: https://claude.ai/code/session_01M6NpvuAmCAyPcPJQsQimJc
</commit_message>
<xml_diff>
--- a/docs/Bedienungsanleitung.docx
+++ b/docs/Bedienungsanleitung.docx
@@ -16,7 +16,7 @@
         <w:pStyle w:val="Subtitle"/>
       </w:pPr>
       <w:r>
-        <w:t>Bedienungsanleitung für Word auf dem Mac, Version 1.7.1</w:t>
+        <w:t>Bedienungsanleitung für Word auf dem Mac, Version 1.7.2</w:t>
       </w:r>
     </w:p>
     <w:p>
@@ -1983,6 +1983,60 @@
         <w:t xml:space="preserve"> angekreuzt, macht der Editor aus der alten (4.13) eine (4.14), aus (4.14) eine (4.15) und so weiter, auch an allen Stellen im Text, die darauf verweisen.</w:t>
       </w:r>
     </w:p>
+    <w:p>
+      <w:pPr>
+        <w:pStyle w:val="Heading2"/>
+      </w:pPr>
+      <w:r>
+        <w:t>Das Lineal</w:t>
+      </w:r>
+    </w:p>
+    <w:p>
+      <w:pPr/>
+      <w:r>
+        <w:t>Oben in der Vorschau steht ein Lineal wie in Word. Es zeigt die Seite in cm, die grauen Streifen links und rechts sind die Seitenränder des Dokuments. Zwei kleine Dreiecke darunter lassen sich mit der Maus verschieben:</w:t>
+      </w:r>
+    </w:p>
+    <w:p>
+      <w:pPr>
+        <w:pStyle w:val="ListBullet"/>
+      </w:pPr>
+      <w:r>
+        <w:t xml:space="preserve">Das </w:t>
+      </w:r>
+      <w:r>
+        <w:rPr>
+          <w:b/>
+        </w:rPr>
+        <w:t>blaue Dreieck</w:t>
+      </w:r>
+      <w:r>
+        <w:t xml:space="preserve"> legt fest, wo die Formel beginnt, gemessen vom linken Rand.</w:t>
+      </w:r>
+    </w:p>
+    <w:p>
+      <w:pPr>
+        <w:pStyle w:val="ListBullet"/>
+      </w:pPr>
+      <w:r>
+        <w:t xml:space="preserve">Das </w:t>
+      </w:r>
+      <w:r>
+        <w:rPr>
+          <w:b/>
+        </w:rPr>
+        <w:t>orange Dreieck</w:t>
+      </w:r>
+      <w:r>
+        <w:t xml:space="preserve"> legt fest, wo die Gleichungsnummer endet. Die Nummer steht rechtsbündig davor.</w:t>
+      </w:r>
+    </w:p>
+    <w:p>
+      <w:pPr/>
+      <w:r>
+        <w:t>Darunter stehen beide Werte in cm. Man kann sie dort auch eintippen. Die Werte gelten für jede neue abgesetzte Formel.</w:t>
+      </w:r>
+    </w:p>
     <w:p/>
     <w:p>
       <w:pPr>
@@ -1991,7 +2045,7 @@
       <w:r>
         <w:drawing>
           <wp:inline xmlns:a="http://schemas.openxmlformats.org/drawingml/2006/main" xmlns:pic="http://schemas.openxmlformats.org/drawingml/2006/picture">
-            <wp:extent cx="5760720" cy="11538483"/>
+            <wp:extent cx="5760720" cy="13532578"/>
             <wp:docPr id="11" name="Picture 11"/>
             <wp:cNvGraphicFramePr>
               <a:graphicFrameLocks noChangeAspect="1"/>
@@ -2012,7 +2066,7 @@
                   <pic:spPr>
                     <a:xfrm>
                       <a:off x="0" y="0"/>
-                      <a:ext cx="5760720" cy="11538483"/>
+                      <a:ext cx="5760720" cy="13532578"/>
                     </a:xfrm>
                     <a:prstGeom prst="rect"/>
                   </pic:spPr>
@@ -2054,32 +2108,20 @@
         <w:fldChar w:fldCharType="end"/>
       </w:r>
       <w:r>
-        <w:t>: Mehrzeilige Formel mit Gleichungsnummer, 5 mm vom rechten Rand</w:t>
+        <w:t>: Lineal mit Formel ab 2 cm und Nummer bis 15 cm</w:t>
       </w:r>
     </w:p>
     <w:p/>
     <w:p>
       <w:pPr/>
       <w:r>
-        <w:t xml:space="preserve">Unter </w:t>
-      </w:r>
-      <w:r>
         <w:rPr>
           <w:b/>
         </w:rPr>
-        <w:t>Abstand zum rechten Rand</w:t>
-      </w:r>
-      <w:r>
-        <w:t xml:space="preserve"> steht, wie viele Millimeter die Nummer vom rechten Rand nach links eingerückt wird. Bei 0 steht sie genau am Rand. Der Wert gilt für jede neue Nummer. </w:t>
-      </w:r>
-      <w:r>
-        <w:rPr>
-          <w:b/>
-        </w:rPr>
-        <w:t>Alle Nummern im Dokument so ausrichten</w:t>
-      </w:r>
-      <w:r>
-        <w:t xml:space="preserve"> setzt auch alle vorhandenen Nummern rechtsbündig mit diesem Abstand, sodass sie untereinanderstehen.</w:t>
+        <w:t>Alle Formeln und Nummern im Dokument wie im Lineal ausrichten</w:t>
+      </w:r>
+      <w:r>
+        <w:t xml:space="preserve"> setzt auch alle vorhandenen nummerierten Formeln so, dass Formeln und Nummern genau untereinanderstehen. Am besten vorher eine Kopie des Dokuments speichern.</w:t>
       </w:r>
     </w:p>
     <w:p>

</xml_diff>

<commit_message>
Version 1.7.3: Lineal auch beim Ändern einer vorhandenen Formel
Das Lineal verschwand, sobald eine Formel aus dem Dokument geladen war.
Es steht jetzt bei jeder wissenschaftlichen Formel über der Vorschau.
Eine geladene Formel bleibt beim Ersetzen an ihrer Stelle; erst wenn
ein Reiter verschoben wird, bekommt ihr Absatz die Einzüge aus dem
Lineal (wie beim Ausrichten aller Formeln).

Co-Authored-By: Claude Opus 5.5 (1M context) <noreply@anthropic.com>
Claude-Session: https://claude.ai/code/session_01M6NpvuAmCAyPcPJQsQimJc
</commit_message>
<xml_diff>
--- a/docs/Bedienungsanleitung.docx
+++ b/docs/Bedienungsanleitung.docx
@@ -16,7 +16,7 @@
         <w:pStyle w:val="Subtitle"/>
       </w:pPr>
       <w:r>
-        <w:t>Bedienungsanleitung für Word auf dem Mac, Version 1.7.2</w:t>
+        <w:t>Bedienungsanleitung für Word auf dem Mac, Version 1.7.3</w:t>
       </w:r>
     </w:p>
     <w:p>
@@ -2037,6 +2037,21 @@
         <w:t>Darunter stehen beide Werte in cm. Man kann sie dort auch eintippen. Die Werte gelten für jede neue abgesetzte Formel.</w:t>
       </w:r>
     </w:p>
+    <w:p>
+      <w:pPr/>
+      <w:r>
+        <w:t xml:space="preserve">Das Lineal erscheint bei der Darstellung </w:t>
+      </w:r>
+      <w:r>
+        <w:rPr>
+          <w:b/>
+        </w:rPr>
+        <w:t>Wissenschaftlich</w:t>
+      </w:r>
+      <w:r>
+        <w:t>, auch wenn eine vorhandene Formel zum Ändern geladen ist. Diese bleibt beim Ersetzen an ihrer Stelle. Erst wenn man ein Dreieck verschiebt, rückt sie beim Ersetzen dorthin.</w:t>
+      </w:r>
+    </w:p>
     <w:p/>
     <w:p>
       <w:pPr>

</xml_diff>

<commit_message>
Gleichungsnummer immer sichtbar, Lineal-Werte gleich beim Einfügen, Ausrichten als Knopf (1.7.4)
- „Gleichungsnummer erzeugen“ steht immer da; ausgegraut mit Hinweis bei Kompakt/Einzeilig und beim Ersetzen
- Unter dem Lineal: Häkchen „Werte für Formel übernehmen“ (Standard an); neue abgesetzte Formeln bekommen die
  Einzüge vor, im OOXML und nach dem Einfügen; geladene Formeln beim Ersetzen
- Knopf „Formeln und Nummern im Dokument wie im Lineal ausrichten“ mit Fortschrittsbalken und
  „Ausrichtung abgeschlossen“; richtet jetzt auch abgesetzte Formeln ohne Nummer aus
- Anleitung, Bilder und Version 1.7.4

Co-Authored-By: Claude Opus 5.5 (1M context) <noreply@anthropic.com>
Claude-Session: https://claude.ai/code/session_01M6NpvuAmCAyPcPJQsQimJc
</commit_message>
<xml_diff>
--- a/docs/Bedienungsanleitung.docx
+++ b/docs/Bedienungsanleitung.docx
@@ -16,7 +16,7 @@
         <w:pStyle w:val="Subtitle"/>
       </w:pPr>
       <w:r>
-        <w:t>Bedienungsanleitung für Word auf dem Mac, Version 1.7.3</w:t>
+        <w:t>Bedienungsanleitung für Word auf dem Mac, Version 1.7.4</w:t>
       </w:r>
     </w:p>
     <w:p>
@@ -1754,7 +1754,7 @@
       <w:r>
         <w:drawing>
           <wp:inline xmlns:a="http://schemas.openxmlformats.org/drawingml/2006/main" xmlns:pic="http://schemas.openxmlformats.org/drawingml/2006/picture">
-            <wp:extent cx="5760720" cy="8368383"/>
+            <wp:extent cx="5760720" cy="9868214"/>
             <wp:docPr id="9" name="Picture 9"/>
             <wp:cNvGraphicFramePr>
               <a:graphicFrameLocks noChangeAspect="1"/>
@@ -1775,7 +1775,7 @@
                   <pic:spPr>
                     <a:xfrm>
                       <a:off x="0" y="0"/>
-                      <a:ext cx="5760720" cy="8368383"/>
+                      <a:ext cx="5760720" cy="9868214"/>
                     </a:xfrm>
                     <a:prstGeom prst="rect"/>
                   </pic:spPr>
@@ -1938,7 +1938,16 @@
     <w:p>
       <w:pPr/>
       <w:r>
-        <w:t xml:space="preserve">Bei </w:t>
+        <w:t xml:space="preserve">Unter den Darstellungen steht immer das Kästchen </w:t>
+      </w:r>
+      <w:r>
+        <w:rPr>
+          <w:b/>
+        </w:rPr>
+        <w:t>Gleichungsnummer erzeugen</w:t>
+      </w:r>
+      <w:r>
+        <w:t xml:space="preserve">. Es wirkt nur bei </w:t>
       </w:r>
       <w:r>
         <w:rPr>
@@ -1947,16 +1956,7 @@
         <w:t>Wissenschaftlich</w:t>
       </w:r>
       <w:r>
-        <w:t xml:space="preserve"> steht unter den Darstellungen das Kästchen </w:t>
-      </w:r>
-      <w:r>
-        <w:rPr>
-          <w:b/>
-        </w:rPr>
-        <w:t>Gleichungsnummer</w:t>
-      </w:r>
-      <w:r>
-        <w:t xml:space="preserve">. Ist es angekreuzt, schlägt der Editor die nächste Nummer vor, zum Beispiel (4.13), und schaut dafür auf die Nummern davor und danach im Dokument. Die Nummer lässt sich im Feld ändern. </w:t>
+        <w:t xml:space="preserve"> und nur bei neuen Formeln; sonst ist es grau, und eine kurze Zeile darunter sagt, warum. Ist es angekreuzt, schlägt der Editor die nächste Nummer vor, zum Beispiel (4.13), und schaut dafür auf die Nummern davor und danach im Dokument. Die Nummer lässt sich im Feld ändern. </w:t>
       </w:r>
       <w:r>
         <w:rPr>
@@ -2034,7 +2034,22 @@
     <w:p>
       <w:pPr/>
       <w:r>
-        <w:t>Darunter stehen beide Werte in cm. Man kann sie dort auch eintippen. Die Werte gelten für jede neue abgesetzte Formel.</w:t>
+        <w:t>Darunter stehen beide Werte in cm. Man kann sie dort auch eintippen.</w:t>
+      </w:r>
+    </w:p>
+    <w:p>
+      <w:pPr/>
+      <w:r>
+        <w:t xml:space="preserve">Ist </w:t>
+      </w:r>
+      <w:r>
+        <w:rPr>
+          <w:b/>
+        </w:rPr>
+        <w:t>Werte für Formel übernehmen</w:t>
+      </w:r>
+      <w:r>
+        <w:t xml:space="preserve"> angekreuzt, kommt jede neue abgesetzte Formel gleich beim Einfügen an diese Stelle, ohne weiteren Knopf. Auch eine geladene Formel rückt beim Ersetzen dorthin. Ohne Häkchen bleibt alles, wie es ist. Eine Formel mitten im Fließtext wird nie eingerückt.</w:t>
       </w:r>
     </w:p>
     <w:p>
@@ -2049,7 +2064,7 @@
         <w:t>Wissenschaftlich</w:t>
       </w:r>
       <w:r>
-        <w:t>, auch wenn eine vorhandene Formel zum Ändern geladen ist. Diese bleibt beim Ersetzen an ihrer Stelle. Erst wenn man ein Dreieck verschiebt, rückt sie beim Ersetzen dorthin.</w:t>
+        <w:t>, auch wenn eine vorhandene Formel zum Ändern geladen ist.</w:t>
       </w:r>
     </w:p>
     <w:p/>
@@ -2060,7 +2075,7 @@
       <w:r>
         <w:drawing>
           <wp:inline xmlns:a="http://schemas.openxmlformats.org/drawingml/2006/main" xmlns:pic="http://schemas.openxmlformats.org/drawingml/2006/picture">
-            <wp:extent cx="5760720" cy="13532578"/>
+            <wp:extent cx="5760720" cy="14401800"/>
             <wp:docPr id="11" name="Picture 11"/>
             <wp:cNvGraphicFramePr>
               <a:graphicFrameLocks noChangeAspect="1"/>
@@ -2081,7 +2096,7 @@
                   <pic:spPr>
                     <a:xfrm>
                       <a:off x="0" y="0"/>
-                      <a:ext cx="5760720" cy="13532578"/>
+                      <a:ext cx="5760720" cy="14401800"/>
                     </a:xfrm>
                     <a:prstGeom prst="rect"/>
                   </pic:spPr>
@@ -2130,13 +2145,25 @@
     <w:p>
       <w:pPr/>
       <w:r>
+        <w:t xml:space="preserve">Der Knopf </w:t>
+      </w:r>
+      <w:r>
         <w:rPr>
           <w:b/>
         </w:rPr>
-        <w:t>Alle Formeln und Nummern im Dokument wie im Lineal ausrichten</w:t>
-      </w:r>
-      <w:r>
-        <w:t xml:space="preserve"> setzt auch alle vorhandenen nummerierten Formeln so, dass Formeln und Nummern genau untereinanderstehen. Am besten vorher eine Kopie des Dokuments speichern.</w:t>
+        <w:t>Formeln und Nummern im Dokument wie im Lineal ausrichten</w:t>
+      </w:r>
+      <w:r>
+        <w:t xml:space="preserve"> setzt alle vorhandenen abgesetzten Formeln so, mit und ohne Nummer, dass Formeln und Nummern genau untereinanderstehen. Ein Balken zeigt, wie weit er ist; am Ende steht </w:t>
+      </w:r>
+      <w:r>
+        <w:rPr>
+          <w:b/>
+        </w:rPr>
+        <w:t>Ausrichtung abgeschlossen</w:t>
+      </w:r>
+      <w:r>
+        <w:t>. Am besten vorher eine Kopie des Dokuments speichern.</w:t>
       </w:r>
     </w:p>
     <w:p>

</xml_diff>

<commit_message>
Gleichungsnummer per rechtem Tabstopp an die Stelle aus dem Lineal setzen (1.7.5)
- Word hielt sich nicht an den absoluten Tabulator relativ zum Einzug: Nummern standen am Rand,
  bei (4.6) mit Zeilenumbruch. Jetzt bekommt der Absatz einen echten rechten Tabstopp bei
  „Nummer endet bei“; Tabs, Umbrüche und absolute Tabs vor der Nummer werden durch genau einen
  Tabulator ersetzt (layoutXml über das OOXML des Absatzes)
- Geladene Formel: Kästchen und Vorschau zeigen ihre vorhandene Nummer
- Fortschrittsbalken orange, Ausrichten-Knopf blau, „Nummer bis“ heißt „Nummer endet bei“
- Anleitung, Bild und Version 1.7.5

Co-Authored-By: Claude Opus 5.5 (1M context) <noreply@anthropic.com>
Claude-Session: https://claude.ai/code/session_01M6NpvuAmCAyPcPJQsQimJc
</commit_message>
<xml_diff>
--- a/docs/Bedienungsanleitung.docx
+++ b/docs/Bedienungsanleitung.docx
@@ -16,7 +16,7 @@
         <w:pStyle w:val="Subtitle"/>
       </w:pPr>
       <w:r>
-        <w:t>Bedienungsanleitung für Word auf dem Mac, Version 1.7.4</w:t>
+        <w:t>Bedienungsanleitung für Word auf dem Mac, Version 1.7.5</w:t>
       </w:r>
     </w:p>
     <w:p>
@@ -1956,7 +1956,7 @@
         <w:t>Wissenschaftlich</w:t>
       </w:r>
       <w:r>
-        <w:t xml:space="preserve"> und nur bei neuen Formeln; sonst ist es grau, und eine kurze Zeile darunter sagt, warum. Ist es angekreuzt, schlägt der Editor die nächste Nummer vor, zum Beispiel (4.13), und schaut dafür auf die Nummern davor und danach im Dokument. Die Nummer lässt sich im Feld ändern. </w:t>
+        <w:t xml:space="preserve"> und nur bei neuen Formeln; sonst ist es grau, und eine kurze Zeile darunter sagt, warum. Ist eine vorhandene Formel geladen, zeigt das Kästchen, ob sie eine Nummer hat; die Nummer steht dann auch in der Vorschau und bleibt beim Ersetzen erhalten. Ist es angekreuzt, schlägt der Editor die nächste Nummer vor, zum Beispiel (4.13), und schaut dafür auf die Nummern davor und danach im Dokument. Die Nummer lässt sich im Feld ändern. </w:t>
       </w:r>
       <w:r>
         <w:rPr>
@@ -2028,7 +2028,16 @@
         <w:t>orange Dreieck</w:t>
       </w:r>
       <w:r>
-        <w:t xml:space="preserve"> legt fest, wo die Gleichungsnummer endet. Die Nummer steht rechtsbündig davor.</w:t>
+        <w:t xml:space="preserve"> legt fest, wo die Gleichungsnummer endet, gemessen ebenfalls vom linken Rand. Bei </w:t>
+      </w:r>
+      <w:r>
+        <w:rPr>
+          <w:b/>
+        </w:rPr>
+        <w:t>Nummer endet bei 13,5 cm</w:t>
+      </w:r>
+      <w:r>
+        <w:t xml:space="preserve"> steht die schließende Klammer der Nummer genau bei 13,5 cm auf dem Lineal.</w:t>
       </w:r>
     </w:p>
     <w:p>
@@ -2138,7 +2147,7 @@
         <w:fldChar w:fldCharType="end"/>
       </w:r>
       <w:r>
-        <w:t>: Lineal mit Formel ab 2 cm und Nummer bis 15 cm</w:t>
+        <w:t>: Lineal mit Formel ab 2 cm und Nummer endet bei 15 cm</w:t>
       </w:r>
     </w:p>
     <w:p/>
@@ -2154,7 +2163,7 @@
         <w:t>Formeln und Nummern im Dokument wie im Lineal ausrichten</w:t>
       </w:r>
       <w:r>
-        <w:t xml:space="preserve"> setzt alle vorhandenen abgesetzten Formeln so, mit und ohne Nummer, dass Formeln und Nummern genau untereinanderstehen. Ein Balken zeigt, wie weit er ist; am Ende steht </w:t>
+        <w:t xml:space="preserve"> setzt alle vorhandenen abgesetzten Formeln so, mit und ohne Nummer, dass Formeln und Nummern genau untereinanderstehen. Ein oranger Balken zeigt, wie weit er ist; am Ende steht </w:t>
       </w:r>
       <w:r>
         <w:rPr>

</xml_diff>

<commit_message>
Nicht gewählte Reiter fein umranden und klar trennen (1.7.6)
Inaktive Reiter (Bausteine und Formel/Alles bearbeiten) bekommen eine helle Fläche mit feiner
Umrandung (CSS-Variablen --tab-off, --tab-edge, hell und dunkel), Abstand 4 px. Bilder der
Anleitung neu, Version 1.7.6.

Co-Authored-By: Claude Opus 5.5 (1M context) <noreply@anthropic.com>
Claude-Session: https://claude.ai/code/session_01M6NpvuAmCAyPcPJQsQimJc
</commit_message>
<xml_diff>
--- a/docs/Bedienungsanleitung.docx
+++ b/docs/Bedienungsanleitung.docx
@@ -16,7 +16,7 @@
         <w:pStyle w:val="Subtitle"/>
       </w:pPr>
       <w:r>
-        <w:t>Bedienungsanleitung für Word auf dem Mac, Version 1.7.5</w:t>
+        <w:t>Bedienungsanleitung für Word auf dem Mac, Version 1.7.6</w:t>
       </w:r>
     </w:p>
     <w:p>
@@ -467,7 +467,7 @@
       <w:r>
         <w:drawing>
           <wp:inline xmlns:a="http://schemas.openxmlformats.org/drawingml/2006/main" xmlns:pic="http://schemas.openxmlformats.org/drawingml/2006/picture">
-            <wp:extent cx="5760720" cy="9493257"/>
+            <wp:extent cx="5760720" cy="9544388"/>
             <wp:docPr id="2" name="Picture 2"/>
             <wp:cNvGraphicFramePr>
               <a:graphicFrameLocks noChangeAspect="1"/>
@@ -488,7 +488,7 @@
                   <pic:spPr>
                     <a:xfrm>
                       <a:off x="0" y="0"/>
-                      <a:ext cx="5760720" cy="9493257"/>
+                      <a:ext cx="5760720" cy="9544388"/>
                     </a:xfrm>
                     <a:prstGeom prst="rect"/>
                   </pic:spPr>
@@ -557,7 +557,7 @@
       <w:r>
         <w:drawing>
           <wp:inline xmlns:a="http://schemas.openxmlformats.org/drawingml/2006/main" xmlns:pic="http://schemas.openxmlformats.org/drawingml/2006/picture">
-            <wp:extent cx="5760720" cy="12799706"/>
+            <wp:extent cx="5760720" cy="12850836"/>
             <wp:docPr id="3" name="Picture 3"/>
             <wp:cNvGraphicFramePr>
               <a:graphicFrameLocks noChangeAspect="1"/>
@@ -578,7 +578,7 @@
                   <pic:spPr>
                     <a:xfrm>
                       <a:off x="0" y="0"/>
-                      <a:ext cx="5760720" cy="12799706"/>
+                      <a:ext cx="5760720" cy="12850836"/>
                     </a:xfrm>
                     <a:prstGeom prst="rect"/>
                   </pic:spPr>
@@ -647,7 +647,7 @@
       <w:r>
         <w:drawing>
           <wp:inline xmlns:a="http://schemas.openxmlformats.org/drawingml/2006/main" xmlns:pic="http://schemas.openxmlformats.org/drawingml/2006/picture">
-            <wp:extent cx="5760720" cy="10515870"/>
+            <wp:extent cx="5760720" cy="10567001"/>
             <wp:docPr id="4" name="Picture 4"/>
             <wp:cNvGraphicFramePr>
               <a:graphicFrameLocks noChangeAspect="1"/>
@@ -668,7 +668,7 @@
                   <pic:spPr>
                     <a:xfrm>
                       <a:off x="0" y="0"/>
-                      <a:ext cx="5760720" cy="10515870"/>
+                      <a:ext cx="5760720" cy="10567001"/>
                     </a:xfrm>
                     <a:prstGeom prst="rect"/>
                   </pic:spPr>
@@ -736,7 +736,7 @@
       <w:r>
         <w:drawing>
           <wp:inline xmlns:a="http://schemas.openxmlformats.org/drawingml/2006/main" xmlns:pic="http://schemas.openxmlformats.org/drawingml/2006/picture">
-            <wp:extent cx="5760720" cy="4618802"/>
+            <wp:extent cx="5760720" cy="4669932"/>
             <wp:docPr id="5" name="Picture 5"/>
             <wp:cNvGraphicFramePr>
               <a:graphicFrameLocks noChangeAspect="1"/>
@@ -757,7 +757,7 @@
                   <pic:spPr>
                     <a:xfrm>
                       <a:off x="0" y="0"/>
-                      <a:ext cx="5760720" cy="4618802"/>
+                      <a:ext cx="5760720" cy="4669932"/>
                     </a:xfrm>
                     <a:prstGeom prst="rect"/>
                   </pic:spPr>
@@ -858,7 +858,7 @@
       <w:r>
         <w:drawing>
           <wp:inline xmlns:a="http://schemas.openxmlformats.org/drawingml/2006/main" xmlns:pic="http://schemas.openxmlformats.org/drawingml/2006/picture">
-            <wp:extent cx="5760720" cy="7073073"/>
+            <wp:extent cx="5760720" cy="7124204"/>
             <wp:docPr id="6" name="Picture 6"/>
             <wp:cNvGraphicFramePr>
               <a:graphicFrameLocks noChangeAspect="1"/>
@@ -879,7 +879,7 @@
                   <pic:spPr>
                     <a:xfrm>
                       <a:off x="0" y="0"/>
-                      <a:ext cx="5760720" cy="7073073"/>
+                      <a:ext cx="5760720" cy="7124204"/>
                     </a:xfrm>
                     <a:prstGeom prst="rect"/>
                   </pic:spPr>
@@ -3121,7 +3121,7 @@
       <w:r>
         <w:drawing>
           <wp:inline xmlns:a="http://schemas.openxmlformats.org/drawingml/2006/main" xmlns:pic="http://schemas.openxmlformats.org/drawingml/2006/picture">
-            <wp:extent cx="5760720" cy="1039656"/>
+            <wp:extent cx="5760720" cy="1022613"/>
             <wp:docPr id="20" name="Picture 20"/>
             <wp:cNvGraphicFramePr>
               <a:graphicFrameLocks noChangeAspect="1"/>
@@ -3142,7 +3142,7 @@
                   <pic:spPr>
                     <a:xfrm>
                       <a:off x="0" y="0"/>
-                      <a:ext cx="5760720" cy="1039656"/>
+                      <a:ext cx="5760720" cy="1022613"/>
                     </a:xfrm>
                     <a:prstGeom prst="rect"/>
                   </pic:spPr>

</xml_diff>

<commit_message>
Version 1.9.0: schmalere Formeln, Leertaste und Text mit Leerzeichen, Index vorn, heutiges MathType, Lineal nur für Formeln
- Engere Abstände um = und +, zwischen und neben Brüchen (näher am alten MathType)
- Leertaste setzt Abstand und verlässt Hochzahl/Index wie in Word; Kürzel wie lt, ee, ch abgeschaltet
- Baustein „Normaler Text“ schaltet in den Textmodus mit Leerzeichen, steht jetzt weit oben
- Neuer Baustein „Index vorn“ für ¹₁H, Abstände klein und groß unter Zeichen
- Vorschau ohne englischen Begleittext bei Kompakt und Einzeilig
- Formeln aus dem heutigen MathType (MathML im Alternativtext) bearbeiten und umwandeln
- Formel-Absätze bekommen die Vorlage „Formel (Editor)“ mit Standard als Folgeabsatz;
  Ausrichten lässt Textzeilen ohne Formel unberührt

Co-Authored-By: Claude Opus 5.5 (1M context) <noreply@anthropic.com>
Claude-Session: https://claude.ai/code/session_01Nyi93WDEP1KH9bvUZ26LkH
</commit_message>
<xml_diff>
--- a/docs/Bedienungsanleitung.docx
+++ b/docs/Bedienungsanleitung.docx
@@ -16,7 +16,7 @@
         <w:pStyle w:val="Subtitle"/>
       </w:pPr>
       <w:r>
-        <w:t>Bedienungsanleitung für Word auf dem Mac, Version 1.7.6</w:t>
+        <w:t>Bedienungsanleitung für Word auf dem Mac, Version 1.9.0</w:t>
       </w:r>
     </w:p>
     <w:p>
@@ -313,7 +313,7 @@
         <w:t>Tipp zur Breite.</w:t>
       </w:r>
       <w:r>
-        <w:t xml:space="preserve"> Die Spalte des Editors lässt sich mit der Maus an ihrem linken Rand breiter ziehen. Ist sie sehr schmal, rutschen die Knöpfe unter der Eingabe in eine zweite Reihe. Sie bleiben aber immer vollständig lesbar.</w:t>
+        <w:t xml:space="preserve"> Die Spalte des Editors lässt sich mit der Maus an ihrem linken Rand breiter ziehen. Ist sie sehr schmal, rutschen die Knöpfe unter der Eingabe in eine zweite Reihe. Sie bleiben aber immer vollständig lesbar. Word merkt sich die Breite im Dokument, sobald man es danach speichert.</w:t>
       </w:r>
     </w:p>
     <w:p>
@@ -346,6 +346,36 @@
       </w:r>
       <w:r>
         <w:t xml:space="preserve"> liegen Brüche, Wurzeln, Klammern, Hochzahlen, Summen und Integrale. Ein Klick setzt den Baustein an der Stelle des blinkenden Strichs ein. Leere Felder, etwa Zähler und Nenner, erscheinen als kleine Kästchen und werden der Reihe nach ausgefüllt.</w:t>
+      </w:r>
+    </w:p>
+    <w:p>
+      <w:pPr/>
+      <w:r>
+        <w:rPr>
+          <w:b/>
+        </w:rPr>
+        <w:t>Index vorn</w:t>
+      </w:r>
+      <w:r>
+        <w:t xml:space="preserve"> setzt Index und Hochzahl vor ein Zeichen, etwa bei ¹₁H. </w:t>
+      </w:r>
+      <w:r>
+        <w:rPr>
+          <w:b/>
+        </w:rPr>
+        <w:t>Normaler Text</w:t>
+      </w:r>
+      <w:r>
+        <w:t xml:space="preserve"> schreibt Wörter mit Leerzeichen, so wie im Fließtext. Ein zweiter Klick auf </w:t>
+      </w:r>
+      <w:r>
+        <w:rPr>
+          <w:b/>
+        </w:rPr>
+        <w:t>Normaler Text</w:t>
+      </w:r>
+      <w:r>
+        <w:t xml:space="preserve"> oder die Taste esc führt zurück zur Formel. Solange Text geschrieben wird, ist der Baustein blau umrandet.</w:t>
       </w:r>
     </w:p>
     <w:p>
@@ -1276,7 +1306,7 @@
               <w:spacing w:after="40" w:before="40" w:line="240" w:lineRule="auto"/>
             </w:pPr>
             <w:r>
-              <w:t>kleiner Abstand zwischen Ziffern, etwa 1.159 652 180 46</w:t>
+              <w:t>Abstand, zwischen Ziffern ein kleiner wie in 1.159 652 180 46; am Ende einer Hochzahl oder eines Index springt sie heraus, wie in Word</w:t>
             </w:r>
           </w:p>
         </w:tc>
@@ -1376,6 +1406,21 @@
       </w:r>
     </w:p>
     <w:p>
+      <w:pPr/>
+      <w:r>
+        <w:t xml:space="preserve">Neben = + − und nach sin, cos und ähnlichen steht schon von selbst der richtige Abstand. Dort bleibt die Leertaste ohne Wirkung, damit die Formel nicht breiter wird. So entsteht etwa Y = m₀c/(kᵥp) mit den Tasten Y = m </w:t>
+      </w:r>
+      <w:r>
+        <w:rPr>
+          <w:i/>
+        </w:rPr>
+        <w:t xml:space="preserve"> 0 Leertaste c / k </w:t>
+      </w:r>
+      <w:r>
+        <w:t xml:space="preserve"> v Leertaste p.</w:t>
+      </w:r>
+    </w:p>
+    <w:p>
       <w:pPr>
         <w:pStyle w:val="Heading2"/>
       </w:pPr>
@@ -2064,6 +2109,21 @@
     <w:p>
       <w:pPr/>
       <w:r>
+        <w:t xml:space="preserve">Der Absatz mit der Formel bekommt die Absatzvorlage </w:t>
+      </w:r>
+      <w:r>
+        <w:rPr>
+          <w:b/>
+        </w:rPr>
+        <w:t>Formel (Editor)</w:t>
+      </w:r>
+      <w:r>
+        <w:t>. Drückt man hinter der Formel die Return-Taste, geht es im nächsten Absatz mit normalem Text weiter, ohne Einzug und ohne den Tabstopp aus dem Lineal. Textzeilen ohne Formel rührt das Lineal nicht an, auch wenn sie mit einer Zahl in Klammern enden.</w:t>
+      </w:r>
+    </w:p>
+    <w:p>
+      <w:pPr/>
+      <w:r>
         <w:t xml:space="preserve">Das Lineal erscheint bei der Darstellung </w:t>
       </w:r>
       <w:r>
@@ -2252,6 +2312,12 @@
       </w:r>
       <w:r>
         <w:t>. Er wandelt eine alte Formel unverändert ins neue Format um.</w:t>
+      </w:r>
+    </w:p>
+    <w:p>
+      <w:pPr/>
+      <w:r>
+        <w:t>Das klappt mit Formeln aus diesem Editor, aus dem alten Formel-Editor, aus dem heutigen Formel-Editor von Word und aus dem heutigen MathType.</w:t>
       </w:r>
     </w:p>
     <w:p/>

</xml_diff>